<commit_message>
docs(pcc): add the folha de rosto the norm requires
NBR 15287:2025 makes three elements mandatory — folha de rosto (4.2.1.1),
sumário (4.2.1.6) and referências (4.2.3.1) — and makes the capa optional
(4.1.1). The template shows the opposite and says nothing about this page,
so doc 14 §1 keeps both: the template wins where it diverges, and here it
is silent rather than divergent.

The page carries what the cover has no slot for and a proposal is expected
to state — the type of work, the entity it is submitted to, and the
orientador. Those are placeholders, so collect_markers() reports them.

Pre-textual, so the budget is unchanged at 8.36 pages of 10.
</commit_message>
<xml_diff>
--- a/dist/projeto-pcc.docx
+++ b/dist/projeto-pcc.docx
@@ -104,6 +104,120 @@
     </w:p>
     <w:p/>
     <w:p/>
+    <w:p/>
+    <w:p/>
+    <w:p/>
+    <w:p/>
+    <w:p/>
+    <w:p/>
+    <w:p>
+      <w:pPr>
+        <w:spacing w:after="0" w:line="240" w:lineRule="auto"/>
+        <w:jc w:val="center"/>
+      </w:pPr>
+      <w:r>
+        <w:rPr>
+          <w:rFonts w:ascii="Times New Roman" w:hAnsi="Times New Roman" w:cs="Times New Roman"/>
+          <w:b w:val="0"/>
+          <w:i w:val="0"/>
+          <w:sz w:val="24"/>
+        </w:rPr>
+        <w:t>Cuiabá</w:t>
+      </w:r>
+    </w:p>
+    <w:p>
+      <w:pPr>
+        <w:spacing w:after="0" w:line="240" w:lineRule="auto"/>
+        <w:jc w:val="center"/>
+      </w:pPr>
+      <w:r>
+        <w:rPr>
+          <w:rFonts w:ascii="Times New Roman" w:hAnsi="Times New Roman" w:cs="Times New Roman"/>
+          <w:b w:val="0"/>
+          <w:i w:val="0"/>
+          <w:sz w:val="24"/>
+        </w:rPr>
+        <w:t>2026</w:t>
+      </w:r>
+    </w:p>
+    <w:p>
+      <w:r>
+        <w:br w:type="page"/>
+      </w:r>
+    </w:p>
+    <w:p>
+      <w:pPr>
+        <w:spacing w:after="0"/>
+        <w:jc w:val="center"/>
+      </w:pPr>
+      <w:r>
+        <w:rPr>
+          <w:rFonts w:ascii="Times New Roman" w:hAnsi="Times New Roman" w:cs="Times New Roman"/>
+          <w:b/>
+          <w:i w:val="0"/>
+          <w:sz w:val="24"/>
+        </w:rPr>
+        <w:t>[NOME COMPLETO]</w:t>
+      </w:r>
+    </w:p>
+    <w:p/>
+    <w:p/>
+    <w:p/>
+    <w:p/>
+    <w:p/>
+    <w:p/>
+    <w:p/>
+    <w:p>
+      <w:pPr>
+        <w:spacing w:line="360" w:lineRule="auto" w:after="0"/>
+        <w:jc w:val="center"/>
+      </w:pPr>
+      <w:r>
+        <w:rPr>
+          <w:rFonts w:ascii="Times New Roman" w:hAnsi="Times New Roman" w:cs="Times New Roman"/>
+          <w:b/>
+          <w:i w:val="0"/>
+          <w:sz w:val="28"/>
+        </w:rPr>
+        <w:t>HARNESSES DE AGENTES DE CODIFICAÇÃO: O IMPACTO DO PROJETO DO HARNESS SOBRE O CUSTO E O DESEMPENHO DE UM MODELO DE LINGUAGEM MANTIDO FIXO</w:t>
+      </w:r>
+    </w:p>
+    <w:p/>
+    <w:p/>
+    <w:p/>
+    <w:p/>
+    <w:p>
+      <w:pPr>
+        <w:spacing w:line="240" w:lineRule="auto" w:after="0"/>
+        <w:ind w:left="4535"/>
+        <w:jc w:val="both"/>
+      </w:pPr>
+      <w:r>
+        <w:rPr>
+          <w:rFonts w:ascii="Times New Roman" w:hAnsi="Times New Roman" w:cs="Times New Roman"/>
+          <w:b w:val="0"/>
+          <w:i w:val="0"/>
+          <w:sz w:val="24"/>
+        </w:rPr>
+        <w:t>Projeto de Conclusão de Curso apresentado ao Departamento de Área de Informática do Instituto Federal de Educação, Ciência e Tecnologia de Mato Grosso, Campus Octayde Jorge da Silva, como requisito parcial para a conclusão do curso de [NOME DO CURSO].</w:t>
+      </w:r>
+    </w:p>
+    <w:p>
+      <w:pPr>
+        <w:spacing w:line="240" w:lineRule="auto" w:before="240" w:after="0"/>
+        <w:ind w:left="4535"/>
+        <w:jc w:val="both"/>
+      </w:pPr>
+      <w:r>
+        <w:rPr>
+          <w:rFonts w:ascii="Times New Roman" w:hAnsi="Times New Roman" w:cs="Times New Roman"/>
+          <w:b w:val="0"/>
+          <w:i w:val="0"/>
+          <w:sz w:val="24"/>
+        </w:rPr>
+        <w:t>Orientador: [NOME DO ORIENTADOR]</w:t>
+      </w:r>
+    </w:p>
     <w:p/>
     <w:p/>
     <w:p/>

</xml_diff>

<commit_message>
docs(pcc): reference the ABNT norms in the form the norms themselves use
NBR 6023:2025 §8.1.2 gives the model for referencing an ABNT standard, and
its own example is NBR 14724:2011 — itself a third edition — written without
an edition number. Three details of that model the entries did not follow:
the "ABNT NBR" prefix, colons rather than dashes as subtitle separators, and
no "3. ed.".

The aula 5 handout says the base norm is the 2018 edition plus Emenda 1 of
2025. The preface of the 2025 edition settles it: "A ABNT NBR 6023:2025
equivale ao conjunto ABNT NBR 6023:2018 e Emenda 1, de 21.05.2025, que
cancela e substitui a ABNT NBR 6023:2018." The emenda is the delta document;
the third edition, 21.05.2025, is what a reference list cites.

The 2025a/2025b letters stay, because two ABNT entries now share the year.
</commit_message>
<xml_diff>
--- a/dist/projeto-pcc.docx
+++ b/dist/projeto-pcc.docx
@@ -4703,7 +4703,7 @@
           <w:i w:val="0"/>
           <w:sz w:val="24"/>
         </w:rPr>
-        <w:t>NBR 6023</w:t>
+        <w:t>ABNT NBR 6023</w:t>
       </w:r>
       <w:r>
         <w:rPr>
@@ -4712,7 +4712,7 @@
           <w:i w:val="0"/>
           <w:sz w:val="24"/>
         </w:rPr>
-        <w:t>: informação e documentação — referências — elaboração. 3. ed. Rio de Janeiro: ABNT, 2025a.</w:t>
+        <w:t>: informação e documentação: referências: elaboração. Rio de Janeiro: ABNT, 2025a.</w:t>
       </w:r>
     </w:p>
     <w:p>
@@ -4737,7 +4737,7 @@
           <w:i w:val="0"/>
           <w:sz w:val="24"/>
         </w:rPr>
-        <w:t>NBR 10520</w:t>
+        <w:t>ABNT NBR 10520</w:t>
       </w:r>
       <w:r>
         <w:rPr>
@@ -4746,7 +4746,7 @@
           <w:i w:val="0"/>
           <w:sz w:val="24"/>
         </w:rPr>
-        <w:t>: informação e documentação — citações em documentos — apresentação. Rio de Janeiro: ABNT, 2023.</w:t>
+        <w:t>: informação e documentação: citações em documentos: apresentação. Rio de Janeiro: ABNT, 2023.</w:t>
       </w:r>
     </w:p>
     <w:p>
@@ -4771,7 +4771,7 @@
           <w:i w:val="0"/>
           <w:sz w:val="24"/>
         </w:rPr>
-        <w:t>NBR 15287</w:t>
+        <w:t>ABNT NBR 15287</w:t>
       </w:r>
       <w:r>
         <w:rPr>
@@ -4780,7 +4780,7 @@
           <w:i w:val="0"/>
           <w:sz w:val="24"/>
         </w:rPr>
-        <w:t>: informação e documentação — projeto de pesquisa — apresentação. 3. ed. Rio de Janeiro: ABNT, 2025b.</w:t>
+        <w:t>: informação e documentação: projeto de pesquisa: apresentação. Rio de Janeiro: ABNT, 2025b.</w:t>
       </w:r>
     </w:p>
     <w:p>
@@ -5647,7 +5647,7 @@
           <w:rFonts w:ascii="Times New Roman" w:hAnsi="Times New Roman" w:cs="Times New Roman"/>
           <w:sz w:val="20"/>
         </w:rPr>
-        <w:t xml:space="preserve"> Os exemplos de referência do template departamental (Instituto Federal de Mato Grosso, 2022) precedem as edições vigentes da NBR 6023 e da NBR 10520, e o template diverge de si mesmo ao alternar entre “Acesso em:” e “Acessado em:” e ao envolver endereços eletrônicos em colchetes angulares. Onde há contradição interna, seguiu-se a edição vigente: NBR 6023:2025 na lista de referências, sem colchetes angulares e com “Acesso em:” em todas as entradas, e NBR 10520:2023 nas citações do corpo do texto, com o sobrenome em caixa-alta apenas na lista de referências.</w:t>
+        <w:t xml:space="preserve"> Os exemplos de referência do template departamental (Instituto Federal de Mato Grosso, 2022) precedem as edições vigentes da ABNT NBR 6023 e da ABNT NBR 10520, e o template diverge de si mesmo ao alternar entre “Acesso em:” e “Acessado em:” e ao envolver endereços eletrônicos em colchetes angulares. Onde há contradição interna, seguiu-se a edição vigente: ABNT NBR 6023:2025 na lista de referências, sem colchetes angulares e com “Acesso em:” em todas as entradas, e ABNT NBR 10520:2023 nas citações do corpo do texto, com o sobrenome em caixa-alta apenas na lista de referências.</w:t>
       </w:r>
     </w:p>
   </w:footnote>

</xml_diff>

<commit_message>
docs(pcc): state the harness question as a developer decision
The project measured the harness effect for the literature and never said
who acts on the number. Title, tema, problema, objetivo geral and both
hypotheses now ask what the harness costs the developer who already pays
for the model, and the introducao, referencial teorico and the affected
paragraphs of material e metodo follow.

Four sources that measure this question join the reference list: the
FrontierHarness eval, arXiv:2608.08654 on scaffolding cost, arXiv:2603.28052
on end-to-end harness optimisation and arXiv:2607.13285 on locating a
behaviour in harness source. The list keeps NBR 6023:2025 and alphabetical
order, which moves ALIER FORMENT ahead of the ABNT entries.

Resultados preliminares and the orcamento prose pay for the space under the
reduction ladder in docs/spec/14-document-outline.md. Sumario page numbers
for sections 4, 5 and 6 were wrong before this change and now match Word's
pagination.
</commit_message>
<xml_diff>
--- a/dist/projeto-pcc.docx
+++ b/dist/projeto-pcc.docx
@@ -95,11 +95,11 @@
       <w:r>
         <w:rPr>
           <w:rFonts w:ascii="Times New Roman" w:hAnsi="Times New Roman" w:cs="Times New Roman"/>
-          <w:b/>
+          <w:b w:val="0"/>
           <w:i w:val="0"/>
           <w:sz w:val="32"/>
         </w:rPr>
-        <w:t>HARNESSES DE AGENTES DE CODIFICAÇÃO: O IMPACTO DO PROJETO DO HARNESS SOBRE O CUSTO E O DESEMPENHO DE UM MODELO DE LINGUAGEM MANTIDO FIXO</w:t>
+        <w:t xml:space="preserve">O HARNESS COMO DECISÃO DO DESENVOLVEDOR: CUSTO POR TAREFA CONCLUÍDA E TAXA DE SUCESSO DE AGENTES DE CODIFICAÇÃO SOB UM MESMO MODELO</w:t>
       </w:r>
     </w:p>
     <w:p/>
@@ -175,11 +175,11 @@
       <w:r>
         <w:rPr>
           <w:rFonts w:ascii="Times New Roman" w:hAnsi="Times New Roman" w:cs="Times New Roman"/>
-          <w:b/>
+          <w:b w:val="0"/>
           <w:i w:val="0"/>
           <w:sz w:val="28"/>
         </w:rPr>
-        <w:t>HARNESSES DE AGENTES DE CODIFICAÇÃO: O IMPACTO DO PROJETO DO HARNESS SOBRE O CUSTO E O DESEMPENHO DE UM MODELO DE LINGUAGEM MANTIDO FIXO</w:t>
+        <w:t xml:space="preserve">O HARNESS COMO DECISÃO DO DESENVOLVEDOR: CUSTO POR TAREFA CONCLUÍDA E TAXA DE SUCESSO DE AGENTES DE CODIFICAÇÃO SOB UM MESMO MODELO</w:t>
       </w:r>
     </w:p>
     <w:p/>
@@ -351,7 +351,7 @@
         </w:rPr>
         <w:t>4 ORÇAMENTO</w:t>
         <w:tab/>
-        <w:t>7</w:t>
+        <w:t>8</w:t>
       </w:r>
     </w:p>
     <w:p>
@@ -371,7 +371,7 @@
         </w:rPr>
         <w:t>5 CRONOGRAMA</w:t>
         <w:tab/>
-        <w:t>7</w:t>
+        <w:t>8</w:t>
       </w:r>
     </w:p>
     <w:p>
@@ -391,7 +391,7 @@
         </w:rPr>
         <w:t>6 REFERÊNCIAS</w:t>
         <w:tab/>
-        <w:t>7</w:t>
+        <w:t>8</w:t>
       </w:r>
     </w:p>
     <w:p>
@@ -448,7 +448,7 @@
           <w:i w:val="0"/>
           <w:sz w:val="24"/>
         </w:rPr>
-        <w:t xml:space="preserve">A escolha do modelo domina a discussão sobre agentes de codificação, mas não é o único fator sob controle de quem os usa. Na Tabela 1 de Lin </w:t>
+        <w:t xml:space="preserve">A escolha do modelo domina a conversa sobre agentes de codificação, mas quem programa escolhe também o </w:t>
       </w:r>
       <w:r>
         <w:rPr>
@@ -457,7 +457,7 @@
           <w:i/>
           <w:sz w:val="24"/>
         </w:rPr>
-        <w:t>et al.</w:t>
+        <w:t xml:space="preserve">harness</w:t>
       </w:r>
       <w:r>
         <w:rPr>
@@ -466,7 +466,7 @@
           <w:i w:val="0"/>
           <w:sz w:val="24"/>
         </w:rPr>
-        <w:t xml:space="preserve"> (2026)</w:t>
+        <w:t xml:space="preserve">, e é ele que decide quanto do modelo pago vira trabalho entregue. No FrontierHarness (Runta, 2026)</w:t>
       </w:r>
       <w:r>
         <w:rPr>
@@ -485,7 +485,7 @@
           <w:i w:val="0"/>
           <w:sz w:val="24"/>
         </w:rPr>
-        <w:t xml:space="preserve">, três </w:t>
+        <w:t xml:space="preserve">, nove </w:t>
       </w:r>
       <w:r>
         <w:rPr>
@@ -494,7 +494,7 @@
           <w:i/>
           <w:sz w:val="24"/>
         </w:rPr>
-        <w:t>harnesses</w:t>
+        <w:t xml:space="preserve">harnesses</w:t>
       </w:r>
       <w:r>
         <w:rPr>
@@ -503,25 +503,7 @@
           <w:i w:val="0"/>
           <w:sz w:val="24"/>
         </w:rPr>
-        <w:t xml:space="preserve"> humanos sobre o mesmo modelo congelado obtêm 47,2%, 62,9% e 71,9% de pass@1, uma dispersão de 24,7 pontos percentuais atribuível só ao </w:t>
-      </w:r>
-      <w:r>
-        <w:rPr>
-          <w:rFonts w:ascii="Times New Roman" w:hAnsi="Times New Roman" w:cs="Times New Roman"/>
-          <w:b w:val="0"/>
-          <w:i/>
-          <w:sz w:val="24"/>
-        </w:rPr>
-        <w:t>harness</w:t>
-      </w:r>
-      <w:r>
-        <w:rPr>
-          <w:rFonts w:ascii="Times New Roman" w:hAnsi="Times New Roman" w:cs="Times New Roman"/>
-          <w:b w:val="0"/>
-          <w:i w:val="0"/>
-          <w:sz w:val="24"/>
-        </w:rPr>
-        <w:t>. O estudo da Databricks relatado por Earendil (2026) registra variação superior a 2x no custo por tarefa, sem mudança de qualidade.</w:t>
+        <w:t xml:space="preserve"> sobre um mesmo modelo ficam entre 50,0% e 66,7% de aprovação, enquanto o custo mediano por tarefa concluída vai de US$ 1,05 a US$ 18,34, variação de 17x.</w:t>
       </w:r>
     </w:p>
     <w:p>
@@ -537,7 +519,7 @@
           <w:i w:val="0"/>
           <w:sz w:val="24"/>
         </w:rPr>
-        <w:t xml:space="preserve">Com a linhagem do </w:t>
+        <w:t xml:space="preserve">Alier Forment </w:t>
       </w:r>
       <w:r>
         <w:rPr>
@@ -546,7 +528,7 @@
           <w:i/>
           <w:sz w:val="24"/>
         </w:rPr>
-        <w:t>harness</w:t>
+        <w:t xml:space="preserve">et al.</w:t>
       </w:r>
       <w:r>
         <w:rPr>
@@ -555,7 +537,7 @@
           <w:i w:val="0"/>
           <w:sz w:val="24"/>
         </w:rPr>
-        <w:t xml:space="preserve"> fixa, a diferença aparece antes de o modelo gerar um token. Na primeira requisição da mesma tarefa, o oh-my-pi, </w:t>
+        <w:t xml:space="preserve"> (2026) medem, para um mesmo modelo sobre uma tarefa fixa, 139x de variação no custo entre </w:t>
       </w:r>
       <w:r>
         <w:rPr>
@@ -564,7 +546,7 @@
           <w:i/>
           <w:sz w:val="24"/>
         </w:rPr>
-        <w:t>fork</w:t>
+        <w:t xml:space="preserve">scaffoldings</w:t>
       </w:r>
       <w:r>
         <w:rPr>
@@ -573,7 +555,7 @@
           <w:i w:val="0"/>
           <w:sz w:val="24"/>
         </w:rPr>
-        <w:t xml:space="preserve"> direto do pi, envia 11,4x os bytes do próprio ascendente, 64.945 contra 5.676. Falta medir quanto dessa diferença de carga chega ao resultado final, porque é isso que determina quanto do modelo pago cada </w:t>
+        <w:t xml:space="preserve"> que concluem a tarefa. Nenhuma dessas comparações diz ao desenvolvedor o que fazer: todas contrastam ferramentas de equipes diferentes. Com a linhagem fixa, a diferença aparece antes do primeiro token: o oh-my-pi, </w:t>
       </w:r>
       <w:r>
         <w:rPr>
@@ -582,7 +564,7 @@
           <w:i/>
           <w:sz w:val="24"/>
         </w:rPr>
-        <w:t>harness</w:t>
+        <w:t xml:space="preserve">fork</w:t>
       </w:r>
       <w:r>
         <w:rPr>
@@ -591,7 +573,7 @@
           <w:i w:val="0"/>
           <w:sz w:val="24"/>
         </w:rPr>
-        <w:t xml:space="preserve"> aproveita.</w:t>
+        <w:t xml:space="preserve"> direto do pi, envia 11,4x os bytes do ascendente, 64.945 contra 5.676, medidos neste projeto. Quanto dessa carga extra chega ao resultado final decide quanto do modelo pago o desenvolvedor aproveita.</w:t>
       </w:r>
     </w:p>
     <w:p>
@@ -619,10 +601,19 @@
         <w:rPr>
           <w:rFonts w:ascii="Times New Roman" w:hAnsi="Times New Roman" w:cs="Times New Roman"/>
           <w:b w:val="0"/>
+          <w:i w:val="0"/>
+          <w:sz w:val="24"/>
+        </w:rPr>
+        <w:t xml:space="preserve">A escolha do </w:t>
+      </w:r>
+      <w:r>
+        <w:rPr>
+          <w:rFonts w:ascii="Times New Roman" w:hAnsi="Times New Roman" w:cs="Times New Roman"/>
+          <w:b w:val="0"/>
           <w:i/>
           <w:sz w:val="24"/>
         </w:rPr>
-        <w:t>Harnesses</w:t>
+        <w:t xml:space="preserve">harness</w:t>
       </w:r>
       <w:r>
         <w:rPr>
@@ -631,25 +622,7 @@
           <w:i w:val="0"/>
           <w:sz w:val="24"/>
         </w:rPr>
-        <w:t xml:space="preserve"> de agentes de codificação: o impacto do projeto do </w:t>
-      </w:r>
-      <w:r>
-        <w:rPr>
-          <w:rFonts w:ascii="Times New Roman" w:hAnsi="Times New Roman" w:cs="Times New Roman"/>
-          <w:b w:val="0"/>
-          <w:i/>
-          <w:sz w:val="24"/>
-        </w:rPr>
-        <w:t>harness</w:t>
-      </w:r>
-      <w:r>
-        <w:rPr>
-          <w:rFonts w:ascii="Times New Roman" w:hAnsi="Times New Roman" w:cs="Times New Roman"/>
-          <w:b w:val="0"/>
-          <w:i w:val="0"/>
-          <w:sz w:val="24"/>
-        </w:rPr>
-        <w:t xml:space="preserve"> sobre o custo e o desempenho de um modelo de linguagem mantido fixo.</w:t>
+        <w:t xml:space="preserve"> como decisão de engenharia do desenvolvedor: seu efeito sobre o custo por tarefa concluída e sobre a taxa de sucesso de agentes de codificação, mantido fixo o modelo de linguagem.</w:t>
       </w:r>
     </w:p>
     <w:p>
@@ -680,7 +653,7 @@
           <w:i w:val="0"/>
           <w:sz w:val="24"/>
         </w:rPr>
-        <w:t xml:space="preserve">Mantido fixo o modelo de linguagem, quanto do custo em tokens e da taxa de sucesso de um agente de codificação é determinado pelo projeto do </w:t>
+        <w:t xml:space="preserve">Para o desenvolvedor que já escolheu o modelo, quanto do custo por tarefa concluída e da taxa de sucesso do seu agente de codificação é determinado pelo </w:t>
       </w:r>
       <w:r>
         <w:rPr>
@@ -689,7 +662,7 @@
           <w:i/>
           <w:sz w:val="24"/>
         </w:rPr>
-        <w:t>harness</w:t>
+        <w:t xml:space="preserve">harness</w:t>
       </w:r>
       <w:r>
         <w:rPr>
@@ -698,7 +671,25 @@
           <w:i w:val="0"/>
           <w:sz w:val="24"/>
         </w:rPr>
-        <w:t>? E é possível atribuir essa variação a decisões específicas de projeto, em vez de ao conjunto indistinto de diferenças entre implementações independentes?</w:t>
+        <w:t xml:space="preserve"> que ele adota? E quais decisões de projeto do </w:t>
+      </w:r>
+      <w:r>
+        <w:rPr>
+          <w:rFonts w:ascii="Times New Roman" w:hAnsi="Times New Roman" w:cs="Times New Roman"/>
+          <w:b w:val="0"/>
+          <w:i/>
+          <w:sz w:val="24"/>
+        </w:rPr>
+        <w:t xml:space="preserve">harness</w:t>
+      </w:r>
+      <w:r>
+        <w:rPr>
+          <w:rFonts w:ascii="Times New Roman" w:hAnsi="Times New Roman" w:cs="Times New Roman"/>
+          <w:b w:val="0"/>
+          <w:i w:val="0"/>
+          <w:sz w:val="24"/>
+        </w:rPr>
+        <w:t xml:space="preserve"> respondem por essa diferença, de modo que ele possa agir sobre elas em vez de apenas trocar de ferramenta às cegas?</w:t>
       </w:r>
     </w:p>
     <w:p>
@@ -729,7 +720,7 @@
           <w:i w:val="0"/>
           <w:sz w:val="24"/>
         </w:rPr>
-        <w:t xml:space="preserve">Medir, com o modelo de linguagem mantido fixo, o efeito do projeto do </w:t>
+        <w:t xml:space="preserve">Medir, com o modelo de linguagem mantido fixo, quanto o </w:t>
       </w:r>
       <w:r>
         <w:rPr>
@@ -738,7 +729,7 @@
           <w:i/>
           <w:sz w:val="24"/>
         </w:rPr>
-        <w:t>harness</w:t>
+        <w:t xml:space="preserve">harness</w:t>
       </w:r>
       <w:r>
         <w:rPr>
@@ -747,7 +738,7 @@
           <w:i w:val="0"/>
           <w:sz w:val="24"/>
         </w:rPr>
-        <w:t xml:space="preserve"> sobre o custo em tokens e a taxa de sucesso de agentes de codificação, isolando decisões específicas de projeto por meio da comparação entre um </w:t>
+        <w:t xml:space="preserve"> adotado determina o custo por tarefa concluída e a taxa de sucesso de um agente de codificação, isolando decisões específicas de projeto pela comparação entre um </w:t>
       </w:r>
       <w:r>
         <w:rPr>
@@ -756,7 +747,7 @@
           <w:i/>
           <w:sz w:val="24"/>
         </w:rPr>
-        <w:t>harness</w:t>
+        <w:t xml:space="preserve">harness</w:t>
       </w:r>
       <w:r>
         <w:rPr>
@@ -774,7 +765,7 @@
           <w:i/>
           <w:sz w:val="24"/>
         </w:rPr>
-        <w:t>fork</w:t>
+        <w:t xml:space="preserve">fork</w:t>
       </w:r>
       <w:r>
         <w:rPr>
@@ -783,7 +774,7 @@
           <w:i w:val="0"/>
           <w:sz w:val="24"/>
         </w:rPr>
-        <w:t xml:space="preserve"> direto dele.</w:t>
+        <w:t xml:space="preserve"> direto dele, e entregar o resultado como critério de escolha reproduzível pelo desenvolvedor.</w:t>
       </w:r>
     </w:p>
     <w:p>
@@ -975,7 +966,7 @@
           <w:i/>
           <w:sz w:val="24"/>
         </w:rPr>
-        <w:t>harness</w:t>
+        <w:t xml:space="preserve">harness</w:t>
       </w:r>
       <w:r>
         <w:rPr>
@@ -984,7 +975,7 @@
           <w:i w:val="0"/>
           <w:sz w:val="24"/>
         </w:rPr>
-        <w:t xml:space="preserve"> e o custo efetivamente medido no instrumento externo;</w:t>
+        <w:t xml:space="preserve"> e o custo efetivamente medido no instrumento externo, que é o que o desenvolvedor paga;</w:t>
       </w:r>
     </w:p>
     <w:p>
@@ -1009,7 +1000,7 @@
           <w:i/>
           <w:sz w:val="24"/>
         </w:rPr>
-        <w:t>runner</w:t>
+        <w:t xml:space="preserve">runner</w:t>
       </w:r>
       <w:r>
         <w:rPr>
@@ -1018,7 +1009,7 @@
           <w:i w:val="0"/>
           <w:sz w:val="24"/>
         </w:rPr>
-        <w:t>, os dados brutos e os scripts de análise, de modo que o experimento possa ser reexecutado a custo monetário zero.</w:t>
+        <w:t xml:space="preserve">, os dados brutos e os scripts de análise, com um procedimento que o desenvolvedor reexecute na própria máquina a custo monetário zero.</w:t>
       </w:r>
     </w:p>
     <w:p>
@@ -1058,7 +1049,7 @@
           <w:i/>
           <w:sz w:val="24"/>
         </w:rPr>
-        <w:t>harness</w:t>
+        <w:t xml:space="preserve">harness</w:t>
       </w:r>
       <w:r>
         <w:rPr>
@@ -1067,7 +1058,7 @@
           <w:i w:val="0"/>
           <w:sz w:val="24"/>
         </w:rPr>
-        <w:t xml:space="preserve"> e o modelo, que conta requisições, tokens e latência da mesma forma para todos os braços. Cada par de braço e tarefa é executado ao menos três vezes sobre uma suíte fixa do DeepSWE, e a comparação é feita por teste pareado sobre o Succ/Mtok de cada tarefa. Espera-se obter a diferença de custo e de sucesso atribuível ao projeto do </w:t>
+        <w:t xml:space="preserve"> e o modelo, que conta requisições, tokens e latência da mesma forma para todos os braços. Cada par de braço e tarefa é executado ao menos três vezes sobre uma suíte fixa do DeepSWE, e a comparação é feita por teste pareado sobre o Succ/Mtok de cada tarefa. Espera-se obter a diferença de custo por tarefa concluída e de taxa de sucesso atribuível ao </w:t>
       </w:r>
       <w:r>
         <w:rPr>
@@ -1076,7 +1067,7 @@
           <w:i/>
           <w:sz w:val="24"/>
         </w:rPr>
-        <w:t>harness</w:t>
+        <w:t xml:space="preserve">harness</w:t>
       </w:r>
       <w:r>
         <w:rPr>
@@ -1085,7 +1076,7 @@
           <w:i w:val="0"/>
           <w:sz w:val="24"/>
         </w:rPr>
-        <w:t>, com o modelo mantido fixo. A seção 3 detalha material, método e tratamento estatístico.</w:t>
+        <w:t xml:space="preserve">, em forma utilizável por quem escolhe a ferramenta. A seção 3 detalha material, método e tratamento estatístico.</w:t>
       </w:r>
     </w:p>
     <w:p>
@@ -1112,20 +1103,11 @@
       <w:r>
         <w:rPr>
           <w:rFonts w:ascii="Times New Roman" w:hAnsi="Times New Roman" w:cs="Times New Roman"/>
-          <w:b/>
-          <w:i w:val="0"/>
-          <w:sz w:val="24"/>
-        </w:rPr>
-        <w:t>H1</w:t>
-      </w:r>
-      <w:r>
-        <w:rPr>
-          <w:rFonts w:ascii="Times New Roman" w:hAnsi="Times New Roman" w:cs="Times New Roman"/>
           <w:b w:val="0"/>
           <w:i w:val="0"/>
           <w:sz w:val="24"/>
         </w:rPr>
-        <w:t xml:space="preserve"> — Entre </w:t>
+        <w:t xml:space="preserve">H1 — Entre </w:t>
       </w:r>
       <w:r>
         <w:rPr>
@@ -1134,7 +1116,7 @@
           <w:i/>
           <w:sz w:val="24"/>
         </w:rPr>
-        <w:t>harnesses</w:t>
+        <w:t xml:space="preserve">harnesses</w:t>
       </w:r>
       <w:r>
         <w:rPr>
@@ -1143,7 +1125,7 @@
           <w:i w:val="0"/>
           <w:sz w:val="24"/>
         </w:rPr>
-        <w:t xml:space="preserve"> distintos executando o mesmo modelo, a diferença de custo por tarefa concluída é de ordem prática relevante, comparável à diferença obtida ao se trocar de modelo sob um </w:t>
+        <w:t xml:space="preserve"> distintos executando o mesmo modelo, a diferença de custo por tarefa concluída é de ordem prática relevante para quem paga a conta, comparável à diferença obtida ao se trocar de modelo sob um </w:t>
       </w:r>
       <w:r>
         <w:rPr>
@@ -1152,7 +1134,7 @@
           <w:i/>
           <w:sz w:val="24"/>
         </w:rPr>
-        <w:t>harness</w:t>
+        <w:t xml:space="preserve">harness</w:t>
       </w:r>
       <w:r>
         <w:rPr>
@@ -1173,20 +1155,11 @@
       <w:r>
         <w:rPr>
           <w:rFonts w:ascii="Times New Roman" w:hAnsi="Times New Roman" w:cs="Times New Roman"/>
-          <w:b/>
-          <w:i w:val="0"/>
-          <w:sz w:val="24"/>
-        </w:rPr>
-        <w:t>H2</w:t>
-      </w:r>
-      <w:r>
-        <w:rPr>
-          <w:rFonts w:ascii="Times New Roman" w:hAnsi="Times New Roman" w:cs="Times New Roman"/>
           <w:b w:val="0"/>
           <w:i w:val="0"/>
           <w:sz w:val="24"/>
         </w:rPr>
-        <w:t xml:space="preserve"> — Essa diferença persiste entre um </w:t>
+        <w:t xml:space="preserve">H2 — Essa diferença persiste entre um </w:t>
       </w:r>
       <w:r>
         <w:rPr>
@@ -1195,7 +1168,7 @@
           <w:i/>
           <w:sz w:val="24"/>
         </w:rPr>
-        <w:t>harness</w:t>
+        <w:t xml:space="preserve">harness</w:t>
       </w:r>
       <w:r>
         <w:rPr>
@@ -1213,7 +1186,7 @@
           <w:i/>
           <w:sz w:val="24"/>
         </w:rPr>
-        <w:t>fork</w:t>
+        <w:t xml:space="preserve">fork</w:t>
       </w:r>
       <w:r>
         <w:rPr>
@@ -1222,7 +1195,7 @@
           <w:i w:val="0"/>
           <w:sz w:val="24"/>
         </w:rPr>
-        <w:t xml:space="preserve"> direto dele, o que indicaria que ela é produzida por decisões de projeto isoláveis (prompt de sistema, número e tamanho dos esquemas de ferramenta, política de compactação de contexto), e não apenas pelo acúmulo de diferenças entre bases de código independentes. H2 é refutada se pi e oh-my-pi não diferirem significativamente em Succ/Mtok, apesar dos 11,4x de diferença na carga da primeira requisição medidos neste projeto. Esse desfecho é possível e seria, ele próprio, um achado a reportar. Uma carga 11,4x maior não implica resultado pior, pois o oh-my-pi pode recuperar o custo concluindo a tarefa em menos passos.</w:t>
+        <w:t xml:space="preserve"> direto dele, o que indicaria que ela é produzida por decisões de projeto isoláveis (prompt de sistema, número e tamanho dos esquemas de ferramenta, política de compactação de contexto), e não pela qualidade geral da ferramenta nem pelo acúmulo de diferenças entre bases de código independentes. H2 é refutada se pi e oh-my-pi não diferirem significativamente em Succ/Mtok, apesar dos 11,4x de diferença na carga da primeira requisição medidos neste projeto. Esse desfecho é possível e seria, ele próprio, um achado a reportar. Uma carga 11,4x maior não implica resultado pior, pois o oh-my-pi pode recuperar o custo concluindo a tarefa em menos passos.</w:t>
       </w:r>
     </w:p>
     <w:p>
@@ -1279,7 +1252,7 @@
           <w:i/>
           <w:sz w:val="24"/>
         </w:rPr>
-        <w:t>et al.</w:t>
+        <w:t xml:space="preserve">et al.</w:t>
       </w:r>
       <w:r>
         <w:rPr>
@@ -1297,7 +1270,7 @@
           <w:i/>
           <w:sz w:val="24"/>
         </w:rPr>
-        <w:t>agent harness</w:t>
+        <w:t xml:space="preserve">agent harness</w:t>
       </w:r>
       <w:r>
         <w:rPr>
@@ -1315,7 +1288,7 @@
           <w:i/>
           <w:sz w:val="24"/>
         </w:rPr>
-        <w:t>sandboxes</w:t>
+        <w:t xml:space="preserve">sandboxes</w:t>
       </w:r>
       <w:r>
         <w:rPr>
@@ -1324,7 +1297,7 @@
           <w:i w:val="0"/>
           <w:sz w:val="24"/>
         </w:rPr>
-        <w:t xml:space="preserve">, memória, validadores, fronteiras de permissão, laços de execução e canais de realimentação, convertendo um modelo sem estado em um agente capaz de executar tarefas de longo horizonte. Os mesmos autores separam capacidades internas do modelo, infraestrutura de </w:t>
+        <w:t xml:space="preserve">, memória, validadores, fronteiras de permissão, laços de execução e canais de realimentação, convertendo um modelo sem estado em um agente capaz de executar tarefas de longo horizonte. Wang </w:t>
       </w:r>
       <w:r>
         <w:rPr>
@@ -1333,7 +1306,7 @@
           <w:i/>
           <w:sz w:val="24"/>
         </w:rPr>
-        <w:t>harness</w:t>
+        <w:t xml:space="preserve">et al.</w:t>
       </w:r>
       <w:r>
         <w:rPr>
@@ -1342,7 +1315,7 @@
           <w:i w:val="0"/>
           <w:sz w:val="24"/>
         </w:rPr>
-        <w:t xml:space="preserve"> e artefatos de código criados pelo agente; o recorte aqui é o do meio, com as capacidades internas constantes. Os braços vão de um laço ReAct mínimo (Yao </w:t>
+        <w:t xml:space="preserve"> (2026) descrevem a mesma camada pelo que ela faz: monta os prompts, gerencia o estado, invoca as ferramentas e coordena o laço. É essa camada que muda quando o desenvolvedor troca de ferramenta e mantém o modelo, e os braços vão de um laço ReAct mínimo (Yao </w:t>
       </w:r>
       <w:r>
         <w:rPr>
@@ -1351,7 +1324,7 @@
           <w:i/>
           <w:sz w:val="24"/>
         </w:rPr>
-        <w:t>et al.</w:t>
+        <w:t xml:space="preserve">et al.</w:t>
       </w:r>
       <w:r>
         <w:rPr>
@@ -1360,7 +1333,7 @@
           <w:i w:val="0"/>
           <w:sz w:val="24"/>
         </w:rPr>
-        <w:t>, 2022) a implementações com planejamento, compactação e subagentes.</w:t>
+        <w:t xml:space="preserve">, 2022) a implementações com planejamento, compactação e subagentes.</w:t>
       </w:r>
     </w:p>
     <w:p>
@@ -1385,7 +1358,7 @@
           <w:i/>
           <w:sz w:val="24"/>
         </w:rPr>
-        <w:t>et al.</w:t>
+        <w:t xml:space="preserve">et al.</w:t>
       </w:r>
       <w:r>
         <w:rPr>
@@ -1394,7 +1367,7 @@
           <w:i w:val="0"/>
           <w:sz w:val="24"/>
         </w:rPr>
-        <w:t xml:space="preserve"> (2024), cuja interface agente-computador sob medida rendeu o estado da arte do SWE-bench à época. O efeito do </w:t>
+        <w:t xml:space="preserve"> (2024). Que o </w:t>
       </w:r>
       <w:r>
         <w:rPr>
@@ -1403,7 +1376,7 @@
           <w:i/>
           <w:sz w:val="24"/>
         </w:rPr>
-        <w:t>harness</w:t>
+        <w:t xml:space="preserve">harness</w:t>
       </w:r>
       <w:r>
         <w:rPr>
@@ -1412,7 +1385,7 @@
           <w:i w:val="0"/>
           <w:sz w:val="24"/>
         </w:rPr>
-        <w:t xml:space="preserve"> já está estabelecido na literatura. Lin </w:t>
+        <w:t xml:space="preserve"> importa já está estabelecido: Lin </w:t>
       </w:r>
       <w:r>
         <w:rPr>
@@ -1421,7 +1394,7 @@
           <w:i/>
           <w:sz w:val="24"/>
         </w:rPr>
-        <w:t>et al.</w:t>
+        <w:t xml:space="preserve">et al.</w:t>
       </w:r>
       <w:r>
         <w:rPr>
@@ -1439,7 +1412,7 @@
           <w:i/>
           <w:sz w:val="24"/>
         </w:rPr>
-        <w:t>harnesses</w:t>
+        <w:t xml:space="preserve">harnesses</w:t>
       </w:r>
       <w:r>
         <w:rPr>
@@ -1448,7 +1421,7 @@
           <w:i w:val="0"/>
           <w:sz w:val="24"/>
         </w:rPr>
-        <w:t xml:space="preserve"> humanos sobre um modelo congelado, contra os 19,7 pontos entre as quatro bases alternativas do mesmo </w:t>
+        <w:t xml:space="preserve"> humanos sobre um modelo congelado, e Zhang </w:t>
       </w:r>
       <w:r>
         <w:rPr>
@@ -1457,7 +1430,7 @@
           <w:i/>
           <w:sz w:val="24"/>
         </w:rPr>
-        <w:t>harness</w:t>
+        <w:t xml:space="preserve">et al.</w:t>
       </w:r>
       <w:r>
         <w:rPr>
@@ -1466,7 +1439,7 @@
           <w:i w:val="0"/>
           <w:sz w:val="24"/>
         </w:rPr>
-        <w:t xml:space="preserve"> semente (§ 4.3), dispersões da mesma ordem. Zhang </w:t>
+        <w:t xml:space="preserve"> (2026) enunciam a </w:t>
       </w:r>
       <w:r>
         <w:rPr>
@@ -1475,7 +1448,7 @@
           <w:i/>
           <w:sz w:val="24"/>
         </w:rPr>
-        <w:t>et al.</w:t>
+        <w:t xml:space="preserve">Binding Constraint Thesis</w:t>
       </w:r>
       <w:r>
         <w:rPr>
@@ -1484,7 +1457,7 @@
           <w:i w:val="0"/>
           <w:sz w:val="24"/>
         </w:rPr>
-        <w:t xml:space="preserve"> (2026) enunciam a </w:t>
+        <w:t xml:space="preserve">, segundo a qual, em longo horizonte, o </w:t>
       </w:r>
       <w:r>
         <w:rPr>
@@ -1493,7 +1466,7 @@
           <w:i/>
           <w:sz w:val="24"/>
         </w:rPr>
-        <w:t>Binding Constraint Thesis</w:t>
+        <w:t xml:space="preserve">harness</w:t>
       </w:r>
       <w:r>
         <w:rPr>
@@ -1502,7 +1475,7 @@
           <w:i w:val="0"/>
           <w:sz w:val="24"/>
         </w:rPr>
-        <w:t xml:space="preserve">: em longo horizonte, o </w:t>
+        <w:t xml:space="preserve"> determina o desempenho mais que o modelo que encapsula. Alier Forment </w:t>
       </w:r>
       <w:r>
         <w:rPr>
@@ -1511,7 +1484,7 @@
           <w:i/>
           <w:sz w:val="24"/>
         </w:rPr>
-        <w:t>harness</w:t>
+        <w:t xml:space="preserve">et al.</w:t>
       </w:r>
       <w:r>
         <w:rPr>
@@ -1520,7 +1493,43 @@
           <w:i w:val="0"/>
           <w:sz w:val="24"/>
         </w:rPr>
-        <w:t xml:space="preserve"> determina o desempenho mais que o modelo que encapsula. Somam-se duas fontes de prática: o HarnessRank (2026) e o estudo da Databricks relatado por Earendil (2026), com custo por tarefa variando mais de 2x sem mudança de qualidade.</w:t>
+        <w:t xml:space="preserve"> (2026) mostram que o efeito aparece primeiro no custo: em sete </w:t>
+      </w:r>
+      <w:r>
+        <w:rPr>
+          <w:rFonts w:ascii="Times New Roman" w:hAnsi="Times New Roman" w:cs="Times New Roman"/>
+          <w:b w:val="0"/>
+          <w:i/>
+          <w:sz w:val="24"/>
+        </w:rPr>
+        <w:t xml:space="preserve">scaffoldings</w:t>
+      </w:r>
+      <w:r>
+        <w:rPr>
+          <w:rFonts w:ascii="Times New Roman" w:hAnsi="Times New Roman" w:cs="Times New Roman"/>
+          <w:b w:val="0"/>
+          <w:i w:val="0"/>
+          <w:sz w:val="24"/>
+        </w:rPr>
+        <w:t xml:space="preserve"> e cinco modelos sobre uma tarefa fixa, os dois </w:t>
+      </w:r>
+      <w:r>
+        <w:rPr>
+          <w:rFonts w:ascii="Times New Roman" w:hAnsi="Times New Roman" w:cs="Times New Roman"/>
+          <w:b w:val="0"/>
+          <w:i/>
+          <w:sz w:val="24"/>
+        </w:rPr>
+        <w:t xml:space="preserve">scaffoldings</w:t>
+      </w:r>
+      <w:r>
+        <w:rPr>
+          <w:rFonts w:ascii="Times New Roman" w:hAnsi="Times New Roman" w:cs="Times New Roman"/>
+          <w:b w:val="0"/>
+          <w:i w:val="0"/>
+          <w:sz w:val="24"/>
+        </w:rPr>
+        <w:t xml:space="preserve"> sem suporte a MCP saíram de 5,0x a 28x mais baratos que os cinco que o suportam. Somam-se três fontes de prática, não revisadas por pares: o HarnessRank (2026), o estudo da Databricks relatado por Earendil (2026) e o FrontierHarness (Runta, 2026), cujos dados normalizados são públicos (Frontier-Harness-Eval, 2026).</w:t>
       </w:r>
     </w:p>
     <w:p>
@@ -1545,7 +1554,7 @@
           <w:i/>
           <w:sz w:val="24"/>
         </w:rPr>
-        <w:t>harnesses</w:t>
+        <w:t xml:space="preserve">harnesses</w:t>
       </w:r>
       <w:r>
         <w:rPr>
@@ -1554,7 +1563,7 @@
           <w:i w:val="0"/>
           <w:sz w:val="24"/>
         </w:rPr>
-        <w:t xml:space="preserve"> de equipes diferentes sobre fundações diferentes, e a dispersão medida agrega prompt, ferramentas, gestão de contexto e desenho do laço sem separá-los. Ning </w:t>
+        <w:t xml:space="preserve"> de equipes diferentes sobre fundações diferentes, e a dispersão medida agrega prompt, ferramentas, gestão de contexto e desenho do laço sem separá-los: o desenvolvedor sabe qual ferramenta ganhou, não o que a fez ganhar. Ning </w:t>
       </w:r>
       <w:r>
         <w:rPr>
@@ -1563,7 +1572,7 @@
           <w:i/>
           <w:sz w:val="24"/>
         </w:rPr>
-        <w:t>et al.</w:t>
+        <w:t xml:space="preserve">et al.</w:t>
       </w:r>
       <w:r>
         <w:rPr>
@@ -1572,7 +1581,7 @@
           <w:i w:val="0"/>
           <w:sz w:val="24"/>
         </w:rPr>
-        <w:t xml:space="preserve"> (2026) nomeiam a lacuna em §5.2.1, onde as métricas de sucesso final confundem modelo e </w:t>
+        <w:t xml:space="preserve"> (2026) nomeiam a lacuna em §5.2.1 e pedem em §5.2.7 métricas que isolem componentes. Essas decisões são isoláveis: Lee </w:t>
       </w:r>
       <w:r>
         <w:rPr>
@@ -1581,7 +1590,7 @@
           <w:i/>
           <w:sz w:val="24"/>
         </w:rPr>
-        <w:t>harness</w:t>
+        <w:t xml:space="preserve">et al.</w:t>
       </w:r>
       <w:r>
         <w:rPr>
@@ -1590,7 +1599,7 @@
           <w:i w:val="0"/>
           <w:sz w:val="24"/>
         </w:rPr>
-        <w:t xml:space="preserve">, e pedem em §5.2.7 métricas que isolem componentes. O par pi / oh-my-pi responde a §5.2.7: um </w:t>
+        <w:t xml:space="preserve"> (2026) otimizam o código do </w:t>
       </w:r>
       <w:r>
         <w:rPr>
@@ -1599,7 +1608,43 @@
           <w:i/>
           <w:sz w:val="24"/>
         </w:rPr>
-        <w:t>fork</w:t>
+        <w:t xml:space="preserve">harness</w:t>
+      </w:r>
+      <w:r>
+        <w:rPr>
+          <w:rFonts w:ascii="Times New Roman" w:hAnsi="Times New Roman" w:cs="Times New Roman"/>
+          <w:b w:val="0"/>
+          <w:i w:val="0"/>
+          <w:sz w:val="24"/>
+        </w:rPr>
+        <w:t xml:space="preserve"> e ganham 7,7 pontos usando 4x menos tokens de contexto, e Wang </w:t>
+      </w:r>
+      <w:r>
+        <w:rPr>
+          <w:rFonts w:ascii="Times New Roman" w:hAnsi="Times New Roman" w:cs="Times New Roman"/>
+          <w:b w:val="0"/>
+          <w:i/>
+          <w:sz w:val="24"/>
+        </w:rPr>
+        <w:t xml:space="preserve">et al.</w:t>
+      </w:r>
+      <w:r>
+        <w:rPr>
+          <w:rFonts w:ascii="Times New Roman" w:hAnsi="Times New Roman" w:cs="Times New Roman"/>
+          <w:b w:val="0"/>
+          <w:i w:val="0"/>
+          <w:sz w:val="24"/>
+        </w:rPr>
+        <w:t xml:space="preserve"> (2026) atacam o passo anterior, o de localizar no código o trecho que produz o comportamento. O par pi / oh-my-pi responde a §5.2.7 pelo lado do controle: um </w:t>
+      </w:r>
+      <w:r>
+        <w:rPr>
+          <w:rFonts w:ascii="Times New Roman" w:hAnsi="Times New Roman" w:cs="Times New Roman"/>
+          <w:b w:val="0"/>
+          <w:i/>
+          <w:sz w:val="24"/>
+        </w:rPr>
+        <w:t xml:space="preserve">fork</w:t>
       </w:r>
       <w:r>
         <w:rPr>
@@ -1624,7 +1669,7 @@
           <w:i w:val="0"/>
           <w:sz w:val="24"/>
         </w:rPr>
-        <w:t xml:space="preserve">A segunda pendência é de instrumentação. O que um </w:t>
+        <w:t xml:space="preserve">A segunda pendência é de instrumentação, e atinge o desenvolvedor diretamente, porque ele decide pelo relatório que a ferramenta lhe mostra. O que um </w:t>
       </w:r>
       <w:r>
         <w:rPr>
@@ -1633,7 +1678,7 @@
           <w:i/>
           <w:sz w:val="24"/>
         </w:rPr>
-        <w:t>harness</w:t>
+        <w:t xml:space="preserve">harness</w:t>
       </w:r>
       <w:r>
         <w:rPr>
@@ -1642,7 +1687,7 @@
           <w:i w:val="0"/>
           <w:sz w:val="24"/>
         </w:rPr>
-        <w:t xml:space="preserve"> relata sobre o próprio custo diverge do que ele gasta, e cada um omite do relatório um conjunto diferente de chamadas reais ao modelo. Kapoor </w:t>
+        <w:t xml:space="preserve"> relata sobre o próprio custo diverge do que ele gasta, e cada um omite um conjunto diferente de chamadas reais ao modelo. Kapoor </w:t>
       </w:r>
       <w:r>
         <w:rPr>
@@ -1651,7 +1696,7 @@
           <w:i/>
           <w:sz w:val="24"/>
         </w:rPr>
-        <w:t>et al.</w:t>
+        <w:t xml:space="preserve">et al.</w:t>
       </w:r>
       <w:r>
         <w:rPr>
@@ -1669,7 +1714,7 @@
           <w:i/>
           <w:sz w:val="24"/>
         </w:rPr>
-        <w:t>et al.</w:t>
+        <w:t xml:space="preserve">et al.</w:t>
       </w:r>
       <w:r>
         <w:rPr>
@@ -1687,7 +1732,7 @@
           <w:i/>
           <w:sz w:val="24"/>
         </w:rPr>
-        <w:t>harnesses</w:t>
+        <w:t xml:space="preserve">harnesses</w:t>
       </w:r>
       <w:r>
         <w:rPr>
@@ -1721,7 +1766,7 @@
           <w:i/>
           <w:sz w:val="24"/>
         </w:rPr>
-        <w:t>et al.</w:t>
+        <w:t xml:space="preserve">et al.</w:t>
       </w:r>
       <w:r>
         <w:rPr>
@@ -1730,7 +1775,7 @@
           <w:i w:val="0"/>
           <w:sz w:val="24"/>
         </w:rPr>
-        <w:t xml:space="preserve"> (2026). Sobre ela pesa uma ressalva permanente. O efeito é específico do modelo e pode inverter de sinal. No </w:t>
+        <w:t xml:space="preserve"> (2026), a razão que interessa a quem paga a conta. Sobre ela pesa uma ressalva permanente, a de que o efeito é específico do modelo e pode inverter de sinal. No </w:t>
       </w:r>
       <w:r>
         <w:rPr>
@@ -1739,7 +1784,7 @@
           <w:i/>
           <w:sz w:val="24"/>
         </w:rPr>
-        <w:t>Holistic Agent Leaderboard</w:t>
+        <w:t xml:space="preserve">Holistic Agent Leaderboard</w:t>
       </w:r>
       <w:r>
         <w:rPr>
@@ -1757,7 +1802,7 @@
           <w:i/>
           <w:sz w:val="24"/>
         </w:rPr>
-        <w:t>benchmark</w:t>
+        <w:t xml:space="preserve">benchmark</w:t>
       </w:r>
       <w:r>
         <w:rPr>
@@ -1775,7 +1820,7 @@
           <w:i/>
           <w:sz w:val="24"/>
         </w:rPr>
-        <w:t>et al.</w:t>
+        <w:t xml:space="preserve">et al.</w:t>
       </w:r>
       <w:r>
         <w:rPr>
@@ -1784,7 +1829,25 @@
           <w:i w:val="0"/>
           <w:sz w:val="24"/>
         </w:rPr>
-        <w:t>, 2025). Por isso o desenho carrega dois níveis, e as conclusões são enunciadas por nível.</w:t>
+        <w:t xml:space="preserve">, 2025), e o FrontierHarness registra um </w:t>
+      </w:r>
+      <w:r>
+        <w:rPr>
+          <w:rFonts w:ascii="Times New Roman" w:hAnsi="Times New Roman" w:cs="Times New Roman"/>
+          <w:b w:val="0"/>
+          <w:i/>
+          <w:sz w:val="24"/>
+        </w:rPr>
+        <w:t xml:space="preserve">harness</w:t>
+      </w:r>
+      <w:r>
+        <w:rPr>
+          <w:rFonts w:ascii="Times New Roman" w:hAnsi="Times New Roman" w:cs="Times New Roman"/>
+          <w:b w:val="0"/>
+          <w:i w:val="0"/>
+          <w:sz w:val="24"/>
+        </w:rPr>
+        <w:t xml:space="preserve"> cujo aproveitamento de cache ponderado por tokens cai a 25,0% contra uma mediana de 67,8% (Runta, 2026). Por isso o desenho carrega dois níveis, e as conclusões são enunciadas por nível.</w:t>
       </w:r>
     </w:p>
     <w:p>
@@ -1816,16 +1879,16 @@
           <w:i w:val="0"/>
           <w:sz w:val="24"/>
         </w:rPr>
-        <w:t xml:space="preserve">Quanto à finalidade, esta é uma pesquisa </w:t>
-      </w:r>
-      <w:r>
-        <w:rPr>
-          <w:rFonts w:ascii="Times New Roman" w:hAnsi="Times New Roman" w:cs="Times New Roman"/>
-          <w:b/>
-          <w:i w:val="0"/>
-          <w:sz w:val="24"/>
-        </w:rPr>
-        <w:t>aplicada</w:t>
+        <w:t xml:space="preserve">Quanto à finalidade, esta é uma pesquisa aplicada: seu produto é um critério de escolha que um desenvolvedor pode aplicar hoje. Quanto à abordagem, é quali-quantitativa: as medidas de custo e de sucesso são quantitativas, e a atribuição de cada diferença a uma decisão de projeto do </w:t>
+      </w:r>
+      <w:r>
+        <w:rPr>
+          <w:rFonts w:ascii="Times New Roman" w:hAnsi="Times New Roman" w:cs="Times New Roman"/>
+          <w:b w:val="0"/>
+          <w:i/>
+          <w:sz w:val="24"/>
+        </w:rPr>
+        <w:t xml:space="preserve">harness</w:t>
       </w:r>
       <w:r>
         <w:rPr>
@@ -1834,16 +1897,16 @@
           <w:i w:val="0"/>
           <w:sz w:val="24"/>
         </w:rPr>
-        <w:t xml:space="preserve">: seu produto é uma decisão de engenharia que um desenvolvedor pode tomar hoje. Quanto à abordagem, é </w:t>
-      </w:r>
-      <w:r>
-        <w:rPr>
-          <w:rFonts w:ascii="Times New Roman" w:hAnsi="Times New Roman" w:cs="Times New Roman"/>
-          <w:b/>
-          <w:i w:val="0"/>
-          <w:sz w:val="24"/>
-        </w:rPr>
-        <w:t>quali-quantitativa</w:t>
+        <w:t xml:space="preserve"> é qualitativa. Quanto aos objetivos, é exploratória, porque a comparação com linhagem de </w:t>
+      </w:r>
+      <w:r>
+        <w:rPr>
+          <w:rFonts w:ascii="Times New Roman" w:hAnsi="Times New Roman" w:cs="Times New Roman"/>
+          <w:b w:val="0"/>
+          <w:i/>
+          <w:sz w:val="24"/>
+        </w:rPr>
+        <w:t xml:space="preserve">harness</w:t>
       </w:r>
       <w:r>
         <w:rPr>
@@ -1852,7 +1915,7 @@
           <w:i w:val="0"/>
           <w:sz w:val="24"/>
         </w:rPr>
-        <w:t xml:space="preserve">: as medidas de custo e de sucesso são quantitativas, e a atribuição de cada diferença a uma decisão de projeto do </w:t>
+        <w:t xml:space="preserve"> fixa não tem precedente publicado. Quanto aos procedimentos, é experimental: há variável independente manipulada (o </w:t>
       </w:r>
       <w:r>
         <w:rPr>
@@ -1861,7 +1924,7 @@
           <w:i/>
           <w:sz w:val="24"/>
         </w:rPr>
-        <w:t>harness</w:t>
+        <w:t xml:space="preserve">harness</w:t>
       </w:r>
       <w:r>
         <w:rPr>
@@ -1870,97 +1933,7 @@
           <w:i w:val="0"/>
           <w:sz w:val="24"/>
         </w:rPr>
-        <w:t xml:space="preserve"> é qualitativa. Quanto aos objetivos, é </w:t>
-      </w:r>
-      <w:r>
-        <w:rPr>
-          <w:rFonts w:ascii="Times New Roman" w:hAnsi="Times New Roman" w:cs="Times New Roman"/>
-          <w:b/>
-          <w:i w:val="0"/>
-          <w:sz w:val="24"/>
-        </w:rPr>
-        <w:t>exploratória</w:t>
-      </w:r>
-      <w:r>
-        <w:rPr>
-          <w:rFonts w:ascii="Times New Roman" w:hAnsi="Times New Roman" w:cs="Times New Roman"/>
-          <w:b w:val="0"/>
-          <w:i w:val="0"/>
-          <w:sz w:val="24"/>
-        </w:rPr>
-        <w:t xml:space="preserve">, porque a comparação com linhagem de </w:t>
-      </w:r>
-      <w:r>
-        <w:rPr>
-          <w:rFonts w:ascii="Times New Roman" w:hAnsi="Times New Roman" w:cs="Times New Roman"/>
-          <w:b w:val="0"/>
-          <w:i/>
-          <w:sz w:val="24"/>
-        </w:rPr>
-        <w:t>harness</w:t>
-      </w:r>
-      <w:r>
-        <w:rPr>
-          <w:rFonts w:ascii="Times New Roman" w:hAnsi="Times New Roman" w:cs="Times New Roman"/>
-          <w:b w:val="0"/>
-          <w:i w:val="0"/>
-          <w:sz w:val="24"/>
-        </w:rPr>
-        <w:t xml:space="preserve"> fixa não tem precedente publicado. Quanto aos procedimentos, é </w:t>
-      </w:r>
-      <w:r>
-        <w:rPr>
-          <w:rFonts w:ascii="Times New Roman" w:hAnsi="Times New Roman" w:cs="Times New Roman"/>
-          <w:b/>
-          <w:i w:val="0"/>
-          <w:sz w:val="24"/>
-        </w:rPr>
-        <w:t>experimental</w:t>
-      </w:r>
-      <w:r>
-        <w:rPr>
-          <w:rFonts w:ascii="Times New Roman" w:hAnsi="Times New Roman" w:cs="Times New Roman"/>
-          <w:b w:val="0"/>
-          <w:i w:val="0"/>
-          <w:sz w:val="24"/>
-        </w:rPr>
-        <w:t xml:space="preserve">: há variável independente manipulada (o </w:t>
-      </w:r>
-      <w:r>
-        <w:rPr>
-          <w:rFonts w:ascii="Times New Roman" w:hAnsi="Times New Roman" w:cs="Times New Roman"/>
-          <w:b w:val="0"/>
-          <w:i/>
-          <w:sz w:val="24"/>
-        </w:rPr>
-        <w:t>harness</w:t>
-      </w:r>
-      <w:r>
-        <w:rPr>
-          <w:rFonts w:ascii="Times New Roman" w:hAnsi="Times New Roman" w:cs="Times New Roman"/>
-          <w:b w:val="0"/>
-          <w:i w:val="0"/>
-          <w:sz w:val="24"/>
-        </w:rPr>
-        <w:t xml:space="preserve">), variáveis controladas (modelo, tarefa e limites) e um grupo de controle. Quanto ao método, é </w:t>
-      </w:r>
-      <w:r>
-        <w:rPr>
-          <w:rFonts w:ascii="Times New Roman" w:hAnsi="Times New Roman" w:cs="Times New Roman"/>
-          <w:b/>
-          <w:i w:val="0"/>
-          <w:sz w:val="24"/>
-        </w:rPr>
-        <w:t>dedutivo</w:t>
-      </w:r>
-      <w:r>
-        <w:rPr>
-          <w:rFonts w:ascii="Times New Roman" w:hAnsi="Times New Roman" w:cs="Times New Roman"/>
-          <w:b w:val="0"/>
-          <w:i w:val="0"/>
-          <w:sz w:val="24"/>
-        </w:rPr>
-        <w:t>, porque parte de hipóteses declaradas antes da coleta e as submete a teste (Gil, 2022; Prodanov; Freitas, 2013).</w:t>
+        <w:t xml:space="preserve">), variáveis controladas (modelo, tarefa e limites) e um grupo de controle. Quanto ao método, é dedutivo, porque parte de hipóteses declaradas antes da coleta e as submete a teste (Gil, 2022; Prodanov; Freitas, 2013).</w:t>
       </w:r>
     </w:p>
     <w:p>
@@ -2432,7 +2405,7 @@
           <w:i/>
           <w:sz w:val="24"/>
         </w:rPr>
-        <w:t>probe</w:t>
+        <w:t xml:space="preserve">probe</w:t>
       </w:r>
       <w:r>
         <w:rPr>
@@ -2441,7 +2414,7 @@
           <w:i w:val="0"/>
           <w:sz w:val="24"/>
         </w:rPr>
-        <w:t xml:space="preserve">, em ambiente isolado, medida em 28 de agosto de 2026, os braços diferem por uma ordem de grandeza antes que o modelo gere qualquer token (Tabela 1): com a linhagem mantida fixa, o oh-my-pi envia 11,4x os bytes totais do pi, 13,5x os bytes de esquemas de ferramenta, 10,2x os de prompt de sistema, 2,75x o número de esquemas e 13,6x os tokens. Uma medição anterior, com código independente e prompt diferente, obtivera 10,8x. A mesma execução produziu outros dois achados. Os três braços reenviam o histórico completo a cada passo, com incremento constante de 555, 625 e 698 bytes (pi, oh-my-pi e OpenCode), mas só dois o reenviam íntegro: no quinto passo, o oh-my-pi já substituiu o resultado de ferramenta mais antigo por uma referência de 54 bytes, sem que houvesse pressão de contexto. Além do custo, Liu </w:t>
+        <w:t xml:space="preserve">, em ambiente isolado, medida em 28 de agosto de 2026, os braços diferem por uma ordem de grandeza antes que o modelo gere qualquer token (Tabela 1): com a linhagem mantida fixa, o oh-my-pi envia 11,4x os bytes totais do pi, 13,5x os bytes de esquemas de ferramenta e 13,6x os tokens. A mesma execução produziu outros dois achados. Os três braços reenviam o histórico completo a cada passo, mas só dois o reenviam íntegro: no quinto passo, o oh-my-pi já substituiu o resultado de ferramenta mais antigo por uma referência de 54 bytes, sem pressão de contexto; além do custo, Liu </w:t>
       </w:r>
       <w:r>
         <w:rPr>
@@ -2450,7 +2423,7 @@
           <w:i/>
           <w:sz w:val="24"/>
         </w:rPr>
-        <w:t>et al.</w:t>
+        <w:t xml:space="preserve">et al.</w:t>
       </w:r>
       <w:r>
         <w:rPr>
@@ -2459,25 +2432,7 @@
           <w:i w:val="0"/>
           <w:sz w:val="24"/>
         </w:rPr>
-        <w:t xml:space="preserve"> (2023) medem queda de desempenho quando a informação relevante fica no meio de um contexto longo. O OpenCode gasta por sessão uma chamada auxiliar de 2.526 bytes que seria cobrada em um nível pago e não aparece no seu próprio relatório, divergência que o objetivo (6) quantifica. O delta de estado ambiente do pi nesta máquina é de 0 bytes, propriedade da máquina tanto quanto do </w:t>
-      </w:r>
-      <w:r>
-        <w:rPr>
-          <w:rFonts w:ascii="Times New Roman" w:hAnsi="Times New Roman" w:cs="Times New Roman"/>
-          <w:b w:val="0"/>
-          <w:i/>
-          <w:sz w:val="24"/>
-        </w:rPr>
-        <w:t>harness</w:t>
-      </w:r>
-      <w:r>
-        <w:rPr>
-          <w:rFonts w:ascii="Times New Roman" w:hAnsi="Times New Roman" w:cs="Times New Roman"/>
-          <w:b w:val="0"/>
-          <w:i w:val="0"/>
-          <w:sz w:val="24"/>
-        </w:rPr>
-        <w:t>, a ser remedida onde o experimento correrá.</w:t>
+        <w:t xml:space="preserve"> (2023) medem queda de desempenho quando a informação relevante fica no meio de um contexto longo. O OpenCode gasta por sessão uma chamada auxiliar de 2.526 bytes que seria cobrada em um nível pago e não aparece no seu próprio relatório, divergência que o objetivo (6) quantifica.</w:t>
       </w:r>
     </w:p>
     <w:p>
@@ -3100,7 +3055,7 @@
           <w:i/>
           <w:sz w:val="24"/>
         </w:rPr>
-        <w:t>harness</w:t>
+        <w:t xml:space="preserve">harness</w:t>
       </w:r>
       <w:r>
         <w:rPr>
@@ -3118,7 +3073,7 @@
           <w:i/>
           <w:sz w:val="24"/>
         </w:rPr>
-        <w:t>harness</w:t>
+        <w:t xml:space="preserve">harness</w:t>
       </w:r>
       <w:r>
         <w:rPr>
@@ -3127,7 +3082,7 @@
           <w:i w:val="0"/>
           <w:sz w:val="24"/>
         </w:rPr>
-        <w:t xml:space="preserve"> de ferramenta única; a comparação aqui é entre os próprios braços. O custo em dinheiro é um contrafactual de ordem de grandeza sobre tarifas pagas publicadas, rotulado como tal onde apareça. Por fim, os resultados preliminares da Camada 1 valem para uma tarefa, uma máquina e três braços, já que o controle ainda não figura na tabela, e a Camada 2 ainda não produziu resultado algum.</w:t>
+        <w:t xml:space="preserve"> de ferramenta única, e os valores em dólar citados de fontes externas vêm de outros modelos e de níveis pagos: a comparação válida aqui é entre os próprios braços. O custo em dinheiro é um contrafactual de ordem de grandeza sobre tarifas pagas publicadas, rotulado como tal onde apareça. Por fim, os resultados preliminares da Camada 1 valem para uma tarefa, uma máquina e três braços, já que o controle ainda não figura na tabela, e a Camada 2 ainda não produziu resultado algum.</w:t>
       </w:r>
     </w:p>
     <w:p>
@@ -3431,7 +3386,7 @@
           <w:i w:val="0"/>
           <w:sz w:val="24"/>
         </w:rPr>
-        <w:t>O total em dinheiro é zero, e o limite que restringe o experimento é a cota: cerca de 10 requisições a cada 6 minutos, medidas neste projeto, contra o número de requisições que uma tarefa do DeepSWE consome [A MEDIR nas tarefas-piloto]. Por isso a matriz é executada em lotes distribuídos ao longo de dias, e o custo monetário aparece apenas como contrafactual de ordem de grandeza sobre as tarifas pagas publicadas. O executor roda em docker ou modal, e este projeto usa docker (Datacurve, 2026); a GPU da estação é irrelevante para todo resultado reportado.</w:t>
+        <w:t xml:space="preserve">O total em dinheiro é zero, e o limite que restringe o experimento é a cota: cerca de 10 requisições a cada 6 minutos, medidas neste projeto, contra o número de requisições que uma tarefa do DeepSWE consome [A MEDIR nas tarefas-piloto]. Por isso a matriz é executada em lotes distribuídos ao longo de dias, e o custo monetário aparece apenas como contrafactual de ordem de grandeza sobre as tarifas pagas publicadas.</w:t>
       </w:r>
     </w:p>
     <w:p>
@@ -4694,7 +4649,7 @@
           <w:i w:val="0"/>
           <w:sz w:val="24"/>
         </w:rPr>
-        <w:t xml:space="preserve">ASSOCIAÇÃO BRASILEIRA DE NORMAS TÉCNICAS. </w:t>
+        <w:t xml:space="preserve">ALIER FORMENT, Marc; CASAÑ GUERRERO, María José; GARCÍA-PEÑALVO, Francisco José; PEREIRA, Juanan. </w:t>
       </w:r>
       <w:r>
         <w:rPr>
@@ -4703,7 +4658,7 @@
           <w:i w:val="0"/>
           <w:sz w:val="24"/>
         </w:rPr>
-        <w:t>ABNT NBR 6023</w:t>
+        <w:t xml:space="preserve">The scaffolding matters more than the interface</w:t>
       </w:r>
       <w:r>
         <w:rPr>
@@ -4712,7 +4667,25 @@
           <w:i w:val="0"/>
           <w:sz w:val="24"/>
         </w:rPr>
-        <w:t>: informação e documentação: referências: elaboração. Rio de Janeiro: ABNT, 2025a.</w:t>
+        <w:t xml:space="preserve">: a controlled comparison of MCP and CLI tool use across seven agent scaffoldings, five language models, and one software task. arXiv:2608.08654, 2026. </w:t>
+      </w:r>
+      <w:r>
+        <w:rPr>
+          <w:rFonts w:ascii="Times New Roman" w:hAnsi="Times New Roman" w:cs="Times New Roman"/>
+          <w:b w:val="0"/>
+          <w:i/>
+          <w:sz w:val="24"/>
+        </w:rPr>
+        <w:t xml:space="preserve">Preprint</w:t>
+      </w:r>
+      <w:r>
+        <w:rPr>
+          <w:rFonts w:ascii="Times New Roman" w:hAnsi="Times New Roman" w:cs="Times New Roman"/>
+          <w:b w:val="0"/>
+          <w:i w:val="0"/>
+          <w:sz w:val="24"/>
+        </w:rPr>
+        <w:t xml:space="preserve">, não revisado por pares. Disponível em: https://arxiv.org/abs/2608.08654. Acesso em: 9 set. 2026.</w:t>
       </w:r>
     </w:p>
     <w:p>
@@ -4737,7 +4710,7 @@
           <w:i w:val="0"/>
           <w:sz w:val="24"/>
         </w:rPr>
-        <w:t>ABNT NBR 10520</w:t>
+        <w:t xml:space="preserve">ABNT NBR 6023</w:t>
       </w:r>
       <w:r>
         <w:rPr>
@@ -4746,7 +4719,7 @@
           <w:i w:val="0"/>
           <w:sz w:val="24"/>
         </w:rPr>
-        <w:t>: informação e documentação: citações em documentos: apresentação. Rio de Janeiro: ABNT, 2023.</w:t>
+        <w:t xml:space="preserve">: informação e documentação: referências: elaboração. Rio de Janeiro: ABNT, 2025a.</w:t>
       </w:r>
     </w:p>
     <w:p>
@@ -4771,7 +4744,7 @@
           <w:i w:val="0"/>
           <w:sz w:val="24"/>
         </w:rPr>
-        <w:t>ABNT NBR 15287</w:t>
+        <w:t xml:space="preserve">ABNT NBR 10520</w:t>
       </w:r>
       <w:r>
         <w:rPr>
@@ -4780,7 +4753,7 @@
           <w:i w:val="0"/>
           <w:sz w:val="24"/>
         </w:rPr>
-        <w:t>: informação e documentação: projeto de pesquisa: apresentação. Rio de Janeiro: ABNT, 2025b.</w:t>
+        <w:t xml:space="preserve">: informação e documentação: citações em documentos: apresentação. Rio de Janeiro: ABNT, 2023.</w:t>
       </w:r>
     </w:p>
     <w:p>
@@ -4796,7 +4769,7 @@
           <w:i w:val="0"/>
           <w:sz w:val="24"/>
         </w:rPr>
-        <w:t xml:space="preserve">DATACURVE. </w:t>
+        <w:t xml:space="preserve">ASSOCIAÇÃO BRASILEIRA DE NORMAS TÉCNICAS. </w:t>
       </w:r>
       <w:r>
         <w:rPr>
@@ -4805,7 +4778,7 @@
           <w:i w:val="0"/>
           <w:sz w:val="24"/>
         </w:rPr>
-        <w:t>Pier</w:t>
+        <w:t xml:space="preserve">ABNT NBR 15287</w:t>
       </w:r>
       <w:r>
         <w:rPr>
@@ -4814,7 +4787,7 @@
           <w:i w:val="0"/>
           <w:sz w:val="24"/>
         </w:rPr>
-        <w:t>: a Harbor fork built for DeepSWE. 2026. Repositório de código. Disponível em: https://github.com/datacurve-ai/pier. Acesso em: 28 ago. 2026.</w:t>
+        <w:t xml:space="preserve">: informação e documentação: projeto de pesquisa: apresentação. Rio de Janeiro: ABNT, 2025b.</w:t>
       </w:r>
     </w:p>
     <w:p>
@@ -4830,7 +4803,7 @@
           <w:i w:val="0"/>
           <w:sz w:val="24"/>
         </w:rPr>
-        <w:t xml:space="preserve">EARENDIL. </w:t>
+        <w:t xml:space="preserve">DATACURVE. </w:t>
       </w:r>
       <w:r>
         <w:rPr>
@@ -4839,7 +4812,7 @@
           <w:i w:val="0"/>
           <w:sz w:val="24"/>
         </w:rPr>
-        <w:t>Pi, minimal and performant</w:t>
+        <w:t xml:space="preserve">Pier</w:t>
       </w:r>
       <w:r>
         <w:rPr>
@@ -4848,7 +4821,7 @@
           <w:i w:val="0"/>
           <w:sz w:val="24"/>
         </w:rPr>
-        <w:t>. 2026. Publicação de blogue institucional. Disponível em: https://earendil.com/posts/pi-autoresearch-and-databricks/. Acesso em: 28 ago. 2026.</w:t>
+        <w:t xml:space="preserve">: a Harbor fork built for DeepSWE. 2026. Repositório de código. Disponível em: https://github.com/datacurve-ai/pier. Acesso em: 28 ago. 2026.</w:t>
       </w:r>
     </w:p>
     <w:p>
@@ -4864,7 +4837,7 @@
           <w:i w:val="0"/>
           <w:sz w:val="24"/>
         </w:rPr>
-        <w:t xml:space="preserve">GIL, Antonio Carlos. </w:t>
+        <w:t xml:space="preserve">EARENDIL. </w:t>
       </w:r>
       <w:r>
         <w:rPr>
@@ -4873,7 +4846,7 @@
           <w:i w:val="0"/>
           <w:sz w:val="24"/>
         </w:rPr>
-        <w:t>Como elaborar projetos de pesquisa</w:t>
+        <w:t xml:space="preserve">Pi, minimal and performant</w:t>
       </w:r>
       <w:r>
         <w:rPr>
@@ -4882,7 +4855,7 @@
           <w:i w:val="0"/>
           <w:sz w:val="24"/>
         </w:rPr>
-        <w:t>. 7. ed. São Paulo: Atlas, 2022.</w:t>
+        <w:t xml:space="preserve">. 2026. Publicação de blogue institucional. Disponível em: https://earendil.com/posts/pi-autoresearch-and-databricks/. Acesso em: 28 ago. 2026.</w:t>
       </w:r>
     </w:p>
     <w:p>
@@ -4898,7 +4871,7 @@
           <w:i w:val="0"/>
           <w:sz w:val="24"/>
         </w:rPr>
-        <w:t xml:space="preserve">HARNESSRANK. </w:t>
+        <w:t xml:space="preserve">FRONTIER-HARNESS-EVAL. </w:t>
       </w:r>
       <w:r>
         <w:rPr>
@@ -4907,7 +4880,7 @@
           <w:i w:val="0"/>
           <w:sz w:val="24"/>
         </w:rPr>
-        <w:t>HarnessRank</w:t>
+        <w:t xml:space="preserve">FrontierHarness eval</w:t>
       </w:r>
       <w:r>
         <w:rPr>
@@ -4916,7 +4889,7 @@
           <w:i w:val="0"/>
           <w:sz w:val="24"/>
         </w:rPr>
-        <w:t>: coding-agent harness rankings. 2026. Disponível em: https://harnessrank.net/. Acesso em: 28 ago. 2026.</w:t>
+        <w:t xml:space="preserve">: tarefas, executor e resultados normalizados. 2026. Repositório de código. Disponível em: https://github.com/frontier-harness-eval/eval. Acesso em: 9 set. 2026.</w:t>
       </w:r>
     </w:p>
     <w:p>
@@ -4932,7 +4905,7 @@
           <w:i w:val="0"/>
           <w:sz w:val="24"/>
         </w:rPr>
-        <w:t xml:space="preserve">HUANG, Wenqi; LEE, Charley; TNG, Leonard; GE, Serena. </w:t>
+        <w:t xml:space="preserve">GIL, Antonio Carlos. </w:t>
       </w:r>
       <w:r>
         <w:rPr>
@@ -4941,7 +4914,7 @@
           <w:i w:val="0"/>
           <w:sz w:val="24"/>
         </w:rPr>
-        <w:t>DeepSWE</w:t>
+        <w:t xml:space="preserve">Como elaborar projetos de pesquisa</w:t>
       </w:r>
       <w:r>
         <w:rPr>
@@ -4950,25 +4923,7 @@
           <w:i w:val="0"/>
           <w:sz w:val="24"/>
         </w:rPr>
-        <w:t xml:space="preserve">: measuring frontier coding agents on original, long-horizon engineering tasks. arXiv:2607.07946, 2026. </w:t>
-      </w:r>
-      <w:r>
-        <w:rPr>
-          <w:rFonts w:ascii="Times New Roman" w:hAnsi="Times New Roman" w:cs="Times New Roman"/>
-          <w:b w:val="0"/>
-          <w:i/>
-          <w:sz w:val="24"/>
-        </w:rPr>
-        <w:t>Preprint</w:t>
-      </w:r>
-      <w:r>
-        <w:rPr>
-          <w:rFonts w:ascii="Times New Roman" w:hAnsi="Times New Roman" w:cs="Times New Roman"/>
-          <w:b w:val="0"/>
-          <w:i w:val="0"/>
-          <w:sz w:val="24"/>
-        </w:rPr>
-        <w:t>, não revisado por pares. Disponível em: https://arxiv.org/abs/2607.07946. Acesso em: 28 ago. 2026.</w:t>
+        <w:t xml:space="preserve">. 7. ed. São Paulo: Atlas, 2022.</w:t>
       </w:r>
     </w:p>
     <w:p>
@@ -4984,7 +4939,7 @@
           <w:i w:val="0"/>
           <w:sz w:val="24"/>
         </w:rPr>
-        <w:t xml:space="preserve">INSTITUTO FEDERAL DE EDUCAÇÃO, CIÊNCIA E TECNOLOGIA DE MATO GROSSO. </w:t>
+        <w:t xml:space="preserve">HARNESSRANK. </w:t>
       </w:r>
       <w:r>
         <w:rPr>
@@ -4993,7 +4948,7 @@
           <w:i w:val="0"/>
           <w:sz w:val="24"/>
         </w:rPr>
-        <w:t>Normas básicas e padrões para a elaboração do Projeto de Conclusão de Curso (PCC)</w:t>
+        <w:t xml:space="preserve">HarnessRank</w:t>
       </w:r>
       <w:r>
         <w:rPr>
@@ -5002,7 +4957,7 @@
           <w:i w:val="0"/>
           <w:sz w:val="24"/>
         </w:rPr>
-        <w:t>. Cuiabá: Campus Octayde Jorge da Silva, Departamento de Área de Informática, 2022.</w:t>
+        <w:t xml:space="preserve">: coding-agent harness rankings. 2026. Disponível em: https://harnessrank.net/. Acesso em: 28 ago. 2026.</w:t>
       </w:r>
     </w:p>
     <w:p>
@@ -5018,7 +4973,7 @@
           <w:i w:val="0"/>
           <w:sz w:val="24"/>
         </w:rPr>
-        <w:t xml:space="preserve">JIMENEZ, Carlos E.; YANG, John; WETTIG, Alexander; YAO, Shunyu; PEI, Kexin; PRESS, Ofir; NARASIMHAN, Karthik. </w:t>
+        <w:t xml:space="preserve">HUANG, Wenqi; LEE, Charley; TNG, Leonard; GE, Serena. </w:t>
       </w:r>
       <w:r>
         <w:rPr>
@@ -5027,7 +4982,7 @@
           <w:i w:val="0"/>
           <w:sz w:val="24"/>
         </w:rPr>
-        <w:t>SWE-bench</w:t>
+        <w:t xml:space="preserve">DeepSWE</w:t>
       </w:r>
       <w:r>
         <w:rPr>
@@ -5036,7 +4991,25 @@
           <w:i w:val="0"/>
           <w:sz w:val="24"/>
         </w:rPr>
-        <w:t>: can language models resolve real-world GitHub issues? arXiv:2310.06770, 2023. Trabalho apresentado na International Conference on Learning Representations (ICLR), 2024. Disponível em: https://arxiv.org/abs/2310.06770. Acesso em: 28 ago. 2026.</w:t>
+        <w:t xml:space="preserve">: measuring frontier coding agents on original, long-horizon engineering tasks. arXiv:2607.07946, 2026. </w:t>
+      </w:r>
+      <w:r>
+        <w:rPr>
+          <w:rFonts w:ascii="Times New Roman" w:hAnsi="Times New Roman" w:cs="Times New Roman"/>
+          <w:b w:val="0"/>
+          <w:i/>
+          <w:sz w:val="24"/>
+        </w:rPr>
+        <w:t xml:space="preserve">Preprint</w:t>
+      </w:r>
+      <w:r>
+        <w:rPr>
+          <w:rFonts w:ascii="Times New Roman" w:hAnsi="Times New Roman" w:cs="Times New Roman"/>
+          <w:b w:val="0"/>
+          <w:i w:val="0"/>
+          <w:sz w:val="24"/>
+        </w:rPr>
+        <w:t xml:space="preserve">, não revisado por pares. Disponível em: https://arxiv.org/abs/2607.07946. Acesso em: 28 ago. 2026.</w:t>
       </w:r>
     </w:p>
     <w:p>
@@ -5052,7 +5025,7 @@
           <w:i w:val="0"/>
           <w:sz w:val="24"/>
         </w:rPr>
-        <w:t xml:space="preserve">KAPOOR, Sayash; STROEBL, Benedikt; SIEGEL, Zachary S.; NADGIR, Nitya; NARAYANAN, Arvind. </w:t>
+        <w:t xml:space="preserve">INSTITUTO FEDERAL DE EDUCAÇÃO, CIÊNCIA E TECNOLOGIA DE MATO GROSSO. </w:t>
       </w:r>
       <w:r>
         <w:rPr>
@@ -5061,7 +5034,7 @@
           <w:i w:val="0"/>
           <w:sz w:val="24"/>
         </w:rPr>
-        <w:t>AI agents that matter</w:t>
+        <w:t xml:space="preserve">Normas básicas e padrões para a elaboração do Projeto de Conclusão de Curso (PCC)</w:t>
       </w:r>
       <w:r>
         <w:rPr>
@@ -5070,25 +5043,7 @@
           <w:i w:val="0"/>
           <w:sz w:val="24"/>
         </w:rPr>
-        <w:t xml:space="preserve">. arXiv:2407.01502, 2024. </w:t>
-      </w:r>
-      <w:r>
-        <w:rPr>
-          <w:rFonts w:ascii="Times New Roman" w:hAnsi="Times New Roman" w:cs="Times New Roman"/>
-          <w:b w:val="0"/>
-          <w:i/>
-          <w:sz w:val="24"/>
-        </w:rPr>
-        <w:t>Preprint</w:t>
-      </w:r>
-      <w:r>
-        <w:rPr>
-          <w:rFonts w:ascii="Times New Roman" w:hAnsi="Times New Roman" w:cs="Times New Roman"/>
-          <w:b w:val="0"/>
-          <w:i w:val="0"/>
-          <w:sz w:val="24"/>
-        </w:rPr>
-        <w:t>, não revisado por pares. Disponível em: https://arxiv.org/abs/2407.01502. Acesso em: 28 ago. 2026.</w:t>
+        <w:t xml:space="preserve">. Cuiabá: Campus Octayde Jorge da Silva, Departamento de Área de Informática, 2022.</w:t>
       </w:r>
     </w:p>
     <w:p>
@@ -5104,16 +5059,16 @@
           <w:i w:val="0"/>
           <w:sz w:val="24"/>
         </w:rPr>
-        <w:t xml:space="preserve">KAPOOR, Sayash </w:t>
-      </w:r>
-      <w:r>
-        <w:rPr>
-          <w:rFonts w:ascii="Times New Roman" w:hAnsi="Times New Roman" w:cs="Times New Roman"/>
-          <w:b w:val="0"/>
-          <w:i/>
-          <w:sz w:val="24"/>
-        </w:rPr>
-        <w:t>et al.</w:t>
+        <w:t xml:space="preserve">JIMENEZ, Carlos E.; YANG, John; WETTIG, Alexander; YAO, Shunyu; PEI, Kexin; PRESS, Ofir; NARASIMHAN, Karthik. </w:t>
+      </w:r>
+      <w:r>
+        <w:rPr>
+          <w:rFonts w:ascii="Times New Roman" w:hAnsi="Times New Roman" w:cs="Times New Roman"/>
+          <w:b/>
+          <w:i w:val="0"/>
+          <w:sz w:val="24"/>
+        </w:rPr>
+        <w:t xml:space="preserve">SWE-bench</w:t>
       </w:r>
       <w:r>
         <w:rPr>
@@ -5122,43 +5077,7 @@
           <w:i w:val="0"/>
           <w:sz w:val="24"/>
         </w:rPr>
-        <w:t xml:space="preserve"> </w:t>
-      </w:r>
-      <w:r>
-        <w:rPr>
-          <w:rFonts w:ascii="Times New Roman" w:hAnsi="Times New Roman" w:cs="Times New Roman"/>
-          <w:b/>
-          <w:i w:val="0"/>
-          <w:sz w:val="24"/>
-        </w:rPr>
-        <w:t>Holistic Agent Leaderboard</w:t>
-      </w:r>
-      <w:r>
-        <w:rPr>
-          <w:rFonts w:ascii="Times New Roman" w:hAnsi="Times New Roman" w:cs="Times New Roman"/>
-          <w:b w:val="0"/>
-          <w:i w:val="0"/>
-          <w:sz w:val="24"/>
-        </w:rPr>
-        <w:t xml:space="preserve">: the missing infrastructure for AI agent evaluation. arXiv:2510.11977, 2025. </w:t>
-      </w:r>
-      <w:r>
-        <w:rPr>
-          <w:rFonts w:ascii="Times New Roman" w:hAnsi="Times New Roman" w:cs="Times New Roman"/>
-          <w:b w:val="0"/>
-          <w:i/>
-          <w:sz w:val="24"/>
-        </w:rPr>
-        <w:t>Preprint</w:t>
-      </w:r>
-      <w:r>
-        <w:rPr>
-          <w:rFonts w:ascii="Times New Roman" w:hAnsi="Times New Roman" w:cs="Times New Roman"/>
-          <w:b w:val="0"/>
-          <w:i w:val="0"/>
-          <w:sz w:val="24"/>
-        </w:rPr>
-        <w:t>, não revisado por pares. Disponível em: https://arxiv.org/abs/2510.11977. Acesso em: 28 ago. 2026.</w:t>
+        <w:t xml:space="preserve">: can language models resolve real-world GitHub issues? arXiv:2310.06770, 2023. Trabalho apresentado na International Conference on Learning Representations (ICLR), 2024. Disponível em: https://arxiv.org/abs/2310.06770. Acesso em: 28 ago. 2026.</w:t>
       </w:r>
     </w:p>
     <w:p>
@@ -5174,7 +5093,7 @@
           <w:i w:val="0"/>
           <w:sz w:val="24"/>
         </w:rPr>
-        <w:t xml:space="preserve">LIN, Jiahang; LIU, Shichun; PAN, Chengjun; LIN, Lizhi; DOU, Shihan; XI, Zhiheng; HUANG, Xuanjing; YAN, Hang; HAN, Zhenhua; GUI, Tao; JIANG, Yu-Gang. </w:t>
+        <w:t xml:space="preserve">KAPOOR, Sayash; STROEBL, Benedikt; SIEGEL, Zachary S.; NADGIR, Nitya; NARAYANAN, Arvind. </w:t>
       </w:r>
       <w:r>
         <w:rPr>
@@ -5183,7 +5102,7 @@
           <w:i w:val="0"/>
           <w:sz w:val="24"/>
         </w:rPr>
-        <w:t>Agentic harness engineering</w:t>
+        <w:t xml:space="preserve">AI agents that matter</w:t>
       </w:r>
       <w:r>
         <w:rPr>
@@ -5192,7 +5111,7 @@
           <w:i w:val="0"/>
           <w:sz w:val="24"/>
         </w:rPr>
-        <w:t xml:space="preserve">: observability-driven automatic evolution of coding-agent harnesses. arXiv:2604.25850, 2026. </w:t>
+        <w:t xml:space="preserve">. arXiv:2407.01502, 2024. </w:t>
       </w:r>
       <w:r>
         <w:rPr>
@@ -5201,7 +5120,7 @@
           <w:i/>
           <w:sz w:val="24"/>
         </w:rPr>
-        <w:t>Preprint</w:t>
+        <w:t xml:space="preserve">Preprint</w:t>
       </w:r>
       <w:r>
         <w:rPr>
@@ -5210,7 +5129,7 @@
           <w:i w:val="0"/>
           <w:sz w:val="24"/>
         </w:rPr>
-        <w:t>, não revisado por pares. Disponível em: https://arxiv.org/abs/2604.25850. Acesso em: 28 ago. 2026.</w:t>
+        <w:t xml:space="preserve">, não revisado por pares. Disponível em: https://arxiv.org/abs/2407.01502. Acesso em: 28 ago. 2026.</w:t>
       </w:r>
     </w:p>
     <w:p>
@@ -5226,7 +5145,25 @@
           <w:i w:val="0"/>
           <w:sz w:val="24"/>
         </w:rPr>
-        <w:t xml:space="preserve">LIU, Nelson F.; LIN, Kevin; HEWITT, John; PARANJAPE, Ashwin; BEVILACQUA, Michele; PETRONI, Fabio; LIANG, Percy. </w:t>
+        <w:t xml:space="preserve">KAPOOR, Sayash </w:t>
+      </w:r>
+      <w:r>
+        <w:rPr>
+          <w:rFonts w:ascii="Times New Roman" w:hAnsi="Times New Roman" w:cs="Times New Roman"/>
+          <w:b w:val="0"/>
+          <w:i/>
+          <w:sz w:val="24"/>
+        </w:rPr>
+        <w:t xml:space="preserve">et al.</w:t>
+      </w:r>
+      <w:r>
+        <w:rPr>
+          <w:rFonts w:ascii="Times New Roman" w:hAnsi="Times New Roman" w:cs="Times New Roman"/>
+          <w:b w:val="0"/>
+          <w:i w:val="0"/>
+          <w:sz w:val="24"/>
+        </w:rPr>
+        <w:t xml:space="preserve"> </w:t>
       </w:r>
       <w:r>
         <w:rPr>
@@ -5235,7 +5172,7 @@
           <w:i w:val="0"/>
           <w:sz w:val="24"/>
         </w:rPr>
-        <w:t>Lost in the middle</w:t>
+        <w:t xml:space="preserve">Holistic Agent Leaderboard</w:t>
       </w:r>
       <w:r>
         <w:rPr>
@@ -5244,7 +5181,25 @@
           <w:i w:val="0"/>
           <w:sz w:val="24"/>
         </w:rPr>
-        <w:t>: how language models use long contexts. arXiv:2307.03172, 2023. Publicado em Transactions of the Association for Computational Linguistics (TACL). Disponível em: https://arxiv.org/abs/2307.03172. Acesso em: 28 ago. 2026.</w:t>
+        <w:t xml:space="preserve">: the missing infrastructure for AI agent evaluation. arXiv:2510.11977, 2025. </w:t>
+      </w:r>
+      <w:r>
+        <w:rPr>
+          <w:rFonts w:ascii="Times New Roman" w:hAnsi="Times New Roman" w:cs="Times New Roman"/>
+          <w:b w:val="0"/>
+          <w:i/>
+          <w:sz w:val="24"/>
+        </w:rPr>
+        <w:t xml:space="preserve">Preprint</w:t>
+      </w:r>
+      <w:r>
+        <w:rPr>
+          <w:rFonts w:ascii="Times New Roman" w:hAnsi="Times New Roman" w:cs="Times New Roman"/>
+          <w:b w:val="0"/>
+          <w:i w:val="0"/>
+          <w:sz w:val="24"/>
+        </w:rPr>
+        <w:t xml:space="preserve">, não revisado por pares. Disponível em: https://arxiv.org/abs/2510.11977. Acesso em: 28 ago. 2026.</w:t>
       </w:r>
     </w:p>
     <w:p>
@@ -5260,7 +5215,7 @@
           <w:i w:val="0"/>
           <w:sz w:val="24"/>
         </w:rPr>
-        <w:t xml:space="preserve">MILLER, Evan. </w:t>
+        <w:t xml:space="preserve">LEE, Yoonho; NAIR, Roshen; ZHANG, Qizheng; LEE, Kangwook; KHATTAB, Omar; FINN, Chelsea. </w:t>
       </w:r>
       <w:r>
         <w:rPr>
@@ -5269,7 +5224,7 @@
           <w:i w:val="0"/>
           <w:sz w:val="24"/>
         </w:rPr>
-        <w:t>Adding error bars to evals</w:t>
+        <w:t xml:space="preserve">Meta-Harness</w:t>
       </w:r>
       <w:r>
         <w:rPr>
@@ -5278,7 +5233,7 @@
           <w:i w:val="0"/>
           <w:sz w:val="24"/>
         </w:rPr>
-        <w:t xml:space="preserve">: a statistical approach to language model evaluations. arXiv:2411.00640, 2024. </w:t>
+        <w:t xml:space="preserve">: end-to-end optimization of model harnesses. arXiv:2603.28052, 2026. </w:t>
       </w:r>
       <w:r>
         <w:rPr>
@@ -5287,7 +5242,7 @@
           <w:i/>
           <w:sz w:val="24"/>
         </w:rPr>
-        <w:t>Preprint</w:t>
+        <w:t xml:space="preserve">Preprint</w:t>
       </w:r>
       <w:r>
         <w:rPr>
@@ -5296,7 +5251,7 @@
           <w:i w:val="0"/>
           <w:sz w:val="24"/>
         </w:rPr>
-        <w:t>, não revisado por pares. Disponível em: https://arxiv.org/abs/2411.00640. Acesso em: 28 ago. 2026.</w:t>
+        <w:t xml:space="preserve">, não revisado por pares. Disponível em: https://arxiv.org/abs/2603.28052. Acesso em: 9 set. 2026.</w:t>
       </w:r>
     </w:p>
     <w:p>
@@ -5312,7 +5267,25 @@
           <w:i w:val="0"/>
           <w:sz w:val="24"/>
         </w:rPr>
-        <w:t xml:space="preserve">NING, Xuying </w:t>
+        <w:t xml:space="preserve">LIN, Jiahang; LIU, Shichun; PAN, Chengjun; LIN, Lizhi; DOU, Shihan; XI, Zhiheng; HUANG, Xuanjing; YAN, Hang; HAN, Zhenhua; GUI, Tao; JIANG, Yu-Gang. </w:t>
+      </w:r>
+      <w:r>
+        <w:rPr>
+          <w:rFonts w:ascii="Times New Roman" w:hAnsi="Times New Roman" w:cs="Times New Roman"/>
+          <w:b/>
+          <w:i w:val="0"/>
+          <w:sz w:val="24"/>
+        </w:rPr>
+        <w:t xml:space="preserve">Agentic harness engineering</w:t>
+      </w:r>
+      <w:r>
+        <w:rPr>
+          <w:rFonts w:ascii="Times New Roman" w:hAnsi="Times New Roman" w:cs="Times New Roman"/>
+          <w:b w:val="0"/>
+          <w:i w:val="0"/>
+          <w:sz w:val="24"/>
+        </w:rPr>
+        <w:t xml:space="preserve">: observability-driven automatic evolution of coding-agent harnesses. arXiv:2604.25850, 2026. </w:t>
       </w:r>
       <w:r>
         <w:rPr>
@@ -5321,7 +5294,7 @@
           <w:i/>
           <w:sz w:val="24"/>
         </w:rPr>
-        <w:t>et al.</w:t>
+        <w:t xml:space="preserve">Preprint</w:t>
       </w:r>
       <w:r>
         <w:rPr>
@@ -5330,43 +5303,7 @@
           <w:i w:val="0"/>
           <w:sz w:val="24"/>
         </w:rPr>
-        <w:t xml:space="preserve"> </w:t>
-      </w:r>
-      <w:r>
-        <w:rPr>
-          <w:rFonts w:ascii="Times New Roman" w:hAnsi="Times New Roman" w:cs="Times New Roman"/>
-          <w:b/>
-          <w:i w:val="0"/>
-          <w:sz w:val="24"/>
-        </w:rPr>
-        <w:t>Code as agent harness</w:t>
-      </w:r>
-      <w:r>
-        <w:rPr>
-          <w:rFonts w:ascii="Times New Roman" w:hAnsi="Times New Roman" w:cs="Times New Roman"/>
-          <w:b w:val="0"/>
-          <w:i w:val="0"/>
-          <w:sz w:val="24"/>
-        </w:rPr>
-        <w:t xml:space="preserve">. arXiv:2605.18747, 2026. </w:t>
-      </w:r>
-      <w:r>
-        <w:rPr>
-          <w:rFonts w:ascii="Times New Roman" w:hAnsi="Times New Roman" w:cs="Times New Roman"/>
-          <w:b w:val="0"/>
-          <w:i/>
-          <w:sz w:val="24"/>
-        </w:rPr>
-        <w:t>Preprint</w:t>
-      </w:r>
-      <w:r>
-        <w:rPr>
-          <w:rFonts w:ascii="Times New Roman" w:hAnsi="Times New Roman" w:cs="Times New Roman"/>
-          <w:b w:val="0"/>
-          <w:i w:val="0"/>
-          <w:sz w:val="24"/>
-        </w:rPr>
-        <w:t>, não revisado por pares. Disponível em: https://arxiv.org/abs/2605.18747. Acesso em: 28 ago. 2026.</w:t>
+        <w:t xml:space="preserve">, não revisado por pares. Disponível em: https://arxiv.org/abs/2604.25850. Acesso em: 28 ago. 2026.</w:t>
       </w:r>
     </w:p>
     <w:p>
@@ -5382,7 +5319,7 @@
           <w:i w:val="0"/>
           <w:sz w:val="24"/>
         </w:rPr>
-        <w:t xml:space="preserve">OPENCODE. </w:t>
+        <w:t xml:space="preserve">LIU, Nelson F.; LIN, Kevin; HEWITT, John; PARANJAPE, Ashwin; BEVILACQUA, Michele; PETRONI, Fabio; LIANG, Percy. </w:t>
       </w:r>
       <w:r>
         <w:rPr>
@@ -5391,7 +5328,7 @@
           <w:i w:val="0"/>
           <w:sz w:val="24"/>
         </w:rPr>
-        <w:t>Zen</w:t>
+        <w:t xml:space="preserve">Lost in the middle</w:t>
       </w:r>
       <w:r>
         <w:rPr>
@@ -5400,7 +5337,7 @@
           <w:i w:val="0"/>
           <w:sz w:val="24"/>
         </w:rPr>
-        <w:t>. 2026. Documentação do produto. Disponível em: https://opencode.ai/docs/zen/. Acesso em: 28 ago. 2026.</w:t>
+        <w:t xml:space="preserve">: how language models use long contexts. arXiv:2307.03172, 2023. Publicado em Transactions of the Association for Computational Linguistics (TACL). Disponível em: https://arxiv.org/abs/2307.03172. Acesso em: 28 ago. 2026.</w:t>
       </w:r>
     </w:p>
     <w:p>
@@ -5416,7 +5353,7 @@
           <w:i w:val="0"/>
           <w:sz w:val="24"/>
         </w:rPr>
-        <w:t xml:space="preserve">PRODANOV, Cleber Cristiano; FREITAS, Ernani Cesar de. </w:t>
+        <w:t xml:space="preserve">MILLER, Evan. </w:t>
       </w:r>
       <w:r>
         <w:rPr>
@@ -5425,7 +5362,7 @@
           <w:i w:val="0"/>
           <w:sz w:val="24"/>
         </w:rPr>
-        <w:t>Metodologia do trabalho científico</w:t>
+        <w:t xml:space="preserve">Adding error bars to evals</w:t>
       </w:r>
       <w:r>
         <w:rPr>
@@ -5434,7 +5371,25 @@
           <w:i w:val="0"/>
           <w:sz w:val="24"/>
         </w:rPr>
-        <w:t>: métodos e técnicas da pesquisa e do trabalho acadêmico. 2. ed. Novo Hamburgo: Feevale, 2013. Disponível em: https://www.feevale.br/Comum/midias/0163c988-1f5d-496f-b118-a6e009a7a2f9/E-book%20Metodologia%20do%20Trabalho%20Cientifico.pdf. Acesso em: 28 ago. 2026.</w:t>
+        <w:t xml:space="preserve">: a statistical approach to language model evaluations. arXiv:2411.00640, 2024. </w:t>
+      </w:r>
+      <w:r>
+        <w:rPr>
+          <w:rFonts w:ascii="Times New Roman" w:hAnsi="Times New Roman" w:cs="Times New Roman"/>
+          <w:b w:val="0"/>
+          <w:i/>
+          <w:sz w:val="24"/>
+        </w:rPr>
+        <w:t xml:space="preserve">Preprint</w:t>
+      </w:r>
+      <w:r>
+        <w:rPr>
+          <w:rFonts w:ascii="Times New Roman" w:hAnsi="Times New Roman" w:cs="Times New Roman"/>
+          <w:b w:val="0"/>
+          <w:i w:val="0"/>
+          <w:sz w:val="24"/>
+        </w:rPr>
+        <w:t xml:space="preserve">, não revisado por pares. Disponível em: https://arxiv.org/abs/2411.00640. Acesso em: 28 ago. 2026.</w:t>
       </w:r>
     </w:p>
     <w:p>
@@ -5450,7 +5405,25 @@
           <w:i w:val="0"/>
           <w:sz w:val="24"/>
         </w:rPr>
-        <w:t xml:space="preserve">YANG, John; JIMENEZ, Carlos E.; WETTIG, Alexander; LIERET, Kilian; YAO, Shunyu; NARASIMHAN, Karthik; PRESS, Ofir. </w:t>
+        <w:t xml:space="preserve">NING, Xuying </w:t>
+      </w:r>
+      <w:r>
+        <w:rPr>
+          <w:rFonts w:ascii="Times New Roman" w:hAnsi="Times New Roman" w:cs="Times New Roman"/>
+          <w:b w:val="0"/>
+          <w:i/>
+          <w:sz w:val="24"/>
+        </w:rPr>
+        <w:t xml:space="preserve">et al.</w:t>
+      </w:r>
+      <w:r>
+        <w:rPr>
+          <w:rFonts w:ascii="Times New Roman" w:hAnsi="Times New Roman" w:cs="Times New Roman"/>
+          <w:b w:val="0"/>
+          <w:i w:val="0"/>
+          <w:sz w:val="24"/>
+        </w:rPr>
+        <w:t xml:space="preserve"> </w:t>
       </w:r>
       <w:r>
         <w:rPr>
@@ -5459,7 +5432,7 @@
           <w:i w:val="0"/>
           <w:sz w:val="24"/>
         </w:rPr>
-        <w:t>SWE-agent</w:t>
+        <w:t xml:space="preserve">Code as agent harness</w:t>
       </w:r>
       <w:r>
         <w:rPr>
@@ -5468,7 +5441,25 @@
           <w:i w:val="0"/>
           <w:sz w:val="24"/>
         </w:rPr>
-        <w:t>: agent-computer interfaces enable automated software engineering. arXiv:2405.15793, 2024. Trabalho apresentado na Conference on Neural Information Processing Systems (NeurIPS), 2024. Disponível em: https://arxiv.org/abs/2405.15793. Acesso em: 28 ago. 2026.</w:t>
+        <w:t xml:space="preserve">. arXiv:2605.18747, 2026. </w:t>
+      </w:r>
+      <w:r>
+        <w:rPr>
+          <w:rFonts w:ascii="Times New Roman" w:hAnsi="Times New Roman" w:cs="Times New Roman"/>
+          <w:b w:val="0"/>
+          <w:i/>
+          <w:sz w:val="24"/>
+        </w:rPr>
+        <w:t xml:space="preserve">Preprint</w:t>
+      </w:r>
+      <w:r>
+        <w:rPr>
+          <w:rFonts w:ascii="Times New Roman" w:hAnsi="Times New Roman" w:cs="Times New Roman"/>
+          <w:b w:val="0"/>
+          <w:i w:val="0"/>
+          <w:sz w:val="24"/>
+        </w:rPr>
+        <w:t xml:space="preserve">, não revisado por pares. Disponível em: https://arxiv.org/abs/2605.18747. Acesso em: 28 ago. 2026.</w:t>
       </w:r>
     </w:p>
     <w:p>
@@ -5484,7 +5475,7 @@
           <w:i w:val="0"/>
           <w:sz w:val="24"/>
         </w:rPr>
-        <w:t xml:space="preserve">YAO, Shunyu; ZHAO, Jeffrey; YU, Dian; DU, Nan; SHAFRAN, Izhak; NARASIMHAN, Karthik; CAO, Yuan. </w:t>
+        <w:t xml:space="preserve">OPENCODE. </w:t>
       </w:r>
       <w:r>
         <w:rPr>
@@ -5493,7 +5484,7 @@
           <w:i w:val="0"/>
           <w:sz w:val="24"/>
         </w:rPr>
-        <w:t>ReAct</w:t>
+        <w:t xml:space="preserve">Zen</w:t>
       </w:r>
       <w:r>
         <w:rPr>
@@ -5502,7 +5493,7 @@
           <w:i w:val="0"/>
           <w:sz w:val="24"/>
         </w:rPr>
-        <w:t>: synergizing reasoning and acting in language models. arXiv:2210.03629, 2022. Trabalho apresentado na International Conference on Learning Representations (ICLR), 2023. Disponível em: https://arxiv.org/abs/2210.03629. Acesso em: 28 ago. 2026.</w:t>
+        <w:t xml:space="preserve">. 2026. Documentação do produto. Disponível em: https://opencode.ai/docs/zen/. Acesso em: 28 ago. 2026.</w:t>
       </w:r>
     </w:p>
     <w:p>
@@ -5518,7 +5509,7 @@
           <w:i w:val="0"/>
           <w:sz w:val="24"/>
         </w:rPr>
-        <w:t xml:space="preserve">YUUKIFST. </w:t>
+        <w:t xml:space="preserve">PRODANOV, Cleber Cristiano; FREITAS, Ernani Cesar de. </w:t>
       </w:r>
       <w:r>
         <w:rPr>
@@ -5527,7 +5518,7 @@
           <w:i w:val="0"/>
           <w:sz w:val="24"/>
         </w:rPr>
-        <w:t>harness-bench</w:t>
+        <w:t xml:space="preserve">Metodologia do trabalho científico</w:t>
       </w:r>
       <w:r>
         <w:rPr>
@@ -5536,7 +5527,7 @@
           <w:i w:val="0"/>
           <w:sz w:val="24"/>
         </w:rPr>
-        <w:t>: runner, dados brutos e scripts de análise deste projeto. 2026. Repositório de código. Disponível em: https://github.com/YuukiFST/harness-bench. Acesso em: 28 ago. 2026.</w:t>
+        <w:t xml:space="preserve">: métodos e técnicas da pesquisa e do trabalho acadêmico. 2. ed. Novo Hamburgo: Feevale, 2013. Disponível em: https://www.feevale.br/Comum/midias/0163c988-1f5d-496f-b118-a6e009a7a2f9/E-book%20Metodologia%20do%20Trabalho%20Cientifico.pdf. Acesso em: 28 ago. 2026.</w:t>
       </w:r>
     </w:p>
     <w:p>
@@ -5552,7 +5543,7 @@
           <w:i w:val="0"/>
           <w:sz w:val="24"/>
         </w:rPr>
-        <w:t xml:space="preserve">ZHANG, Yunbei; WANG, Janet; GE, Yingqiang; XU, Weijie; HAMM, Jihun; REDDY, Chandan K. </w:t>
+        <w:t xml:space="preserve">RUNTA. </w:t>
       </w:r>
       <w:r>
         <w:rPr>
@@ -5561,7 +5552,7 @@
           <w:i w:val="0"/>
           <w:sz w:val="24"/>
         </w:rPr>
-        <w:t>Stop comparing LLM agents without disclosing the harness</w:t>
+        <w:t xml:space="preserve">Introducing the FrontierHarness eval</w:t>
       </w:r>
       <w:r>
         <w:rPr>
@@ -5570,7 +5561,23 @@
           <w:i w:val="0"/>
           <w:sz w:val="24"/>
         </w:rPr>
-        <w:t xml:space="preserve">. arXiv:2605.23950, 2026. </w:t>
+        <w:t xml:space="preserve">. 2026. Publicação de blogue institucional. Disponível em: https://runta.com/blog/introducing-frontierharness-eval/. Acesso em: 9 set. 2026.</w:t>
+      </w:r>
+    </w:p>
+    <w:p>
+      <w:pPr>
+        <w:spacing w:line="240" w:lineRule="auto" w:before="0" w:after="240"/>
+        <w:ind w:firstLine="0"/>
+        <w:jc w:val="left"/>
+      </w:pPr>
+      <w:r>
+        <w:rPr>
+          <w:rFonts w:ascii="Times New Roman" w:hAnsi="Times New Roman" w:cs="Times New Roman"/>
+          <w:b w:val="0"/>
+          <w:i w:val="0"/>
+          <w:sz w:val="24"/>
+        </w:rPr>
+        <w:t xml:space="preserve">WANG, Ruhan </w:t>
       </w:r>
       <w:r>
         <w:rPr>
@@ -5579,7 +5586,7 @@
           <w:i/>
           <w:sz w:val="24"/>
         </w:rPr>
-        <w:t>Preprint</w:t>
+        <w:t xml:space="preserve">et al.</w:t>
       </w:r>
       <w:r>
         <w:rPr>
@@ -5588,7 +5595,197 @@
           <w:i w:val="0"/>
           <w:sz w:val="24"/>
         </w:rPr>
-        <w:t>, não revisado por pares. Disponível em: https://arxiv.org/abs/2605.23950. Acesso em: 28 ago. 2026.</w:t>
+        <w:t xml:space="preserve"> </w:t>
+      </w:r>
+      <w:r>
+        <w:rPr>
+          <w:rFonts w:ascii="Times New Roman" w:hAnsi="Times New Roman" w:cs="Times New Roman"/>
+          <w:b/>
+          <w:i w:val="0"/>
+          <w:sz w:val="24"/>
+        </w:rPr>
+        <w:t xml:space="preserve">Harness Handbook</w:t>
+      </w:r>
+      <w:r>
+        <w:rPr>
+          <w:rFonts w:ascii="Times New Roman" w:hAnsi="Times New Roman" w:cs="Times New Roman"/>
+          <w:b w:val="0"/>
+          <w:i w:val="0"/>
+          <w:sz w:val="24"/>
+        </w:rPr>
+        <w:t xml:space="preserve">: making evolving agent harnesses readable, navigable, and editable. arXiv:2607.13285, 2026. </w:t>
+      </w:r>
+      <w:r>
+        <w:rPr>
+          <w:rFonts w:ascii="Times New Roman" w:hAnsi="Times New Roman" w:cs="Times New Roman"/>
+          <w:b w:val="0"/>
+          <w:i/>
+          <w:sz w:val="24"/>
+        </w:rPr>
+        <w:t xml:space="preserve">Preprint</w:t>
+      </w:r>
+      <w:r>
+        <w:rPr>
+          <w:rFonts w:ascii="Times New Roman" w:hAnsi="Times New Roman" w:cs="Times New Roman"/>
+          <w:b w:val="0"/>
+          <w:i w:val="0"/>
+          <w:sz w:val="24"/>
+        </w:rPr>
+        <w:t xml:space="preserve">, não revisado por pares. Disponível em: https://arxiv.org/abs/2607.13285. Acesso em: 9 set. 2026.</w:t>
+      </w:r>
+    </w:p>
+    <w:p>
+      <w:pPr>
+        <w:spacing w:line="240" w:lineRule="auto" w:before="0" w:after="240"/>
+        <w:ind w:firstLine="0"/>
+        <w:jc w:val="left"/>
+      </w:pPr>
+      <w:r>
+        <w:rPr>
+          <w:rFonts w:ascii="Times New Roman" w:hAnsi="Times New Roman" w:cs="Times New Roman"/>
+          <w:b w:val="0"/>
+          <w:i w:val="0"/>
+          <w:sz w:val="24"/>
+        </w:rPr>
+        <w:t xml:space="preserve">YANG, John; JIMENEZ, Carlos E.; WETTIG, Alexander; LIERET, Kilian; YAO, Shunyu; NARASIMHAN, Karthik; PRESS, Ofir. </w:t>
+      </w:r>
+      <w:r>
+        <w:rPr>
+          <w:rFonts w:ascii="Times New Roman" w:hAnsi="Times New Roman" w:cs="Times New Roman"/>
+          <w:b/>
+          <w:i w:val="0"/>
+          <w:sz w:val="24"/>
+        </w:rPr>
+        <w:t xml:space="preserve">SWE-agent</w:t>
+      </w:r>
+      <w:r>
+        <w:rPr>
+          <w:rFonts w:ascii="Times New Roman" w:hAnsi="Times New Roman" w:cs="Times New Roman"/>
+          <w:b w:val="0"/>
+          <w:i w:val="0"/>
+          <w:sz w:val="24"/>
+        </w:rPr>
+        <w:t xml:space="preserve">: agent-computer interfaces enable automated software engineering. arXiv:2405.15793, 2024. Trabalho apresentado na Conference on Neural Information Processing Systems (NeurIPS), 2024. Disponível em: https://arxiv.org/abs/2405.15793. Acesso em: 28 ago. 2026.</w:t>
+      </w:r>
+    </w:p>
+    <w:p>
+      <w:pPr>
+        <w:spacing w:line="240" w:lineRule="auto" w:before="0" w:after="240"/>
+        <w:ind w:firstLine="0"/>
+        <w:jc w:val="left"/>
+      </w:pPr>
+      <w:r>
+        <w:rPr>
+          <w:rFonts w:ascii="Times New Roman" w:hAnsi="Times New Roman" w:cs="Times New Roman"/>
+          <w:b w:val="0"/>
+          <w:i w:val="0"/>
+          <w:sz w:val="24"/>
+        </w:rPr>
+        <w:t xml:space="preserve">YAO, Shunyu; ZHAO, Jeffrey; YU, Dian; DU, Nan; SHAFRAN, Izhak; NARASIMHAN, Karthik; CAO, Yuan. </w:t>
+      </w:r>
+      <w:r>
+        <w:rPr>
+          <w:rFonts w:ascii="Times New Roman" w:hAnsi="Times New Roman" w:cs="Times New Roman"/>
+          <w:b/>
+          <w:i w:val="0"/>
+          <w:sz w:val="24"/>
+        </w:rPr>
+        <w:t xml:space="preserve">ReAct</w:t>
+      </w:r>
+      <w:r>
+        <w:rPr>
+          <w:rFonts w:ascii="Times New Roman" w:hAnsi="Times New Roman" w:cs="Times New Roman"/>
+          <w:b w:val="0"/>
+          <w:i w:val="0"/>
+          <w:sz w:val="24"/>
+        </w:rPr>
+        <w:t xml:space="preserve">: synergizing reasoning and acting in language models. arXiv:2210.03629, 2022. Trabalho apresentado na International Conference on Learning Representations (ICLR), 2023. Disponível em: https://arxiv.org/abs/2210.03629. Acesso em: 28 ago. 2026.</w:t>
+      </w:r>
+    </w:p>
+    <w:p>
+      <w:pPr>
+        <w:spacing w:line="240" w:lineRule="auto" w:before="0" w:after="240"/>
+        <w:ind w:firstLine="0"/>
+        <w:jc w:val="left"/>
+      </w:pPr>
+      <w:r>
+        <w:rPr>
+          <w:rFonts w:ascii="Times New Roman" w:hAnsi="Times New Roman" w:cs="Times New Roman"/>
+          <w:b w:val="0"/>
+          <w:i w:val="0"/>
+          <w:sz w:val="24"/>
+        </w:rPr>
+        <w:t xml:space="preserve">YUUKIFST. </w:t>
+      </w:r>
+      <w:r>
+        <w:rPr>
+          <w:rFonts w:ascii="Times New Roman" w:hAnsi="Times New Roman" w:cs="Times New Roman"/>
+          <w:b/>
+          <w:i w:val="0"/>
+          <w:sz w:val="24"/>
+        </w:rPr>
+        <w:t xml:space="preserve">harness-bench</w:t>
+      </w:r>
+      <w:r>
+        <w:rPr>
+          <w:rFonts w:ascii="Times New Roman" w:hAnsi="Times New Roman" w:cs="Times New Roman"/>
+          <w:b w:val="0"/>
+          <w:i w:val="0"/>
+          <w:sz w:val="24"/>
+        </w:rPr>
+        <w:t xml:space="preserve">: runner, dados brutos e scripts de análise deste projeto. 2026. Repositório de código. Disponível em: https://github.com/YuukiFST/harness-bench. Acesso em: 28 ago. 2026.</w:t>
+      </w:r>
+    </w:p>
+    <w:p>
+      <w:pPr>
+        <w:spacing w:line="240" w:lineRule="auto" w:before="0" w:after="240"/>
+        <w:ind w:firstLine="0"/>
+        <w:jc w:val="left"/>
+      </w:pPr>
+      <w:r>
+        <w:rPr>
+          <w:rFonts w:ascii="Times New Roman" w:hAnsi="Times New Roman" w:cs="Times New Roman"/>
+          <w:b w:val="0"/>
+          <w:i w:val="0"/>
+          <w:sz w:val="24"/>
+        </w:rPr>
+        <w:t xml:space="preserve">ZHANG, Yunbei; WANG, Janet; GE, Yingqiang; XU, Weijie; HAMM, Jihun; REDDY, Chandan K. </w:t>
+      </w:r>
+      <w:r>
+        <w:rPr>
+          <w:rFonts w:ascii="Times New Roman" w:hAnsi="Times New Roman" w:cs="Times New Roman"/>
+          <w:b/>
+          <w:i w:val="0"/>
+          <w:sz w:val="24"/>
+        </w:rPr>
+        <w:t xml:space="preserve">Stop comparing LLM agents without disclosing the harness</w:t>
+      </w:r>
+      <w:r>
+        <w:rPr>
+          <w:rFonts w:ascii="Times New Roman" w:hAnsi="Times New Roman" w:cs="Times New Roman"/>
+          <w:b w:val="0"/>
+          <w:i w:val="0"/>
+          <w:sz w:val="24"/>
+        </w:rPr>
+        <w:t xml:space="preserve">. arXiv:2605.23950, 2026. </w:t>
+      </w:r>
+      <w:r>
+        <w:rPr>
+          <w:rFonts w:ascii="Times New Roman" w:hAnsi="Times New Roman" w:cs="Times New Roman"/>
+          <w:b w:val="0"/>
+          <w:i/>
+          <w:sz w:val="24"/>
+        </w:rPr>
+        <w:t xml:space="preserve">Preprint</w:t>
+      </w:r>
+      <w:r>
+        <w:rPr>
+          <w:rFonts w:ascii="Times New Roman" w:hAnsi="Times New Roman" w:cs="Times New Roman"/>
+          <w:b w:val="0"/>
+          <w:i w:val="0"/>
+          <w:sz w:val="24"/>
+        </w:rPr>
+        <w:t xml:space="preserve">, não revisado por pares. Disponível em: https://arxiv.org/abs/2605.23950. Acesso em: 28 ago. 2026.</w:t>
       </w:r>
     </w:p>
     <w:sectPr>

</xml_diff>

<commit_message>
fix(pcc): restore the figures behind two claims and cut section 2 to budget
Earendil was cited without the number that justified citing it, and the
resultados preliminares asserted that every arm resends the full history
after the per-step increments had been cut. Both figures are back: >2x cost
per task at equal quality, and 555, 625 and 698 bytes per step.

Section 2 was 670 characters over its one-page budget, so step 2 of the
reduction ladder in docs/spec/14-document-outline.md applies: the definition,
the settled-claim paragraph and the first pendencia lose their redundant
clauses. FRONTIER-HARNESS-EVAL leaves the reference list with the in-text
mention that carried it, since the Runta entry cites the same eval.

The document is back to 13 pages, the length it had before this branch, and
the sumario follows: orcamento returns to page 7 while cronograma and
referencias stay on 8.
</commit_message>
<xml_diff>
--- a/dist/projeto-pcc.docx
+++ b/dist/projeto-pcc.docx
@@ -351,7 +351,7 @@
         </w:rPr>
         <w:t>4 ORÇAMENTO</w:t>
         <w:tab/>
-        <w:t>8</w:t>
+        <w:t>7</w:t>
       </w:r>
     </w:p>
     <w:p>
@@ -466,7 +466,7 @@
           <w:i w:val="0"/>
           <w:sz w:val="24"/>
         </w:rPr>
-        <w:t xml:space="preserve">, e é ele que decide quanto do modelo pago vira trabalho entregue. No FrontierHarness (Runta, 2026)</w:t>
+        <w:t xml:space="preserve">. No FrontierHarness (Runta, 2026)</w:t>
       </w:r>
       <w:r>
         <w:rPr>
@@ -555,7 +555,7 @@
           <w:i w:val="0"/>
           <w:sz w:val="24"/>
         </w:rPr>
-        <w:t xml:space="preserve"> que concluem a tarefa. Nenhuma dessas comparações diz ao desenvolvedor o que fazer: todas contrastam ferramentas de equipes diferentes. Com a linhagem fixa, a diferença aparece antes do primeiro token: o oh-my-pi, </w:t>
+        <w:t xml:space="preserve"> que a concluem. Nenhuma dessas comparações diz ao desenvolvedor o que fazer: todas contrastam ferramentas de equipes diferentes. Com a linhagem fixa, a diferença aparece antes do primeiro token: o oh-my-pi, </w:t>
       </w:r>
       <w:r>
         <w:rPr>
@@ -1297,7 +1297,7 @@
           <w:i w:val="0"/>
           <w:sz w:val="24"/>
         </w:rPr>
-        <w:t xml:space="preserve">, memória, validadores, fronteiras de permissão, laços de execução e canais de realimentação, convertendo um modelo sem estado em um agente capaz de executar tarefas de longo horizonte. Wang </w:t>
+        <w:t xml:space="preserve">, memória, validadores, fronteiras de permissão, laços de execução e canais de realimentação, convertendo um modelo sem estado em um agente de longo horizonte. Wang </w:t>
       </w:r>
       <w:r>
         <w:rPr>
@@ -1315,7 +1315,7 @@
           <w:i w:val="0"/>
           <w:sz w:val="24"/>
         </w:rPr>
-        <w:t xml:space="preserve"> (2026) descrevem a mesma camada pelo que ela faz: monta os prompts, gerencia o estado, invoca as ferramentas e coordena o laço. É essa camada que muda quando o desenvolvedor troca de ferramenta e mantém o modelo, e os braços vão de um laço ReAct mínimo (Yao </w:t>
+        <w:t xml:space="preserve"> (2026) descrevem a mesma camada pelo que ela faz: monta os prompts, gerencia o estado, invoca as ferramentas e coordena o laço. É ela que muda quando o desenvolvedor troca de ferramenta e mantém o modelo, e os braços vão de um laço ReAct mínimo (Yao </w:t>
       </w:r>
       <w:r>
         <w:rPr>
@@ -1457,7 +1457,7 @@
           <w:i w:val="0"/>
           <w:sz w:val="24"/>
         </w:rPr>
-        <w:t xml:space="preserve">, segundo a qual, em longo horizonte, o </w:t>
+        <w:t xml:space="preserve">, segundo a qual o </w:t>
       </w:r>
       <w:r>
         <w:rPr>
@@ -1475,7 +1475,7 @@
           <w:i w:val="0"/>
           <w:sz w:val="24"/>
         </w:rPr>
-        <w:t xml:space="preserve"> determina o desempenho mais que o modelo que encapsula. Alier Forment </w:t>
+        <w:t xml:space="preserve"> determina o desempenho mais que o modelo que encapsula. Em Alier Forment </w:t>
       </w:r>
       <w:r>
         <w:rPr>
@@ -1493,7 +1493,7 @@
           <w:i w:val="0"/>
           <w:sz w:val="24"/>
         </w:rPr>
-        <w:t xml:space="preserve"> (2026) mostram que o efeito aparece primeiro no custo: em sete </w:t>
+        <w:t xml:space="preserve"> (2026), os dois </w:t>
       </w:r>
       <w:r>
         <w:rPr>
@@ -1511,25 +1511,7 @@
           <w:i w:val="0"/>
           <w:sz w:val="24"/>
         </w:rPr>
-        <w:t xml:space="preserve"> e cinco modelos sobre uma tarefa fixa, os dois </w:t>
-      </w:r>
-      <w:r>
-        <w:rPr>
-          <w:rFonts w:ascii="Times New Roman" w:hAnsi="Times New Roman" w:cs="Times New Roman"/>
-          <w:b w:val="0"/>
-          <w:i/>
-          <w:sz w:val="24"/>
-        </w:rPr>
-        <w:t xml:space="preserve">scaffoldings</w:t>
-      </w:r>
-      <w:r>
-        <w:rPr>
-          <w:rFonts w:ascii="Times New Roman" w:hAnsi="Times New Roman" w:cs="Times New Roman"/>
-          <w:b w:val="0"/>
-          <w:i w:val="0"/>
-          <w:sz w:val="24"/>
-        </w:rPr>
-        <w:t xml:space="preserve"> sem suporte a MCP saíram de 5,0x a 28x mais baratos que os cinco que o suportam. Somam-se três fontes de prática, não revisadas por pares: o HarnessRank (2026), o estudo da Databricks relatado por Earendil (2026) e o FrontierHarness (Runta, 2026), cujos dados normalizados são públicos (Frontier-Harness-Eval, 2026).</w:t>
+        <w:t xml:space="preserve"> sem suporte a MCP saíram de 5,0x a 28x mais baratos que os cinco que o suportam. Somam-se três fontes não revisadas por pares: o HarnessRank (2026), o estudo da Databricks relatado por Earendil (2026), com custo por tarefa variando mais de 2x sem mudança de qualidade, e o FrontierHarness (Runta, 2026).</w:t>
       </w:r>
     </w:p>
     <w:p>
@@ -1617,25 +1599,7 @@
           <w:i w:val="0"/>
           <w:sz w:val="24"/>
         </w:rPr>
-        <w:t xml:space="preserve"> e ganham 7,7 pontos usando 4x menos tokens de contexto, e Wang </w:t>
-      </w:r>
-      <w:r>
-        <w:rPr>
-          <w:rFonts w:ascii="Times New Roman" w:hAnsi="Times New Roman" w:cs="Times New Roman"/>
-          <w:b w:val="0"/>
-          <w:i/>
-          <w:sz w:val="24"/>
-        </w:rPr>
-        <w:t xml:space="preserve">et al.</w:t>
-      </w:r>
-      <w:r>
-        <w:rPr>
-          <w:rFonts w:ascii="Times New Roman" w:hAnsi="Times New Roman" w:cs="Times New Roman"/>
-          <w:b w:val="0"/>
-          <w:i w:val="0"/>
-          <w:sz w:val="24"/>
-        </w:rPr>
-        <w:t xml:space="preserve"> (2026) atacam o passo anterior, o de localizar no código o trecho que produz o comportamento. O par pi / oh-my-pi responde a §5.2.7 pelo lado do controle: um </w:t>
+        <w:t xml:space="preserve"> e ganham 7,7 pontos usando 4x menos tokens de contexto. O par pi / oh-my-pi responde a §5.2.7 pelo lado do controle: um </w:t>
       </w:r>
       <w:r>
         <w:rPr>
@@ -1669,7 +1633,7 @@
           <w:i w:val="0"/>
           <w:sz w:val="24"/>
         </w:rPr>
-        <w:t xml:space="preserve">A segunda pendência é de instrumentação, e atinge o desenvolvedor diretamente, porque ele decide pelo relatório que a ferramenta lhe mostra. O que um </w:t>
+        <w:t xml:space="preserve">A segunda pendência é de instrumentação, e atinge o desenvolvedor diretamente: ele decide pelo relatório da própria ferramenta. O que um </w:t>
       </w:r>
       <w:r>
         <w:rPr>
@@ -1829,25 +1793,7 @@
           <w:i w:val="0"/>
           <w:sz w:val="24"/>
         </w:rPr>
-        <w:t xml:space="preserve">, 2025), e o FrontierHarness registra um </w:t>
-      </w:r>
-      <w:r>
-        <w:rPr>
-          <w:rFonts w:ascii="Times New Roman" w:hAnsi="Times New Roman" w:cs="Times New Roman"/>
-          <w:b w:val="0"/>
-          <w:i/>
-          <w:sz w:val="24"/>
-        </w:rPr>
-        <w:t xml:space="preserve">harness</w:t>
-      </w:r>
-      <w:r>
-        <w:rPr>
-          <w:rFonts w:ascii="Times New Roman" w:hAnsi="Times New Roman" w:cs="Times New Roman"/>
-          <w:b w:val="0"/>
-          <w:i w:val="0"/>
-          <w:sz w:val="24"/>
-        </w:rPr>
-        <w:t xml:space="preserve"> cujo aproveitamento de cache ponderado por tokens cai a 25,0% contra uma mediana de 67,8% (Runta, 2026). Por isso o desenho carrega dois níveis, e as conclusões são enunciadas por nível.</w:t>
+        <w:t xml:space="preserve">, 2025), e o FrontierHarness registra aproveitamento de cache ponderado por tokens caindo a 25,0% contra uma mediana de 67,8% (Runta, 2026). Por isso o desenho carrega dois níveis, e as conclusões são enunciadas por nível.</w:t>
       </w:r>
     </w:p>
     <w:p>
@@ -2414,7 +2360,7 @@
           <w:i w:val="0"/>
           <w:sz w:val="24"/>
         </w:rPr>
-        <w:t xml:space="preserve">, em ambiente isolado, medida em 28 de agosto de 2026, os braços diferem por uma ordem de grandeza antes que o modelo gere qualquer token (Tabela 1): com a linhagem mantida fixa, o oh-my-pi envia 11,4x os bytes totais do pi, 13,5x os bytes de esquemas de ferramenta e 13,6x os tokens. A mesma execução produziu outros dois achados. Os três braços reenviam o histórico completo a cada passo, mas só dois o reenviam íntegro: no quinto passo, o oh-my-pi já substituiu o resultado de ferramenta mais antigo por uma referência de 54 bytes, sem pressão de contexto; além do custo, Liu </w:t>
+        <w:t xml:space="preserve">, em ambiente isolado, medida em 28 de agosto de 2026, os braços diferem por uma ordem de grandeza antes que o modelo gere qualquer token (Tabela 1): com a linhagem mantida fixa, o oh-my-pi envia 11,4x os bytes totais do pi, 13,5x os bytes de esquemas de ferramenta e 13,6x os tokens. A mesma execução produziu outros dois achados. Os três braços reenviam o histórico completo a cada passo, com incremento constante de 555, 625 e 698 bytes (pi, oh-my-pi e OpenCode), mas só dois o reenviam íntegro: no quinto passo, o oh-my-pi já substituiu o resultado de ferramenta mais antigo por uma referência de 54 bytes, sem pressão de contexto; além do custo, Liu </w:t>
       </w:r>
       <w:r>
         <w:rPr>
@@ -4871,40 +4817,6 @@
           <w:i w:val="0"/>
           <w:sz w:val="24"/>
         </w:rPr>
-        <w:t xml:space="preserve">FRONTIER-HARNESS-EVAL. </w:t>
-      </w:r>
-      <w:r>
-        <w:rPr>
-          <w:rFonts w:ascii="Times New Roman" w:hAnsi="Times New Roman" w:cs="Times New Roman"/>
-          <w:b/>
-          <w:i w:val="0"/>
-          <w:sz w:val="24"/>
-        </w:rPr>
-        <w:t xml:space="preserve">FrontierHarness eval</w:t>
-      </w:r>
-      <w:r>
-        <w:rPr>
-          <w:rFonts w:ascii="Times New Roman" w:hAnsi="Times New Roman" w:cs="Times New Roman"/>
-          <w:b w:val="0"/>
-          <w:i w:val="0"/>
-          <w:sz w:val="24"/>
-        </w:rPr>
-        <w:t xml:space="preserve">: tarefas, executor e resultados normalizados. 2026. Repositório de código. Disponível em: https://github.com/frontier-harness-eval/eval. Acesso em: 9 set. 2026.</w:t>
-      </w:r>
-    </w:p>
-    <w:p>
-      <w:pPr>
-        <w:spacing w:line="240" w:lineRule="auto" w:before="0" w:after="240"/>
-        <w:ind w:firstLine="0"/>
-        <w:jc w:val="left"/>
-      </w:pPr>
-      <w:r>
-        <w:rPr>
-          <w:rFonts w:ascii="Times New Roman" w:hAnsi="Times New Roman" w:cs="Times New Roman"/>
-          <w:b w:val="0"/>
-          <w:i w:val="0"/>
-          <w:sz w:val="24"/>
-        </w:rPr>
         <w:t xml:space="preserve">GIL, Antonio Carlos. </w:t>
       </w:r>
       <w:r>

</xml_diff>

<commit_message>
docs(pcc): deliver projeto with schedule and markers resolved
September-January execution schedule, delivery-month prose, and pilot markers turned into future-tense prose. Mechanical audit of word/document.xml passes.
</commit_message>
<xml_diff>
--- a/dist/projeto-pcc.docx
+++ b/dist/projeto-pcc.docx
@@ -2228,7 +2228,7 @@
           <w:i w:val="0"/>
           <w:sz w:val="24"/>
         </w:rPr>
-        <w:t>, 2026, §8); sem ela, um escore binário tenderia a ler zero para todos os braços neste nível de modelo [A VERIFICAR nas tarefas-piloto].</w:t>
+        <w:t>, 2026, §8); sem ela, um escore binário tenderia a ler zero para todos os braços neste nível de modelo, o que será confirmado nas tarefas-piloto.</w:t>
       </w:r>
     </w:p>
     <w:p>
@@ -2330,7 +2330,7 @@
           <w:i w:val="0"/>
           <w:sz w:val="24"/>
         </w:rPr>
-        <w:t xml:space="preserve"> zero gastar [A MEDIR nas tarefas-piloto]. O número de passos não é limitado, porque um teto de passos é ele próprio uma decisão de projeto de </w:t>
+        <w:t xml:space="preserve"> zero gastar nas tarefas-piloto. O número de passos não é limitado, porque um teto de passos é ele próprio uma decisão de projeto de </w:t>
       </w:r>
       <w:r>
         <w:rPr>
@@ -3435,7 +3435,7 @@
           <w:i w:val="0"/>
           <w:sz w:val="24"/>
         </w:rPr>
-        <w:t xml:space="preserve">O total em dinheiro é zero, e o limite que restringe o experimento é a cota: cerca de 10 requisições a cada 6 minutos, medidas neste projeto, contra o número de requisições que uma tarefa do DeepSWE consome [A MEDIR nas tarefas-piloto]. Por isso a matriz é executada em lotes distribuídos ao longo de dias, e o custo monetário aparece apenas como contrafactual de ordem de grandeza sobre as tarifas pagas publicadas.</w:t>
+        <w:t xml:space="preserve">O total em dinheiro é zero, e o limite que restringe o experimento é a cota: cerca de 10 requisições a cada 6 minutos, medidas neste projeto, contra o número de requisições que uma tarefa do DeepSWE consome nas tarefas-piloto. Por isso a matriz é executada em lotes distribuídos ao longo de dias, e o custo monetário aparece apenas como contrafactual de ordem de grandeza sobre as tarifas pagas publicadas.</w:t>
       </w:r>
     </w:p>
     <w:p>
@@ -3467,7 +3467,7 @@
           <w:i w:val="0"/>
           <w:sz w:val="24"/>
         </w:rPr>
-        <w:t>A cadência é de um lote da matriz por dia, porque a cota gratuita é o limite vinculante, e por isso o calendário se estende por semanas. A folga está concentrada na execução da matriz e nos portões de confiabilidade dos braços, onde está o risco. Os meses são numerados de forma relativa porque a data de entrega ainda não está confirmada [A DEFINIR com o orientador].</w:t>
+        <w:t xml:space="preserve">A cadência é de um lote da matriz por dia, porque a cota gratuita é o limite vinculante, e por isso o calendário se estende por semanas. A folga está concentrada na execução da matriz e nos portões de confiabilidade dos braços, onde está o risco. Os meses vão de setembro de 2026, mês de entrega deste projeto, a janeiro de 2027.</w:t>
       </w:r>
     </w:p>
     <w:p>
@@ -3543,7 +3543,7 @@
                 <w:i w:val="0"/>
                 <w:sz w:val="18"/>
               </w:rPr>
-              <w:t>MÊS 1</w:t>
+              <w:t>SETEMBRO</w:t>
             </w:r>
           </w:p>
         </w:tc>
@@ -3565,7 +3565,7 @@
                 <w:i w:val="0"/>
                 <w:sz w:val="18"/>
               </w:rPr>
-              <w:t>MÊS 2</w:t>
+              <w:t>OUTUBRO</w:t>
             </w:r>
           </w:p>
         </w:tc>
@@ -3587,7 +3587,7 @@
                 <w:i w:val="0"/>
                 <w:sz w:val="18"/>
               </w:rPr>
-              <w:t>MÊS 3</w:t>
+              <w:t>NOVEMBRO</w:t>
             </w:r>
           </w:p>
         </w:tc>
@@ -3609,7 +3609,7 @@
                 <w:i w:val="0"/>
                 <w:sz w:val="18"/>
               </w:rPr>
-              <w:t>MÊS 4</w:t>
+              <w:t>DEZEMBRO</w:t>
             </w:r>
           </w:p>
         </w:tc>
@@ -3631,7 +3631,7 @@
                 <w:i w:val="0"/>
                 <w:sz w:val="18"/>
               </w:rPr>
-              <w:t>MÊS 5</w:t>
+              <w:t>JANEIRO</w:t>
             </w:r>
           </w:p>
         </w:tc>

</xml_diff>

<commit_message>
docs(pcc): correct six body claims against the cited works
Applies the content audit of 2026-09-11 (wiki/queries):
- [26] Runta: 17x is the author's ratio (17.5x); the 50.0-66.7% range
  covers 12 configurations of 9 harnesses; Bogdanov sentence dropped.
- [52] HarnessRank ranks by pass rate with the model fixed, cost shown
  alongside; Lin 24.7 pp is computed from Table 1 (Codex 71.9% minus
  OpenCode 47.2%, Terminal-Bench 2, 89 tasks, GPT-5.4); Zhang thesis
  keeps its qualifiers; Runta 5.3x marked as computed; Databricks
  'in some cases' restored.
- [53] Lee et al.: the 7.7-point/4x figure was text classification;
  replaced by the TerminalBench-2 result (76.4% vs 74.7%, Table 7).
- [55] Runta: 67.8% is Claude Code's own median cell, not a median
  across harnesses.
- [57] Prodanov/Freitas: classification uses the book's axes
  (natureza; quantitativo e qualitativo).
- [60] DeepSWE vs SWE-bench: 668 vs 32.8 lines cited instead of
  'another order of magnitude'.
</commit_message>
<xml_diff>
--- a/dist/projeto-pcc.docx
+++ b/dist/projeto-pcc.docx
@@ -353,31 +353,39 @@
         <w:jc w:val="both"/>
       </w:pPr>
       <w:r>
-        <w:t xml:space="preserve">Agentes de codificação são ferramenta de trabalho. Entre mais de 15.000 desenvolvedores profissionais, 39% usavam o Claude Code no trabalho em 2026, 16% o Codex </w:t>
-      </w:r>
-      <w:r>
-        <w:t xml:space="preserve">e 12% o Cursor (Bogdanov, 2026). Cada um é um </w:t>
-      </w:r>
-      <w:r>
-        <w:rPr>
+        <w:rPr>
+          <w:b w:val="0"/>
+          <w:i w:val="0"/>
+        </w:rPr>
+        <w:t xml:space="preserve">Agentes de codificação como o Codex e o Claude Code são ferramenta de trabalho do desenvolvedor. Cada um é um </w:t>
+      </w:r>
+      <w:r>
+        <w:rPr>
+          <w:b w:val="0"/>
           <w:i/>
         </w:rPr>
-        <w:t>harness</w:t>
-      </w:r>
-      <w:r>
-        <w:t xml:space="preserve">, a camada de software ao redor do modelo, e ela muda o custo com o modelo fixo. No FrontierHarness (Runta, 2026), nove </w:t>
-      </w:r>
-      <w:r>
-        <w:rPr>
+        <w:t xml:space="preserve">harness</w:t>
+      </w:r>
+      <w:r>
+        <w:rPr>
+          <w:b w:val="0"/>
+          <w:i w:val="0"/>
+        </w:rPr>
+        <w:t xml:space="preserve">, a camada de software ao redor do modelo, e ela muda o custo com o modelo fixo. No FrontierHarness (Runta, 2026), doze configurações de nove </w:t>
+      </w:r>
+      <w:r>
+        <w:rPr>
+          <w:b w:val="0"/>
           <w:i/>
         </w:rPr>
-        <w:t>harnesses</w:t>
-      </w:r>
-      <w:r>
-        <w:t xml:space="preserve"> sobre o mesmo modelo ficam entre 50,0% e 66,7% de aprovação, e o custo po</w:t>
-      </w:r>
-      <w:r>
-        <w:t>r tarefa concluída varia 17x (US$ 1,05 a US$ 18,34).</w:t>
+        <w:t xml:space="preserve">harnesses</w:t>
+      </w:r>
+      <w:r>
+        <w:rPr>
+          <w:b w:val="0"/>
+          <w:i w:val="0"/>
+        </w:rPr>
+        <w:t xml:space="preserve"> sobre o mesmo modelo ficam entre 50,0% e 66,7% de aprovação, e o custo por tarefa concluída vai de US$ 1,05 a US$ 18,34, uma razão de 17,5x calculada pelo autor deste projeto.</w:t>
       </w:r>
     </w:p>
     <w:p>
@@ -979,112 +987,150 @@
         <w:jc w:val="both"/>
       </w:pPr>
       <w:r>
+        <w:rPr>
+          <w:b w:val="0"/>
+          <w:i w:val="0"/>
+        </w:rPr>
         <w:t xml:space="preserve">A interface entre modelo e ambiente é objeto de projeto desde Yang </w:t>
       </w:r>
       <w:r>
         <w:rPr>
+          <w:b w:val="0"/>
           <w:i/>
         </w:rPr>
-        <w:t>et al.</w:t>
-      </w:r>
-      <w:r>
-        <w:t xml:space="preserve"> (2024). Lin </w:t>
-      </w:r>
-      <w:r>
-        <w:rPr>
+        <w:t xml:space="preserve">et al.</w:t>
+      </w:r>
+      <w:r>
+        <w:rPr>
+          <w:b w:val="0"/>
+          <w:i w:val="0"/>
+        </w:rPr>
+        <w:t xml:space="preserve"> (2024). Na Tabela 1 de Lin </w:t>
+      </w:r>
+      <w:r>
+        <w:rPr>
+          <w:b w:val="0"/>
           <w:i/>
         </w:rPr>
-        <w:t>et al.</w:t>
-      </w:r>
-      <w:r>
-        <w:t xml:space="preserve"> (2</w:t>
-      </w:r>
-      <w:r>
-        <w:t xml:space="preserve">026) medem 24,7 pontos percentuais de dispersão entre </w:t>
-      </w:r>
-      <w:r>
-        <w:rPr>
+        <w:t xml:space="preserve">et al.</w:t>
+      </w:r>
+      <w:r>
+        <w:rPr>
+          <w:b w:val="0"/>
+          <w:i w:val="0"/>
+        </w:rPr>
+        <w:t xml:space="preserve"> (2026), </w:t>
+      </w:r>
+      <w:r>
+        <w:rPr>
+          <w:b w:val="0"/>
           <w:i/>
         </w:rPr>
-        <w:t>harnesses</w:t>
-      </w:r>
-      <w:r>
-        <w:t xml:space="preserve"> humanos sobre um modelo congelado, e Zhang </w:t>
-      </w:r>
-      <w:r>
-        <w:rPr>
+        <w:t xml:space="preserve">harnesses</w:t>
+      </w:r>
+      <w:r>
+        <w:rPr>
+          <w:b w:val="0"/>
+          <w:i w:val="0"/>
+        </w:rPr>
+        <w:t xml:space="preserve"> escritos por humanos sobre um modelo congelado (GPT-5.4, Terminal-Bench 2, 89 tarefas) vão de 47,2% de aprovação no OpenCode a 71,9% no Codex, uma diferença de 24,7 pontos percentuais calculada pelo autor deste projeto. Zhang </w:t>
+      </w:r>
+      <w:r>
+        <w:rPr>
+          <w:b w:val="0"/>
           <w:i/>
         </w:rPr>
-        <w:t>et al.</w:t>
-      </w:r>
-      <w:r>
+        <w:t xml:space="preserve">et al.</w:t>
+      </w:r>
+      <w:r>
+        <w:rPr>
+          <w:b w:val="0"/>
+          <w:i w:val="0"/>
+        </w:rPr>
         <w:t xml:space="preserve"> (2026) enunciam a </w:t>
       </w:r>
       <w:r>
         <w:rPr>
+          <w:b w:val="0"/>
           <w:i/>
         </w:rPr>
-        <w:t>Binding Constraint Thesis</w:t>
-      </w:r>
-      <w:r>
-        <w:t xml:space="preserve">, segundo a qual, em tarefas de longo horizonte, o </w:t>
-      </w:r>
-      <w:r>
-        <w:rPr>
+        <w:t xml:space="preserve">Binding Constraint Thesis</w:t>
+      </w:r>
+      <w:r>
+        <w:rPr>
+          <w:b w:val="0"/>
+          <w:i w:val="0"/>
+        </w:rPr>
+        <w:t xml:space="preserve">: em tarefas de longo horizonte com modelos de fronteira comparáveis, a parcela do desempenho que vem do </w:t>
+      </w:r>
+      <w:r>
+        <w:rPr>
+          <w:b w:val="0"/>
           <w:i/>
         </w:rPr>
-        <w:t>harness</w:t>
-      </w:r>
-      <w:r>
-        <w:t xml:space="preserve"> determina o desempenho mais que o modelo</w:t>
-      </w:r>
-      <w:r>
-        <w:t xml:space="preserve"> </w:t>
-      </w:r>
-      <w:r>
-        <w:lastRenderedPageBreak/>
-        <w:t xml:space="preserve">que encapsula. Em Alier Forment </w:t>
-      </w:r>
-      <w:r>
-        <w:rPr>
+        <w:t xml:space="preserve">harness</w:t>
+      </w:r>
+      <w:r>
+        <w:rPr>
+          <w:b w:val="0"/>
+          <w:i w:val="0"/>
+        </w:rPr>
+        <w:t xml:space="preserve"> é frequentemente comparável ou maior que a que vem do modelo, e pode dominá-la. Em Alier Forment </w:t>
+      </w:r>
+      <w:r>
+        <w:rPr>
+          <w:b w:val="0"/>
           <w:i/>
         </w:rPr>
-        <w:t>et al.</w:t>
-      </w:r>
-      <w:r>
+        <w:t xml:space="preserve">et al.</w:t>
+      </w:r>
+      <w:r>
+        <w:rPr>
+          <w:b w:val="0"/>
+          <w:i w:val="0"/>
+        </w:rPr>
         <w:t xml:space="preserve"> (2026), os dois </w:t>
       </w:r>
       <w:r>
         <w:rPr>
+          <w:b w:val="0"/>
           <w:i/>
         </w:rPr>
-        <w:t>scaffoldings</w:t>
-      </w:r>
-      <w:r>
+        <w:t xml:space="preserve">scaffoldings</w:t>
+      </w:r>
+      <w:r>
+        <w:rPr>
+          <w:b w:val="0"/>
+          <w:i w:val="0"/>
+        </w:rPr>
         <w:t xml:space="preserve"> sem suporte a MCP saíram de 5,0x a 28x mais baratos que os cinco que o suportam. Somam-se três fontes não revisadas por pares. O HarnessRank (2026) ordena </w:t>
       </w:r>
       <w:r>
         <w:rPr>
+          <w:b w:val="0"/>
           <w:i/>
         </w:rPr>
-        <w:t>harnesses</w:t>
-      </w:r>
-      <w:r>
-        <w:t xml:space="preserve"> por custo. O FrontierH</w:t>
-      </w:r>
-      <w:r>
-        <w:t xml:space="preserve">arness (Runta, 2026) compara, sobre o mesmo modelo, as ferramentas que o desenvolvedor encontra no mercado: o Codex conclui 66,7% das tarefas a US$ 3,47 por tarefa concluída e o Claude Code 63,3% a US$ 18,34, 5,3x mais caro para uma taxa próxima. O estudo </w:t>
-      </w:r>
-      <w:r>
-        <w:t xml:space="preserve">da Databricks registra custo por tarefa variando mais de 2x sem mudança de qualidade (Databricks, 2026 </w:t>
-      </w:r>
-      <w:r>
-        <w:rPr>
+        <w:t xml:space="preserve">harnesses</w:t>
+      </w:r>
+      <w:r>
+        <w:rPr>
+          <w:b w:val="0"/>
+          <w:i w:val="0"/>
+        </w:rPr>
+        <w:t xml:space="preserve"> por taxa de aprovação com modelo fixo e publica custo e tokens ao lado, sem que eles alterem a ordem. O FrontierHarness (Runta, 2026) compara, sobre o mesmo modelo, as ferramentas que o desenvolvedor encontra no mercado: o Codex conclui 66,7% das tarefas a US$ 3,47 por tarefa concluída e o Claude Code 63,3% a US$ 18,34, ou seja, 5,3x mais caro para uma taxa próxima (cálculo do autor deste projeto). O estudo da Databricks registra custo por tarefa variando mais de 2x em alguns casos, sem mudança de qualidade (Databricks, 2026 </w:t>
+      </w:r>
+      <w:r>
+        <w:rPr>
+          <w:b w:val="0"/>
           <w:i/>
         </w:rPr>
-        <w:t>apud</w:t>
-      </w:r>
-      <w:r>
+        <w:t xml:space="preserve">apud</w:t>
+      </w:r>
+      <w:r>
+        <w:rPr>
+          <w:b w:val="0"/>
+          <w:i w:val="0"/>
+        </w:rPr>
         <w:t xml:space="preserve"> Earendil, 2026).</w:t>
       </w:r>
     </w:p>
@@ -1095,78 +1141,136 @@
         <w:jc w:val="both"/>
       </w:pPr>
       <w:r>
+        <w:rPr>
+          <w:b w:val="0"/>
+          <w:i w:val="0"/>
+        </w:rPr>
         <w:t xml:space="preserve">A primeira pendência é de atribuição. Toda comparação publicada contrasta </w:t>
       </w:r>
       <w:r>
         <w:rPr>
+          <w:b w:val="0"/>
           <w:i/>
         </w:rPr>
-        <w:t>harnesses</w:t>
-      </w:r>
-      <w:r>
-        <w:t xml:space="preserve"> de equipes diferentes sobre fundações diferente</w:t>
-      </w:r>
-      <w:r>
-        <w:t xml:space="preserve">s, e a dispersão medida agrega prompt, ferramentas, gestão de contexto e desenho do laço sem separá-los. O desenvolvedor sabe qual ferramenta ganhou, mas não o que a fez ganhar. Ning </w:t>
-      </w:r>
-      <w:r>
-        <w:rPr>
+        <w:t xml:space="preserve">harnesses</w:t>
+      </w:r>
+      <w:r>
+        <w:rPr>
+          <w:b w:val="0"/>
+          <w:i w:val="0"/>
+        </w:rPr>
+        <w:t xml:space="preserve"> de equipes diferentes sobre fundações diferentes, e a dispersão medida agrega prompt, ferramentas, gestão de contexto e desenho do laço sem separá-los. O desenvolvedor sabe qual ferramenta ganhou, mas não o que a fez ganhar. Ning </w:t>
+      </w:r>
+      <w:r>
+        <w:rPr>
+          <w:b w:val="0"/>
           <w:i/>
         </w:rPr>
-        <w:t>et al.</w:t>
-      </w:r>
-      <w:r>
-        <w:t xml:space="preserve"> (2026) nomeiam a lacuna em §5.2.1 e pedem, em §5.2.7, “métricas qu</w:t>
-      </w:r>
-      <w:r>
-        <w:t xml:space="preserve">e isolem componentes do </w:t>
-      </w:r>
-      <w:r>
-        <w:rPr>
+        <w:t xml:space="preserve">et al.</w:t>
+      </w:r>
+      <w:r>
+        <w:rPr>
+          <w:b w:val="0"/>
+          <w:i w:val="0"/>
+        </w:rPr>
+        <w:t xml:space="preserve"> (2026) nomeiam a lacuna em §5.2.1 e pedem, em §5.2.7, “métricas que isolem componentes do </w:t>
+      </w:r>
+      <w:r>
+        <w:rPr>
+          <w:b w:val="0"/>
           <w:i/>
         </w:rPr>
-        <w:t>harness</w:t>
-      </w:r>
-      <w:r>
+        <w:t xml:space="preserve">harness</w:t>
+      </w:r>
+      <w:r>
+        <w:rPr>
+          <w:b w:val="0"/>
+          <w:i w:val="0"/>
+        </w:rPr>
         <w:t xml:space="preserve">” (Ning </w:t>
       </w:r>
       <w:r>
         <w:rPr>
+          <w:b w:val="0"/>
           <w:i/>
         </w:rPr>
-        <w:t>et al.</w:t>
-      </w:r>
-      <w:r>
+        <w:t xml:space="preserve">et al.</w:t>
+      </w:r>
+      <w:r>
+        <w:rPr>
+          <w:b w:val="0"/>
+          <w:i w:val="0"/>
+        </w:rPr>
         <w:t xml:space="preserve">, 2026, tradução nossa). Lee </w:t>
       </w:r>
       <w:r>
         <w:rPr>
+          <w:b w:val="0"/>
           <w:i/>
         </w:rPr>
-        <w:t>et al.</w:t>
-      </w:r>
-      <w:r>
-        <w:t xml:space="preserve"> (2026) mostram que essas decisões são isoláveis ao otimizar o código do </w:t>
-      </w:r>
-      <w:r>
-        <w:rPr>
+        <w:t xml:space="preserve">et al.</w:t>
+      </w:r>
+      <w:r>
+        <w:rPr>
+          <w:b w:val="0"/>
+          <w:i w:val="0"/>
+        </w:rPr>
+        <w:t xml:space="preserve"> (2026) mostram que essas decisões são isoláveis: uma busca automática que edita só o código do </w:t>
+      </w:r>
+      <w:r>
+        <w:rPr>
+          <w:b w:val="0"/>
           <w:i/>
         </w:rPr>
-        <w:t>harness</w:t>
-      </w:r>
-      <w:r>
-        <w:t xml:space="preserve"> e ganhar 7,7 pontos usando 4x menos tokens de contexto. O par pi / oh-my-pi responderá a §5.2.7</w:t>
-      </w:r>
-      <w:r>
-        <w:t xml:space="preserve"> pelo lado do controle, já que um </w:t>
-      </w:r>
-      <w:r>
-        <w:rPr>
+        <w:t xml:space="preserve">harness</w:t>
+      </w:r>
+      <w:r>
+        <w:rPr>
+          <w:b w:val="0"/>
+          <w:i w:val="0"/>
+        </w:rPr>
+        <w:t xml:space="preserve">, com o modelo fixo, chegou a 76,4% de aprovação no TerminalBench-2 (89 tarefas, Claude Opus 4.6), contra 74,7% do Terminus-KIRA, o </w:t>
+      </w:r>
+      <w:r>
+        <w:rPr>
+          <w:b w:val="0"/>
           <w:i/>
         </w:rPr>
-        <w:t>fork</w:t>
-      </w:r>
-      <w:r>
+        <w:t xml:space="preserve">harness</w:t>
+      </w:r>
+      <w:r>
+        <w:rPr>
+          <w:b w:val="0"/>
+          <w:i w:val="0"/>
+        </w:rPr>
+        <w:t xml:space="preserve"> escrito à mão de que a busca partiu (Lee </w:t>
+      </w:r>
+      <w:r>
+        <w:rPr>
+          <w:b w:val="0"/>
+          <w:i/>
+        </w:rPr>
+        <w:t xml:space="preserve">et al.</w:t>
+      </w:r>
+      <w:r>
+        <w:rPr>
+          <w:b w:val="0"/>
+          <w:i w:val="0"/>
+        </w:rPr>
+        <w:t xml:space="preserve">, 2026, Tabela 7). O par pi / oh-my-pi responderá a §5.2.7 pelo lado do controle, já que um </w:t>
+      </w:r>
+      <w:r>
+        <w:rPr>
+          <w:b w:val="0"/>
+          <w:i/>
+        </w:rPr>
+        <w:t xml:space="preserve">fork</w:t>
+      </w:r>
+      <w:r>
+        <w:rPr>
+          <w:b w:val="0"/>
+          <w:i w:val="0"/>
+        </w:rPr>
         <w:t xml:space="preserve"> direto mantém a linhagem fixa e faz variar apenas as modificações.</w:t>
       </w:r>
     </w:p>
@@ -1232,52 +1336,81 @@
         <w:jc w:val="both"/>
       </w:pPr>
       <w:r>
-        <w:t>A métrica primária será o Succ/Mtok (sucesso por milhão d</w:t>
-      </w:r>
-      <w:r>
-        <w:t xml:space="preserve">e tokens), de Lin </w:t>
-      </w:r>
-      <w:r>
-        <w:rPr>
+        <w:rPr>
+          <w:b w:val="0"/>
+          <w:i w:val="0"/>
+        </w:rPr>
+        <w:t xml:space="preserve">A métrica primária será o Succ/Mtok (sucesso por milhão de tokens), de Lin </w:t>
+      </w:r>
+      <w:r>
+        <w:rPr>
+          <w:b w:val="0"/>
           <w:i/>
         </w:rPr>
-        <w:t>et al.</w:t>
-      </w:r>
-      <w:r>
+        <w:t xml:space="preserve">et al.</w:t>
+      </w:r>
+      <w:r>
+        <w:rPr>
+          <w:b w:val="0"/>
+          <w:i w:val="0"/>
+        </w:rPr>
         <w:t xml:space="preserve"> (2026), a razão que interessa a quem paga a conta. Sobre ela pesa uma ressalva permanente, a de que o efeito é específico do modelo e pode inverter de sinal. No </w:t>
       </w:r>
       <w:r>
         <w:rPr>
+          <w:b w:val="0"/>
           <w:i/>
         </w:rPr>
-        <w:t>Holistic Agent Leaderboard</w:t>
-      </w:r>
-      <w:r>
-        <w:t>, os modelos da Anthropic vão melhor com o B</w:t>
-      </w:r>
-      <w:r>
-        <w:t xml:space="preserve">rowserUse e os da OpenAI com o SeeAct sobre o mesmo </w:t>
-      </w:r>
-      <w:r>
-        <w:rPr>
+        <w:t xml:space="preserve">Holistic Agent Leaderboard</w:t>
+      </w:r>
+      <w:r>
+        <w:rPr>
+          <w:b w:val="0"/>
+          <w:i w:val="0"/>
+        </w:rPr>
+        <w:t xml:space="preserve">, os modelos da Anthropic vão melhor com o BrowserUse e os da OpenAI com o SeeAct sobre o mesmo </w:t>
+      </w:r>
+      <w:r>
+        <w:rPr>
+          <w:b w:val="0"/>
           <w:i/>
         </w:rPr>
-        <w:t>benchmark</w:t>
-      </w:r>
-      <w:r>
+        <w:t xml:space="preserve">benchmark</w:t>
+      </w:r>
+      <w:r>
+        <w:rPr>
+          <w:b w:val="0"/>
+          <w:i w:val="0"/>
+        </w:rPr>
         <w:t xml:space="preserve"> (Kapoor </w:t>
       </w:r>
       <w:r>
         <w:rPr>
+          <w:b w:val="0"/>
           <w:i/>
         </w:rPr>
-        <w:t>et al.</w:t>
-      </w:r>
-      <w:r>
-        <w:t>, 2025), e o FrontierHarness registra aproveitamento de cache ponderado por tokens caindo a 25,0% contra uma mediana de 67,8% (Runta, 2026). Por isso o desenho carregará dois nívei</w:t>
-      </w:r>
-      <w:r>
-        <w:t>s de modelo, e as conclusões serão enunciadas por nível.</w:t>
+        <w:t xml:space="preserve">et al.</w:t>
+      </w:r>
+      <w:r>
+        <w:rPr>
+          <w:b w:val="0"/>
+          <w:i w:val="0"/>
+        </w:rPr>
+        <w:t xml:space="preserve">, 2025), e o FrontierHarness registra, para o Claude Code, aproveitamento de cache de 25,0% ponderado por tokens contra 67,8% na célula mediana do mesmo </w:t>
+      </w:r>
+      <w:r>
+        <w:rPr>
+          <w:b w:val="0"/>
+          <w:i/>
+        </w:rPr>
+        <w:t xml:space="preserve">harness</w:t>
+      </w:r>
+      <w:r>
+        <w:rPr>
+          <w:b w:val="0"/>
+          <w:i w:val="0"/>
+        </w:rPr>
+        <w:t xml:space="preserve"> (Runta, 2026). Por isso o desenho carregará dois níveis de modelo, e as conclusões serão enunciadas por nível.</w:t>
       </w:r>
     </w:p>
     <w:p>
@@ -1301,40 +1434,53 @@
         <w:jc w:val="both"/>
       </w:pPr>
       <w:r>
-        <w:t>Quanto à finalidade, esta é uma pesquisa aplicada, e seu produto será um critério de escolha que um desenvolvedor ou uma empresa poderá aplicar. Quanto à abordagem, é quali-quantitativa. As medidas de custo e de sucesso são quantitativas, e a atribuição de</w:t>
-      </w:r>
-      <w:r>
-        <w:t xml:space="preserve"> cada diferença a uma decisão de projeto do </w:t>
-      </w:r>
-      <w:r>
-        <w:rPr>
+        <w:rPr>
+          <w:b w:val="0"/>
+          <w:i w:val="0"/>
+        </w:rPr>
+        <w:t xml:space="preserve">Quanto à natureza, esta é uma pesquisa aplicada, e seu produto será um critério de escolha que um desenvolvedor ou uma empresa poderá aplicar. Quanto à abordagem, combina o quantitativo e o qualitativo. As medidas de custo e de sucesso são quantitativas, e a atribuição de cada diferença a uma decisão de projeto do </w:t>
+      </w:r>
+      <w:r>
+        <w:rPr>
+          <w:b w:val="0"/>
           <w:i/>
         </w:rPr>
-        <w:t>harness</w:t>
-      </w:r>
-      <w:r>
+        <w:t xml:space="preserve">harness</w:t>
+      </w:r>
+      <w:r>
+        <w:rPr>
+          <w:b w:val="0"/>
+          <w:i w:val="0"/>
+        </w:rPr>
         <w:t xml:space="preserve"> é qualitativa. Quanto aos objetivos, é exploratória, porque a comparação com linhagem de </w:t>
       </w:r>
       <w:r>
         <w:rPr>
+          <w:b w:val="0"/>
           <w:i/>
         </w:rPr>
-        <w:t>harness</w:t>
-      </w:r>
-      <w:r>
-        <w:t xml:space="preserve"> fixa não tem precedente publicado. Quanto aos procedimentos, é experimental, com variável independente mani</w:t>
-      </w:r>
-      <w:r>
-        <w:t xml:space="preserve">pulada (o </w:t>
-      </w:r>
-      <w:r>
-        <w:rPr>
+        <w:t xml:space="preserve">harness</w:t>
+      </w:r>
+      <w:r>
+        <w:rPr>
+          <w:b w:val="0"/>
+          <w:i w:val="0"/>
+        </w:rPr>
+        <w:t xml:space="preserve"> fixa não tem precedente publicado. Quanto aos procedimentos, é experimental, com variável independente manipulada (o </w:t>
+      </w:r>
+      <w:r>
+        <w:rPr>
+          <w:b w:val="0"/>
           <w:i/>
         </w:rPr>
-        <w:t>harness</w:t>
-      </w:r>
-      <w:r>
-        <w:t>), variáveis controladas (modelo, tarefa e limites) e um grupo de controle. Quanto ao método, é dedutivo, porque parte de hipóteses declaradas antes da coleta e as submete a teste (Gil, 2022; Prodanov; Freitas, 2013).</w:t>
+        <w:t xml:space="preserve">harness</w:t>
+      </w:r>
+      <w:r>
+        <w:rPr>
+          <w:b w:val="0"/>
+          <w:i w:val="0"/>
+        </w:rPr>
+        <w:t xml:space="preserve">), variáveis controladas (modelo, tarefa e limites) e um grupo de controle. Quanto ao método, é dedutivo, porque parte de hipóteses declaradas antes da coleta e as submete a teste (Gil, 2022; Prodanov; Freitas, 2013).</w:t>
       </w:r>
     </w:p>
     <w:p>
@@ -1427,74 +1573,109 @@
         <w:jc w:val="both"/>
       </w:pPr>
       <w:r>
+        <w:rPr>
+          <w:b w:val="0"/>
+          <w:i w:val="0"/>
+        </w:rPr>
         <w:t xml:space="preserve">A suíte será composta por 8 tarefas Python do DeepSWE (Huang </w:t>
       </w:r>
       <w:r>
         <w:rPr>
+          <w:b w:val="0"/>
           <w:i/>
         </w:rPr>
-        <w:t>et al.</w:t>
-      </w:r>
-      <w:r>
-        <w:t>, 2026), congeladas na adoção e fixada</w:t>
-      </w:r>
-      <w:r>
-        <w:t xml:space="preserve">s por </w:t>
-      </w:r>
-      <w:r>
-        <w:rPr>
+        <w:t xml:space="preserve">et al.</w:t>
+      </w:r>
+      <w:r>
+        <w:rPr>
+          <w:b w:val="0"/>
+          <w:i w:val="0"/>
+        </w:rPr>
+        <w:t xml:space="preserve">, 2026), congeladas na adoção e fixadas por </w:t>
+      </w:r>
+      <w:r>
+        <w:rPr>
+          <w:b w:val="0"/>
           <w:i/>
         </w:rPr>
-        <w:t>commit</w:t>
-      </w:r>
-      <w:r>
+        <w:t xml:space="preserve">commit</w:t>
+      </w:r>
+      <w:r>
+        <w:rPr>
+          <w:b w:val="0"/>
+          <w:i w:val="0"/>
+        </w:rPr>
         <w:t xml:space="preserve"> e por </w:t>
       </w:r>
       <w:r>
         <w:rPr>
+          <w:b w:val="0"/>
           <w:i/>
         </w:rPr>
-        <w:t>hash</w:t>
-      </w:r>
-      <w:r>
+        <w:t xml:space="preserve">hash</w:t>
+      </w:r>
+      <w:r>
+        <w:rPr>
+          <w:b w:val="0"/>
+          <w:i w:val="0"/>
+        </w:rPr>
         <w:t xml:space="preserve"> SHA-256 de cada tarefa. São tarefas de implementação de longo horizonte sobre repositórios reais. O </w:t>
       </w:r>
       <w:r>
         <w:rPr>
+          <w:b w:val="0"/>
           <w:i/>
         </w:rPr>
-        <w:t>benchmark</w:t>
-      </w:r>
-      <w:r>
-        <w:t xml:space="preserve"> completo tem 113 tarefas sobre 91 repositórios, com soluções de referência que tocam cerca de 5,5x mais código que as do S</w:t>
-      </w:r>
-      <w:r>
-        <w:t xml:space="preserve">WE-Bench Pro, outra ordem de grandeza ante o SWE-bench (Jimenez </w:t>
-      </w:r>
-      <w:r>
-        <w:rPr>
+        <w:t xml:space="preserve">benchmark</w:t>
+      </w:r>
+      <w:r>
+        <w:rPr>
+          <w:b w:val="0"/>
+          <w:i w:val="0"/>
+        </w:rPr>
+        <w:t xml:space="preserve"> completo tem 113 tarefas sobre 91 repositórios, com soluções de referência que tocam cerca de 5,5x mais código que as do SWE-Bench Pro. As soluções de referência do DeepSWE acrescentam 668 linhas em média (Huang </w:t>
+      </w:r>
+      <w:r>
+        <w:rPr>
+          <w:b w:val="0"/>
           <w:i/>
         </w:rPr>
-        <w:t>et al.</w:t>
-      </w:r>
-      <w:r>
-        <w:t xml:space="preserve">, 2023). A pontuação adotada será o crédito parcial, a fração de testes aprovados do verificador </w:t>
-      </w:r>
-      <w:r>
-        <w:lastRenderedPageBreak/>
-        <w:t>de cada tarefa. É uma adaptação, porque o DeepSWE grada de forma binária e declara a ausê</w:t>
-      </w:r>
-      <w:r>
-        <w:t xml:space="preserve">ncia de crédito parcial como limitação (Huang </w:t>
-      </w:r>
-      <w:r>
-        <w:rPr>
+        <w:t xml:space="preserve">et al.</w:t>
+      </w:r>
+      <w:r>
+        <w:rPr>
+          <w:b w:val="0"/>
+          <w:i w:val="0"/>
+        </w:rPr>
+        <w:t xml:space="preserve">, 2026, Figura 2), contra 32,8 linhas editadas no SWE-bench (Jimenez </w:t>
+      </w:r>
+      <w:r>
+        <w:rPr>
+          <w:b w:val="0"/>
           <w:i/>
         </w:rPr>
-        <w:t>et al.</w:t>
-      </w:r>
-      <w:r>
-        <w:t>, 2026, §8). Sem ela, um escore binário tenderia a ler zero para todos os braços neste nível de modelo, o que será confirmado nas tarefas-piloto.</w:t>
+        <w:t xml:space="preserve">et al.</w:t>
+      </w:r>
+      <w:r>
+        <w:rPr>
+          <w:b w:val="0"/>
+          <w:i w:val="0"/>
+        </w:rPr>
+        <w:t xml:space="preserve">, 2023), cerca de 20x, razão calculada pelo autor deste projeto. A pontuação adotada será o crédito parcial, a fração de testes aprovados do verificador de cada tarefa. É uma adaptação, porque o DeepSWE grada de forma binária e declara a ausência de crédito parcial como limitação (Huang </w:t>
+      </w:r>
+      <w:r>
+        <w:rPr>
+          <w:b w:val="0"/>
+          <w:i/>
+        </w:rPr>
+        <w:t xml:space="preserve">et al.</w:t>
+      </w:r>
+      <w:r>
+        <w:rPr>
+          <w:b w:val="0"/>
+          <w:i w:val="0"/>
+        </w:rPr>
+        <w:t xml:space="preserve">, 2026, §8). Sem ela, um escore binário tenderia a ler zero para todos os braços neste nível de modelo, o que será confirmado nas tarefas-piloto.</w:t>
       </w:r>
     </w:p>
     <w:p>

</xml_diff>

<commit_message>
docs(pcc): restore six cited entries, drop Liu and Bogdanov
ABNT NBR 6023, NBR 10520, NBR 15287, Gil (2022), IFMT (2022) and
Prodanov; Freitas (2013) were still cited in [47] and [57] after the
list was trimmed; their HEAD text is back in alphabetical order. Liu et
al. (2023) had no citation left and Bogdanov (2026) is market adoption,
outside the harness theme (AGENTS.md); both leave the list.
</commit_message>
<xml_diff>
--- a/dist/projeto-pcc.docx
+++ b/dist/projeto-pcc.docx
@@ -3229,22 +3229,26 @@
       <w:pPr>
         <w:spacing w:after="240" w:line="240" w:lineRule="auto"/>
       </w:pPr>
-      <w:bookmarkStart w:id="0" w:name="_GoBack"/>
-      <w:bookmarkEnd w:id="0"/>
-      <w:r>
-        <w:t xml:space="preserve">BOGDANOV, Mikhail. </w:t>
+      <w:r>
+        <w:rPr>
+          <w:b w:val="0"/>
+          <w:i w:val="0"/>
+        </w:rPr>
+        <w:t xml:space="preserve">ASSOCIAÇÃO BRASILEIRA DE NORMAS TÉCNICAS. </w:t>
       </w:r>
       <w:r>
         <w:rPr>
           <w:b/>
-        </w:rPr>
-        <w:t>AI coding agents</w:t>
-      </w:r>
-      <w:r>
-        <w:t>: adoption trends. 2026. Publicação de blogue institucional (JetBrains Research). Disponível em: https://blog.jetbrains.com/research/2026/08/ai-cod</w:t>
-      </w:r>
-      <w:r>
-        <w:t>ing-agent-adoption-2026/. Acesso em: 11 set. 2026.</w:t>
+          <w:i w:val="0"/>
+        </w:rPr>
+        <w:t xml:space="preserve">ABNT NBR 6023</w:t>
+      </w:r>
+      <w:r>
+        <w:rPr>
+          <w:b w:val="0"/>
+          <w:i w:val="0"/>
+        </w:rPr>
+        <w:t xml:space="preserve">: informação e documentação: referências: elaboração. Rio de Janeiro: ABNT, 2025a.</w:t>
       </w:r>
     </w:p>
     <w:p>
@@ -3252,16 +3256,25 @@
         <w:spacing w:after="240" w:line="240" w:lineRule="auto"/>
       </w:pPr>
       <w:r>
-        <w:t xml:space="preserve">DATACURVE. </w:t>
+        <w:rPr>
+          <w:b w:val="0"/>
+          <w:i w:val="0"/>
+        </w:rPr>
+        <w:t xml:space="preserve">ASSOCIAÇÃO BRASILEIRA DE NORMAS TÉCNICAS. </w:t>
       </w:r>
       <w:r>
         <w:rPr>
           <w:b/>
-        </w:rPr>
-        <w:t>Pier</w:t>
-      </w:r>
-      <w:r>
-        <w:t>: a Harbor fork built for DeepSWE. 2026. Repositório de código. Disponível em: https://github.com/datacurve-ai/pier. Acesso em: 28 ago. 2026.</w:t>
+          <w:i w:val="0"/>
+        </w:rPr>
+        <w:t xml:space="preserve">ABNT NBR 10520</w:t>
+      </w:r>
+      <w:r>
+        <w:rPr>
+          <w:b w:val="0"/>
+          <w:i w:val="0"/>
+        </w:rPr>
+        <w:t xml:space="preserve">: informação e documentação: citações em documentos: apresentação. Rio de Janeiro: ABNT, 2023.</w:t>
       </w:r>
     </w:p>
     <w:p>
@@ -3269,19 +3282,25 @@
         <w:spacing w:after="240" w:line="240" w:lineRule="auto"/>
       </w:pPr>
       <w:r>
-        <w:t xml:space="preserve">EARENDIL. </w:t>
+        <w:rPr>
+          <w:b w:val="0"/>
+          <w:i w:val="0"/>
+        </w:rPr>
+        <w:t xml:space="preserve">ASSOCIAÇÃO BRASILEIRA DE NORMAS TÉCNICAS. </w:t>
       </w:r>
       <w:r>
         <w:rPr>
           <w:b/>
-        </w:rPr>
-        <w:t>Pi, minimal and performant</w:t>
-      </w:r>
-      <w:r>
-        <w:t>. 2026. Publ</w:t>
-      </w:r>
-      <w:r>
-        <w:t>icação de blogue institucional. Disponível em: https://earendil.com/posts/pi-autoresearch-and-databricks/. Acesso em: 28 ago. 2026.</w:t>
+          <w:i w:val="0"/>
+        </w:rPr>
+        <w:t xml:space="preserve">ABNT NBR 15287</w:t>
+      </w:r>
+      <w:r>
+        <w:rPr>
+          <w:b w:val="0"/>
+          <w:i w:val="0"/>
+        </w:rPr>
+        <w:t xml:space="preserve">: informação e documentação: projeto de pesquisa: apresentação. Rio de Janeiro: ABNT, 2025b.</w:t>
       </w:r>
     </w:p>
     <w:p>
@@ -3289,19 +3308,16 @@
         <w:spacing w:after="240" w:line="240" w:lineRule="auto"/>
       </w:pPr>
       <w:r>
-        <w:t xml:space="preserve">HARNESSRANK. </w:t>
+        <w:t xml:space="preserve">DATACURVE. </w:t>
       </w:r>
       <w:r>
         <w:rPr>
           <w:b/>
         </w:rPr>
-        <w:t>HarnessRank</w:t>
-      </w:r>
-      <w:r>
-        <w:t>: coding-age</w:t>
-      </w:r>
-      <w:r>
-        <w:t>nt harness rankings. 2026. Disponível em: https://harnessrank.net/. Acesso em: 28 ago. 2026.</w:t>
+        <w:t>Pier</w:t>
+      </w:r>
+      <w:r>
+        <w:t>: a Harbor fork built for DeepSWE. 2026. Repositório de código. Disponível em: https://github.com/datacurve-ai/pier. Acesso em: 28 ago. 2026.</w:t>
       </w:r>
     </w:p>
     <w:p>
@@ -3309,6 +3325,72 @@
         <w:spacing w:after="240" w:line="240" w:lineRule="auto"/>
       </w:pPr>
       <w:r>
+        <w:t xml:space="preserve">EARENDIL. </w:t>
+      </w:r>
+      <w:r>
+        <w:rPr>
+          <w:b/>
+        </w:rPr>
+        <w:t>Pi, minimal and performant</w:t>
+      </w:r>
+      <w:r>
+        <w:t>. 2026. Publ</w:t>
+      </w:r>
+      <w:r>
+        <w:t>icação de blogue institucional. Disponível em: https://earendil.com/posts/pi-autoresearch-and-databricks/. Acesso em: 28 ago. 2026.</w:t>
+      </w:r>
+    </w:p>
+    <w:p>
+      <w:pPr>
+        <w:spacing w:after="240" w:line="240" w:lineRule="auto"/>
+      </w:pPr>
+      <w:r>
+        <w:rPr>
+          <w:b w:val="0"/>
+          <w:i w:val="0"/>
+        </w:rPr>
+        <w:t xml:space="preserve">GIL, Antonio Carlos. </w:t>
+      </w:r>
+      <w:r>
+        <w:rPr>
+          <w:b/>
+          <w:i w:val="0"/>
+        </w:rPr>
+        <w:t xml:space="preserve">Como elaborar projetos de pesquisa</w:t>
+      </w:r>
+      <w:r>
+        <w:rPr>
+          <w:b w:val="0"/>
+          <w:i w:val="0"/>
+        </w:rPr>
+        <w:t xml:space="preserve">. 7. ed. São Paulo: Atlas, 2022.</w:t>
+      </w:r>
+    </w:p>
+    <w:p>
+      <w:pPr>
+        <w:spacing w:after="240" w:line="240" w:lineRule="auto"/>
+      </w:pPr>
+      <w:r>
+        <w:t xml:space="preserve">HARNESSRANK. </w:t>
+      </w:r>
+      <w:r>
+        <w:rPr>
+          <w:b/>
+        </w:rPr>
+        <w:t>HarnessRank</w:t>
+      </w:r>
+      <w:r>
+        <w:t>: coding-age</w:t>
+      </w:r>
+      <w:r>
+        <w:t>nt harness rankings. 2026. Disponível em: https://harnessrank.net/. Acesso em: 28 ago. 2026.</w:t>
+      </w:r>
+    </w:p>
+    <w:p>
+      <w:pPr>
+        <w:spacing w:after="240" w:line="240" w:lineRule="auto"/>
+      </w:pPr>
+      <w:r>
         <w:lastRenderedPageBreak/>
         <w:t xml:space="preserve">HUANG, Wenqi; LEE, Charley; TNG, Leonard; GE, Serena. </w:t>
       </w:r>
@@ -3339,22 +3421,25 @@
         <w:spacing w:after="240" w:line="240" w:lineRule="auto"/>
       </w:pPr>
       <w:r>
-        <w:t>JIMENEZ, Carlos E.; YANG, John; WETTIG, Alexander; YAO, Shunyu; PEI, Kexin; PRESS, Ofir; NA</w:t>
-      </w:r>
-      <w:r>
-        <w:t xml:space="preserve">RASIMHAN, Karthik. </w:t>
+        <w:rPr>
+          <w:b w:val="0"/>
+          <w:i w:val="0"/>
+        </w:rPr>
+        <w:t xml:space="preserve">INSTITUTO FEDERAL DE EDUCAÇÃO, CIÊNCIA E TECNOLOGIA DE MATO GROSSO. </w:t>
       </w:r>
       <w:r>
         <w:rPr>
           <w:b/>
-        </w:rPr>
-        <w:t>SWE-bench</w:t>
-      </w:r>
-      <w:r>
-        <w:t>: can language models resolve real-world GitHub issues? arXiv:2310.06770, 2023. Trabalho apresentado na International Conference on Learning Representations (ICLR), 2024. Disponível em: https://arxiv.org/abs/2310.06770. Acesso e</w:t>
-      </w:r>
-      <w:r>
-        <w:t>m: 28 ago. 2026.</w:t>
+          <w:i w:val="0"/>
+        </w:rPr>
+        <w:t xml:space="preserve">Normas básicas e padrões para a elaboração do Projeto de Conclusão de Curso (PCC)</w:t>
+      </w:r>
+      <w:r>
+        <w:rPr>
+          <w:b w:val="0"/>
+          <w:i w:val="0"/>
+        </w:rPr>
+        <w:t xml:space="preserve">. Cuiabá: Campus Octayde Jorge da Silva, Departamento de Área de Informática, 2022.</w:t>
       </w:r>
     </w:p>
     <w:p>
@@ -3362,28 +3447,22 @@
         <w:spacing w:after="240" w:line="240" w:lineRule="auto"/>
       </w:pPr>
       <w:r>
-        <w:t xml:space="preserve">KAPOOR, Sayash; STROEBL, Benedikt; SIEGEL, Zachary S.; NADGIR, Nitya; NARAYANAN, Arvind. </w:t>
+        <w:t>JIMENEZ, Carlos E.; YANG, John; WETTIG, Alexander; YAO, Shunyu; PEI, Kexin; PRESS, Ofir; NA</w:t>
+      </w:r>
+      <w:r>
+        <w:t xml:space="preserve">RASIMHAN, Karthik. </w:t>
       </w:r>
       <w:r>
         <w:rPr>
           <w:b/>
         </w:rPr>
-        <w:t>AI agents that matter</w:t>
-      </w:r>
-      <w:r>
-        <w:t xml:space="preserve">. arXiv:2407.01502, 2024. </w:t>
-      </w:r>
-      <w:r>
-        <w:rPr>
-          <w:i/>
-        </w:rPr>
-        <w:t>Preprint</w:t>
-      </w:r>
-      <w:r>
-        <w:t>, não revisado por pares. Disponível em: https://arxiv.org/abs/2407.01502. Acesso em: 28 ago. 2</w:t>
-      </w:r>
-      <w:r>
-        <w:t>026.</w:t>
+        <w:t>SWE-bench</w:t>
+      </w:r>
+      <w:r>
+        <w:t>: can language models resolve real-world GitHub issues? arXiv:2310.06770, 2023. Trabalho apresentado na International Conference on Learning Representations (ICLR), 2024. Disponível em: https://arxiv.org/abs/2310.06770. Acesso e</w:t>
+      </w:r>
+      <w:r>
+        <w:t>m: 28 ago. 2026.</w:t>
       </w:r>
     </w:p>
     <w:p>
@@ -3391,34 +3470,28 @@
         <w:spacing w:after="240" w:line="240" w:lineRule="auto"/>
       </w:pPr>
       <w:r>
-        <w:t xml:space="preserve">KAPOOR, Sayash </w:t>
+        <w:t xml:space="preserve">KAPOOR, Sayash; STROEBL, Benedikt; SIEGEL, Zachary S.; NADGIR, Nitya; NARAYANAN, Arvind. </w:t>
+      </w:r>
+      <w:r>
+        <w:rPr>
+          <w:b/>
+        </w:rPr>
+        <w:t>AI agents that matter</w:t>
+      </w:r>
+      <w:r>
+        <w:t xml:space="preserve">. arXiv:2407.01502, 2024. </w:t>
       </w:r>
       <w:r>
         <w:rPr>
           <w:i/>
         </w:rPr>
-        <w:t>et al.</w:t>
-      </w:r>
-      <w:r>
-        <w:t xml:space="preserve"> </w:t>
-      </w:r>
-      <w:r>
-        <w:rPr>
-          <w:b/>
-        </w:rPr>
-        <w:t>Holistic Agent Leaderboard</w:t>
-      </w:r>
-      <w:r>
-        <w:t xml:space="preserve">: the missing infrastructure for AI agent evaluation. arXiv:2510.11977, 2025. </w:t>
-      </w:r>
-      <w:r>
-        <w:rPr>
-          <w:i/>
-        </w:rPr>
         <w:t>Preprint</w:t>
       </w:r>
       <w:r>
-        <w:t>, não revisado por pares. Disponível em: https://arxiv.org/abs/2510.11977. Acesso em: 28 ago. 2026.</w:t>
+        <w:t>, não revisado por pares. Disponível em: https://arxiv.org/abs/2407.01502. Acesso em: 28 ago. 2</w:t>
+      </w:r>
+      <w:r>
+        <w:t>026.</w:t>
       </w:r>
     </w:p>
     <w:p>
@@ -3426,19 +3499,25 @@
         <w:spacing w:after="240" w:line="240" w:lineRule="auto"/>
       </w:pPr>
       <w:r>
-        <w:t>LEE, Yoonho; NAIR</w:t>
-      </w:r>
-      <w:r>
-        <w:t xml:space="preserve">, Roshen; ZHANG, Qizheng; LEE, Kangwook; KHATTAB, Omar; FINN, Chelsea. </w:t>
+        <w:t xml:space="preserve">KAPOOR, Sayash </w:t>
+      </w:r>
+      <w:r>
+        <w:rPr>
+          <w:i/>
+        </w:rPr>
+        <w:t>et al.</w:t>
+      </w:r>
+      <w:r>
+        <w:t xml:space="preserve"> </w:t>
       </w:r>
       <w:r>
         <w:rPr>
           <w:b/>
         </w:rPr>
-        <w:t>Meta-Harness</w:t>
-      </w:r>
-      <w:r>
-        <w:t xml:space="preserve">: end-to-end optimization of model harnesses. arXiv:2603.28052, 2026. </w:t>
+        <w:t>Holistic Agent Leaderboard</w:t>
+      </w:r>
+      <w:r>
+        <w:t xml:space="preserve">: the missing infrastructure for AI agent evaluation. arXiv:2510.11977, 2025. </w:t>
       </w:r>
       <w:r>
         <w:rPr>
@@ -3447,10 +3526,7 @@
         <w:t>Preprint</w:t>
       </w:r>
       <w:r>
-        <w:t>, não revisado por pares. Disponível em: https://arxiv.org/abs/2603.28052. Acesso em: 9 set. 20</w:t>
-      </w:r>
-      <w:r>
-        <w:t>26.</w:t>
+        <w:t>, não revisado por pares. Disponível em: https://arxiv.org/abs/2510.11977. Acesso em: 28 ago. 2026.</w:t>
       </w:r>
     </w:p>
     <w:p>
@@ -3458,19 +3534,19 @@
         <w:spacing w:after="240" w:line="240" w:lineRule="auto"/>
       </w:pPr>
       <w:r>
-        <w:t xml:space="preserve">LIN, Jiahang; LIU, Shichun; PAN, Chengjun; LIN, Lizhi; DOU, Shihan; XI, Zhiheng; HUANG, Xuanjing; YAN, Hang; HAN, Zhenhua; GUI, Tao; JIANG, Yu-Gang. </w:t>
+        <w:t>LEE, Yoonho; NAIR</w:t>
+      </w:r>
+      <w:r>
+        <w:t xml:space="preserve">, Roshen; ZHANG, Qizheng; LEE, Kangwook; KHATTAB, Omar; FINN, Chelsea. </w:t>
       </w:r>
       <w:r>
         <w:rPr>
           <w:b/>
         </w:rPr>
-        <w:t>Agentic harness engineering</w:t>
-      </w:r>
-      <w:r>
-        <w:t>: observability-driven automatic evolution of coding-agent harnesses. arXiv:</w:t>
-      </w:r>
-      <w:r>
-        <w:t xml:space="preserve">2604.25850, 2026. </w:t>
+        <w:t>Meta-Harness</w:t>
+      </w:r>
+      <w:r>
+        <w:t xml:space="preserve">: end-to-end optimization of model harnesses. arXiv:2603.28052, 2026. </w:t>
       </w:r>
       <w:r>
         <w:rPr>
@@ -3479,7 +3555,10 @@
         <w:t>Preprint</w:t>
       </w:r>
       <w:r>
-        <w:t>, não revisado por pares. Disponível em: https://arxiv.org/abs/2604.25850. Acesso em: 28 ago. 2026.</w:t>
+        <w:t>, não revisado por pares. Disponível em: https://arxiv.org/abs/2603.28052. Acesso em: 9 set. 20</w:t>
+      </w:r>
+      <w:r>
+        <w:t>26.</w:t>
       </w:r>
     </w:p>
     <w:p>
@@ -3487,16 +3566,28 @@
         <w:spacing w:after="240" w:line="240" w:lineRule="auto"/>
       </w:pPr>
       <w:r>
-        <w:t xml:space="preserve">LIU, Nelson F.; LIN, Kevin; HEWITT, John; PARANJAPE, Ashwin; BEVILACQUA, Michele; PETRONI, Fabio; LIANG, Percy. </w:t>
+        <w:t xml:space="preserve">LIN, Jiahang; LIU, Shichun; PAN, Chengjun; LIN, Lizhi; DOU, Shihan; XI, Zhiheng; HUANG, Xuanjing; YAN, Hang; HAN, Zhenhua; GUI, Tao; JIANG, Yu-Gang. </w:t>
       </w:r>
       <w:r>
         <w:rPr>
           <w:b/>
         </w:rPr>
-        <w:t>Lost in the middle</w:t>
-      </w:r>
-      <w:r>
-        <w:t>: how language models use long contexts. arXiv:2307.03172, 2023. Publicado em Transactions of the Association for Computational Linguistics (TACL). Disponível em: https://arxiv.org/abs/2307.03172. Acesso em: 28 ago. 2026.</w:t>
+        <w:t>Agentic harness engineering</w:t>
+      </w:r>
+      <w:r>
+        <w:t>: observability-driven automatic evolution of coding-agent harnesses. arXiv:</w:t>
+      </w:r>
+      <w:r>
+        <w:t xml:space="preserve">2604.25850, 2026. </w:t>
+      </w:r>
+      <w:r>
+        <w:rPr>
+          <w:i/>
+        </w:rPr>
+        <w:t>Preprint</w:t>
+      </w:r>
+      <w:r>
+        <w:t>, não revisado por pares. Disponível em: https://arxiv.org/abs/2604.25850. Acesso em: 28 ago. 2026.</w:t>
       </w:r>
     </w:p>
     <w:p>
@@ -3584,6 +3675,32 @@
       </w:r>
       <w:r>
         <w:t>. 2026. Documentação do produto. Disponível em: https://opencode.ai/docs/zen/. Acesso em: 28 ago. 2026.</w:t>
+      </w:r>
+    </w:p>
+    <w:p>
+      <w:pPr>
+        <w:spacing w:after="240" w:line="240" w:lineRule="auto"/>
+      </w:pPr>
+      <w:r>
+        <w:rPr>
+          <w:b w:val="0"/>
+          <w:i w:val="0"/>
+        </w:rPr>
+        <w:t xml:space="preserve">PRODANOV, Cleber Cristiano; FREITAS, Ernani Cesar de. </w:t>
+      </w:r>
+      <w:r>
+        <w:rPr>
+          <w:b/>
+          <w:i w:val="0"/>
+        </w:rPr>
+        <w:t xml:space="preserve">Metodologia do trabalho científico</w:t>
+      </w:r>
+      <w:r>
+        <w:rPr>
+          <w:b w:val="0"/>
+          <w:i w:val="0"/>
+        </w:rPr>
+        <w:t xml:space="preserve">: métodos e técnicas da pesquisa e do trabalho acadêmico. 2. ed. Novo Hamburgo: Feevale, 2013. Disponível em: https://www.feevale.br/Comum/midias/0163c988-1f5d-496f-b118-a6e009a7a2f9/E-book%20Metodologia%20do%20Trabalho%20Cientifico.pdf. Acesso em: 28 ago. 2026.</w:t>
       </w:r>
     </w:p>
     <w:p>

</xml_diff>

<commit_message>
docs(pcc): declare the LLM Wiki method in section 3
New paragraph after the research classification: sources surveyed and
audited with the repository's LLM Wiki (immutable raw sources, agent-
written syntheses, append-only log, review queue), author curating and
checking every cited claim against the original. Tool and purpose named
as Portaria CNPq 2.664/2026 art. 9 I c asks; the portaria enters the
reference list as BRASIL (2026), recorded as an authorised off-theme
exception in AGENTS.md and ingested into the wiki.
</commit_message>
<xml_diff>
--- a/dist/projeto-pcc.docx
+++ b/dist/projeto-pcc.docx
@@ -1481,6 +1481,34 @@
           <w:i w:val="0"/>
         </w:rPr>
         <w:t xml:space="preserve">), variáveis controladas (modelo, tarefa e limites) e um grupo de controle. Quanto ao método, é dedutivo, porque parte de hipóteses declaradas antes da coleta e as submete a teste (Gil, 2022; Prodanov; Freitas, 2013).</w:t>
+      </w:r>
+    </w:p>
+    <w:p>
+      <w:pPr>
+        <w:spacing w:after="0" w:line="360" w:lineRule="auto"/>
+        <w:ind w:firstLine="709"/>
+        <w:jc w:val="both"/>
+      </w:pPr>
+      <w:r>
+        <w:rPr>
+          <w:b w:val="0"/>
+          <w:i w:val="0"/>
+        </w:rPr>
+        <w:t xml:space="preserve">O levantamento e a auditoria das fontes deste projeto foram feitos com apoio de um </w:t>
+      </w:r>
+      <w:r>
+        <w:rPr>
+          <w:b w:val="0"/>
+          <w:i/>
+        </w:rPr>
+        <w:t xml:space="preserve">LLM Wiki</w:t>
+      </w:r>
+      <w:r>
+        <w:rPr>
+          <w:b w:val="0"/>
+          <w:i w:val="0"/>
+        </w:rPr>
+        <w:t xml:space="preserve"> mantido no repositório do projeto (YuukiFST, 2026). Nesse arranjo, as fontes brutas ficam guardadas sem alteração, um agente de codificação escreve as páginas de síntese, cada operação entra em um registro cronológico e as dúvidas vão para uma fila de revisão. O autor curou as fontes e revisou cada síntese, e cada afirmação citada neste texto foi conferida na obra original, com o trecho copiado ao lado do veredito. A Portaria CNPq nº 2.664/2026 pede que o uso de inteligência artificial generativa seja declarado com a ferramenta e a finalidade (Brasil, 2026). A ferramenta foi o Claude Code, a finalidade foi a síntese e a conferência de fontes, e o autor responde pelo texto final.</w:t>
       </w:r>
     </w:p>
     <w:p>
@@ -3308,6 +3336,32 @@
         <w:spacing w:after="240" w:line="240" w:lineRule="auto"/>
       </w:pPr>
       <w:r>
+        <w:rPr>
+          <w:b w:val="0"/>
+          <w:i w:val="0"/>
+        </w:rPr>
+        <w:t xml:space="preserve">BRASIL. Conselho Nacional de Desenvolvimento Científico e Tecnológico. </w:t>
+      </w:r>
+      <w:r>
+        <w:rPr>
+          <w:b/>
+          <w:i w:val="0"/>
+        </w:rPr>
+        <w:t xml:space="preserve">Portaria CNPq nº 2.664, de 6 de março de 2026</w:t>
+      </w:r>
+      <w:r>
+        <w:rPr>
+          <w:b w:val="0"/>
+          <w:i w:val="0"/>
+        </w:rPr>
+        <w:t xml:space="preserve">. Institui a Política de Integridade na Atividade Científica do CNPq. Diário Oficial da União: seção 1, Brasília, DF, p. 4, 11 mar. 2026. Disponível em: http://memoria2.cnpq.br/web/guest/view/-/journal_content/56_INSTANCE_0oED/10157/23142775. Acesso em: 11 set. 2026.</w:t>
+      </w:r>
+    </w:p>
+    <w:p>
+      <w:pPr>
+        <w:spacing w:after="240" w:line="240" w:lineRule="auto"/>
+      </w:pPr>
+      <w:r>
         <w:t xml:space="preserve">DATACURVE. </w:t>
       </w:r>
       <w:r>

</xml_diff>

<commit_message>
docs(pcc): order ABNT entries by year and clean Miller bold run
Review on PR #71: same-author entries follow year order (NBR 10520 2023
before NBR 6023 2025a and NBR 15287 2025b); the Miller title was split
into two adjacent bold runs.
</commit_message>
<xml_diff>
--- a/dist/projeto-pcc.docx
+++ b/dist/projeto-pcc.docx
@@ -3269,14 +3269,14 @@
           <w:b/>
           <w:i w:val="0"/>
         </w:rPr>
-        <w:t xml:space="preserve">ABNT NBR 6023</w:t>
+        <w:t xml:space="preserve">ABNT NBR 10520</w:t>
       </w:r>
       <w:r>
         <w:rPr>
           <w:b w:val="0"/>
           <w:i w:val="0"/>
         </w:rPr>
-        <w:t xml:space="preserve">: informação e documentação: referências: elaboração. Rio de Janeiro: ABNT, 2025a.</w:t>
+        <w:t xml:space="preserve">: informação e documentação: citações em documentos: apresentação. Rio de Janeiro: ABNT, 2023.</w:t>
       </w:r>
     </w:p>
     <w:p>
@@ -3295,14 +3295,14 @@
           <w:b/>
           <w:i w:val="0"/>
         </w:rPr>
-        <w:t xml:space="preserve">ABNT NBR 10520</w:t>
+        <w:t xml:space="preserve">ABNT NBR 6023</w:t>
       </w:r>
       <w:r>
         <w:rPr>
           <w:b w:val="0"/>
           <w:i w:val="0"/>
         </w:rPr>
-        <w:t xml:space="preserve">: informação e documentação: citações em documentos: apresentação. Rio de Janeiro: ABNT, 2023.</w:t>
+        <w:t xml:space="preserve">: informação e documentação: referências: elaboração. Rio de Janeiro: ABNT, 2025a.</w:t>
       </w:r>
     </w:p>
     <w:p>
@@ -3649,31 +3649,39 @@
         <w:spacing w:after="240" w:line="240" w:lineRule="auto"/>
       </w:pPr>
       <w:r>
+        <w:rPr>
+          <w:b w:val="0"/>
+          <w:i w:val="0"/>
+        </w:rPr>
         <w:t xml:space="preserve">MILLER, Evan. </w:t>
       </w:r>
       <w:r>
         <w:rPr>
           <w:b/>
-        </w:rPr>
-        <w:t>Adding error bars to</w:t>
-      </w:r>
-      <w:r>
-        <w:rPr>
-          <w:b/>
-        </w:rPr>
-        <w:t xml:space="preserve"> evals</w:t>
-      </w:r>
-      <w:r>
+          <w:i w:val="0"/>
+        </w:rPr>
+        <w:t xml:space="preserve">Adding error bars to evals</w:t>
+      </w:r>
+      <w:r>
+        <w:rPr>
+          <w:b w:val="0"/>
+          <w:i w:val="0"/>
+        </w:rPr>
         <w:t xml:space="preserve">: a statistical approach to language model evaluations. arXiv:2411.00640, 2024. </w:t>
       </w:r>
       <w:r>
         <w:rPr>
+          <w:b w:val="0"/>
           <w:i/>
         </w:rPr>
-        <w:t>Preprint</w:t>
-      </w:r>
-      <w:r>
-        <w:t>, não revisado por pares. Disponível em: https://arxiv.org/abs/2411.00640. Acesso em: 28 ago. 2026.</w:t>
+        <w:t xml:space="preserve">Preprint</w:t>
+      </w:r>
+      <w:r>
+        <w:rPr>
+          <w:b w:val="0"/>
+          <w:i w:val="0"/>
+        </w:rPr>
+        <w:t xml:space="preserve">, não revisado por pares. Disponível em: https://arxiv.org/abs/2411.00640. Acesso em: 28 ago. 2026.</w:t>
       </w:r>
     </w:p>
     <w:p>

</xml_diff>

<commit_message>
feat(slides): orbital harness scene, stable labels, September defense
Rebuild the 'O que e um harness' scene with orbital consoles, metering proxy and energy ring; premium detail panel and chips; convergent label layout fixing flicker; fixed-stage hardening for viewports under 1920px. Move the defense marker to September in the slide Gantt and in Tabela 2 of dist/projeto-pcc.docx. Also commits pending author edits clarifying this is a projeto de pesquisa (Metodologia Cientifica), not a PCC, plus the deck Vite source and the frontend-slides skill.
</commit_message>
<xml_diff>
--- a/dist/projeto-pcc.docx
+++ b/dist/projeto-pcc.docx
@@ -1,6 +1,6 @@
 
 <file path=word/document.xml><?xml version="1.0" encoding="utf-8"?>
-<w:document xmlns:wpc="http://schemas.microsoft.com/office/word/2010/wordprocessingCanvas" xmlns:cx="http://schemas.microsoft.com/office/drawing/2014/chartex" xmlns:cx1="http://schemas.microsoft.com/office/drawing/2015/9/8/chartex" xmlns:cx2="http://schemas.microsoft.com/office/drawing/2015/10/21/chartex" xmlns:cx3="http://schemas.microsoft.com/office/drawing/2016/5/9/chartex" xmlns:cx4="http://schemas.microsoft.com/office/drawing/2016/5/10/chartex" xmlns:cx5="http://schemas.microsoft.com/office/drawing/2016/5/11/chartex" xmlns:cx6="http://schemas.microsoft.com/office/drawing/2016/5/12/chartex" xmlns:cx7="http://schemas.microsoft.com/office/drawing/2016/5/13/chartex" xmlns:cx8="http://schemas.microsoft.com/office/drawing/2016/5/14/chartex" xmlns:mc="http://schemas.openxmlformats.org/markup-compatibility/2006" xmlns:aink="http://schemas.microsoft.com/office/drawing/2016/ink" xmlns:am3d="http://schemas.microsoft.com/office/drawing/2017/model3d" xmlns:o="urn:schemas-microsoft-com:office:office" xmlns:r="http://schemas.openxmlformats.org/officeDocument/2006/relationships" xmlns:m="http://schemas.openxmlformats.org/officeDocument/2006/math" xmlns:v="urn:schemas-microsoft-com:vml" xmlns:wp14="http://schemas.microsoft.com/office/word/2010/wordprocessingDrawing" xmlns:wp="http://schemas.openxmlformats.org/drawingml/2006/wordprocessingDrawing" xmlns:w10="urn:schemas-microsoft-com:office:word" xmlns:w="http://schemas.openxmlformats.org/wordprocessingml/2006/main" xmlns:w14="http://schemas.microsoft.com/office/word/2010/wordml" xmlns:w15="http://schemas.microsoft.com/office/word/2012/wordml" xmlns:w16cex="http://schemas.microsoft.com/office/word/2018/wordml/cex" xmlns:w16cid="http://schemas.microsoft.com/office/word/2016/wordml/cid" xmlns:w16="http://schemas.microsoft.com/office/word/2018/wordml" xmlns:w16se="http://schemas.microsoft.com/office/word/2015/wordml/symex" xmlns:wpg="http://schemas.microsoft.com/office/word/2010/wordprocessingGroup" xmlns:wpi="http://schemas.microsoft.com/office/word/2010/wordprocessingInk" xmlns:wne="http://schemas.microsoft.com/office/word/2006/wordml" xmlns:wps="http://schemas.microsoft.com/office/word/2010/wordprocessingShape" mc:Ignorable="w14 w15 w16se w16cid w16 w16cex wp14">
+<w:document xmlns:mc="http://schemas.openxmlformats.org/markup-compatibility/2006" xmlns:r="http://schemas.openxmlformats.org/officeDocument/2006/relationships" xmlns:w="http://schemas.openxmlformats.org/wordprocessingml/2006/main" mc:Ignorable="w14 w15 w16se w16cid w16 w16cex wp14">
   <w:body>
     <w:p>
       <w:pPr>
@@ -1494,7 +1494,7 @@
           <w:b w:val="0"/>
           <w:i w:val="0"/>
         </w:rPr>
-        <w:t xml:space="preserve">O levantamento e a auditoria das fontes deste projeto foram feitos com apoio de um </w:t>
+        <w:t xml:space="preserve">O levantamento das fontes deste projeto foi feito com apoio de um </w:t>
       </w:r>
       <w:r>
         <w:rPr>
@@ -1508,7 +1508,7 @@
           <w:b w:val="0"/>
           <w:i w:val="0"/>
         </w:rPr>
-        <w:t xml:space="preserve"> mantido no repositório do projeto (YuukiFST, 2026). Nesse arranjo, as fontes brutas ficam guardadas sem alteração, um agente de codificação escreve as páginas de síntese, cada operação entra em um registro cronológico e as dúvidas vão para uma fila de revisão. O autor curou as fontes e revisou cada síntese, e cada afirmação citada neste texto foi conferida na obra original, com o trecho copiado ao lado do veredito. A Portaria CNPq nº 2.664/2026 pede que o uso de inteligência artificial generativa seja declarado com a ferramenta e a finalidade (Brasil, 2026). A ferramenta foi o Claude Code, a finalidade foi a síntese e a conferência de fontes, e o autor responde pelo texto final.</w:t>
+        <w:t xml:space="preserve"> mantido no repositório do projeto (YuukiFST, 2026). Nesse arranjo, as fontes brutas ficam guardadas sem alteração, um agente de codificação escreve as páginas de síntese, cada operação entra em um registro cronológico e as dúvidas vão para uma fila de revisão. O autor curou as fontes e revisou cada síntese, e cada afirmação citada neste texto foi conferida na obra original, com o trecho copiado ao lado do veredito. A Portaria CNPq nº 2.664/2026 pede que o uso de inteligência artificial generativa seja declarado com a ferramenta e a finalidade (Brasil, 2026). A ferramenta foi o Claude Code, e a finalidade foi que o agente entendesse o tema do projeto e ajudasse a buscar mais artigos sobre o tema escolhido. O autor responde pelo texto final.</w:t>
       </w:r>
     </w:p>
     <w:p>
@@ -2191,10 +2191,11 @@
         <w:jc w:val="both"/>
       </w:pPr>
       <w:r>
-        <w:t>A cota gratuita deve ser o limite vinculante, então a cadência prevista é de um lote da matriz por dia e o calendário se estende por semanas. A folga está concentrada na execução da matriz e nos por</w:t>
-      </w:r>
-      <w:r>
-        <w:t>tões de confiabilidade dos braços, onde está o risco. Os meses vão de setembro de 2026, mês de entrega deste projeto, a janeiro de 2027.</w:t>
+        <w:rPr>
+          <w:b w:val="0"/>
+          <w:i w:val="0"/>
+        </w:rPr>
+        <w:t xml:space="preserve">A cota gratuita deve ser o limite vinculante, então a cadência prevista é de um lote da matriz por dia e o calendário se estende por semanas. A folga está concentrada na execução da matriz e nos portões de confiabilidade dos braços, onde está o risco. Os meses vão de agosto de 2026 a janeiro de 2027. A escrita deste projeto foi concluída em 11 de setembro de 2026, mês de entrega, e os experimentos práticos ocorrem a partir de outubro.</w:t>
       </w:r>
     </w:p>
     <w:p>
@@ -2219,6 +2220,7 @@
       </w:tblPr>
       <w:tblGrid>
         <w:gridCol w:w="4309"/>
+        <w:gridCol w:w="952"/>
         <w:gridCol w:w="952"/>
         <w:gridCol w:w="952"/>
         <w:gridCol w:w="952"/>
@@ -2260,7 +2262,7 @@
                 <w:b/>
                 <w:sz w:val="18"/>
               </w:rPr>
-              <w:t>SETEMBRO</w:t>
+              <w:t xml:space="preserve">AGOSTO</w:t>
             </w:r>
           </w:p>
         </w:tc>
@@ -2278,7 +2280,7 @@
                 <w:b/>
                 <w:sz w:val="18"/>
               </w:rPr>
-              <w:t>OUTUBRO</w:t>
+              <w:t xml:space="preserve">SETEMBRO</w:t>
             </w:r>
           </w:p>
         </w:tc>
@@ -2296,7 +2298,7 @@
                 <w:b/>
                 <w:sz w:val="18"/>
               </w:rPr>
-              <w:t>NOVEMBRO</w:t>
+              <w:t xml:space="preserve">OUTUBRO</w:t>
             </w:r>
           </w:p>
         </w:tc>
@@ -2314,7 +2316,7 @@
                 <w:b/>
                 <w:sz w:val="18"/>
               </w:rPr>
-              <w:t>DEZEMBRO</w:t>
+              <w:t xml:space="preserve">NOVEMBRO</w:t>
             </w:r>
           </w:p>
         </w:tc>
@@ -2332,7 +2334,25 @@
                 <w:b/>
                 <w:sz w:val="18"/>
               </w:rPr>
-              <w:t>JANEIRO</w:t>
+              <w:t xml:space="preserve">DEZEMBRO</w:t>
+            </w:r>
+          </w:p>
+        </w:tc>
+        <w:tc>
+          <w:tcPr>
+            <w:tcW w:w="952" w:type="dxa"/>
+          </w:tcPr>
+          <w:p>
+            <w:pPr>
+              <w:spacing w:before="20" w:after="20"/>
+              <w:jc w:val="center"/>
+            </w:pPr>
+            <w:r>
+              <w:rPr>
+                <w:b/>
+                <w:sz w:val="18"/>
+              </w:rPr>
+              <w:t xml:space="preserve">JANEIRO</w:t>
             </w:r>
           </w:p>
         </w:tc>
@@ -2376,7 +2396,7 @@
               <w:rPr>
                 <w:sz w:val="18"/>
               </w:rPr>
-              <w:t>X</w:t>
+              <w:t xml:space="preserve">X</w:t>
             </w:r>
           </w:p>
         </w:tc>
@@ -2393,7 +2413,7 @@
               <w:rPr>
                 <w:sz w:val="18"/>
               </w:rPr>
-              <w:t>X</w:t>
+              <w:t xml:space="preserve">X</w:t>
             </w:r>
           </w:p>
         </w:tc>
@@ -2406,6 +2426,12 @@
               <w:spacing w:before="20" w:after="20"/>
               <w:jc w:val="center"/>
             </w:pPr>
+            <w:r>
+              <w:rPr>
+                <w:sz w:val="18"/>
+              </w:rPr>
+              <w:t xml:space="preserve"/>
+            </w:r>
           </w:p>
         </w:tc>
         <w:tc>
@@ -2417,6 +2443,10 @@
               <w:spacing w:before="20" w:after="20"/>
               <w:jc w:val="center"/>
             </w:pPr>
+            <w:r>
+              <w:rPr/>
+              <w:t xml:space="preserve"/>
+            </w:r>
           </w:p>
         </w:tc>
         <w:tc>
@@ -2428,6 +2458,25 @@
               <w:spacing w:before="20" w:after="20"/>
               <w:jc w:val="center"/>
             </w:pPr>
+            <w:r>
+              <w:rPr/>
+              <w:t xml:space="preserve"/>
+            </w:r>
+          </w:p>
+        </w:tc>
+        <w:tc>
+          <w:tcPr>
+            <w:tcW w:w="952" w:type="dxa"/>
+          </w:tcPr>
+          <w:p>
+            <w:pPr>
+              <w:spacing w:before="20" w:after="20"/>
+              <w:jc w:val="center"/>
+            </w:pPr>
+            <w:r>
+              <w:rPr/>
+              <w:t xml:space="preserve"/>
+            </w:r>
           </w:p>
         </w:tc>
       </w:tr>
@@ -2464,7 +2513,7 @@
               <w:rPr>
                 <w:sz w:val="18"/>
               </w:rPr>
-              <w:t>X</w:t>
+              <w:t xml:space="preserve">X</w:t>
             </w:r>
           </w:p>
         </w:tc>
@@ -2481,7 +2530,7 @@
               <w:rPr>
                 <w:sz w:val="18"/>
               </w:rPr>
-              <w:t>X</w:t>
+              <w:t xml:space="preserve">X</w:t>
             </w:r>
           </w:p>
         </w:tc>
@@ -2494,6 +2543,12 @@
               <w:spacing w:before="20" w:after="20"/>
               <w:jc w:val="center"/>
             </w:pPr>
+            <w:r>
+              <w:rPr>
+                <w:sz w:val="18"/>
+              </w:rPr>
+              <w:t xml:space="preserve"/>
+            </w:r>
           </w:p>
         </w:tc>
         <w:tc>
@@ -2505,6 +2560,10 @@
               <w:spacing w:before="20" w:after="20"/>
               <w:jc w:val="center"/>
             </w:pPr>
+            <w:r>
+              <w:rPr/>
+              <w:t xml:space="preserve"/>
+            </w:r>
           </w:p>
         </w:tc>
         <w:tc>
@@ -2516,6 +2575,25 @@
               <w:spacing w:before="20" w:after="20"/>
               <w:jc w:val="center"/>
             </w:pPr>
+            <w:r>
+              <w:rPr/>
+              <w:t xml:space="preserve"/>
+            </w:r>
+          </w:p>
+        </w:tc>
+        <w:tc>
+          <w:tcPr>
+            <w:tcW w:w="952" w:type="dxa"/>
+          </w:tcPr>
+          <w:p>
+            <w:pPr>
+              <w:spacing w:before="20" w:after="20"/>
+              <w:jc w:val="center"/>
+            </w:pPr>
+            <w:r>
+              <w:rPr/>
+              <w:t xml:space="preserve"/>
+            </w:r>
           </w:p>
         </w:tc>
       </w:tr>
@@ -2548,6 +2626,10 @@
               <w:spacing w:before="20" w:after="20"/>
               <w:jc w:val="center"/>
             </w:pPr>
+            <w:r>
+              <w:rPr/>
+              <w:t xml:space="preserve"/>
+            </w:r>
           </w:p>
         </w:tc>
         <w:tc>
@@ -2560,10 +2642,8 @@
               <w:jc w:val="center"/>
             </w:pPr>
             <w:r>
-              <w:rPr>
-                <w:sz w:val="18"/>
-              </w:rPr>
-              <w:t>X</w:t>
+              <w:rPr/>
+              <w:t xml:space="preserve"/>
             </w:r>
           </w:p>
         </w:tc>
@@ -2580,7 +2660,7 @@
               <w:rPr>
                 <w:sz w:val="18"/>
               </w:rPr>
-              <w:t>X</w:t>
+              <w:t xml:space="preserve">X</w:t>
             </w:r>
           </w:p>
         </w:tc>
@@ -2593,6 +2673,12 @@
               <w:spacing w:before="20" w:after="20"/>
               <w:jc w:val="center"/>
             </w:pPr>
+            <w:r>
+              <w:rPr>
+                <w:sz w:val="18"/>
+              </w:rPr>
+              <w:t xml:space="preserve">X</w:t>
+            </w:r>
           </w:p>
         </w:tc>
         <w:tc>
@@ -2604,6 +2690,25 @@
               <w:spacing w:before="20" w:after="20"/>
               <w:jc w:val="center"/>
             </w:pPr>
+            <w:r>
+              <w:rPr/>
+              <w:t xml:space="preserve"/>
+            </w:r>
+          </w:p>
+        </w:tc>
+        <w:tc>
+          <w:tcPr>
+            <w:tcW w:w="952" w:type="dxa"/>
+          </w:tcPr>
+          <w:p>
+            <w:pPr>
+              <w:spacing w:before="20" w:after="20"/>
+              <w:jc w:val="center"/>
+            </w:pPr>
+            <w:r>
+              <w:rPr/>
+              <w:t xml:space="preserve"/>
+            </w:r>
           </w:p>
         </w:tc>
       </w:tr>
@@ -2636,6 +2741,10 @@
               <w:spacing w:before="20" w:after="20"/>
               <w:jc w:val="center"/>
             </w:pPr>
+            <w:r>
+              <w:rPr/>
+              <w:t xml:space="preserve">X</w:t>
+            </w:r>
           </w:p>
         </w:tc>
         <w:tc>
@@ -2647,6 +2756,25 @@
               <w:spacing w:before="20" w:after="20"/>
               <w:jc w:val="center"/>
             </w:pPr>
+            <w:r>
+              <w:rPr/>
+              <w:t xml:space="preserve">X</w:t>
+            </w:r>
+          </w:p>
+        </w:tc>
+        <w:tc>
+          <w:tcPr>
+            <w:tcW w:w="952" w:type="dxa"/>
+          </w:tcPr>
+          <w:p>
+            <w:pPr>
+              <w:spacing w:before="20" w:after="20"/>
+              <w:jc w:val="center"/>
+            </w:pPr>
+            <w:r>
+              <w:rPr/>
+              <w:t xml:space="preserve"/>
+            </w:r>
           </w:p>
         </w:tc>
         <w:tc>
@@ -2662,7 +2790,7 @@
               <w:rPr>
                 <w:sz w:val="18"/>
               </w:rPr>
-              <w:t>X</w:t>
+              <w:t xml:space="preserve"/>
             </w:r>
           </w:p>
         </w:tc>
@@ -2675,6 +2803,10 @@
               <w:spacing w:before="20" w:after="20"/>
               <w:jc w:val="center"/>
             </w:pPr>
+            <w:r>
+              <w:rPr/>
+              <w:t xml:space="preserve"/>
+            </w:r>
           </w:p>
         </w:tc>
         <w:tc>
@@ -2686,6 +2818,10 @@
               <w:spacing w:before="20" w:after="20"/>
               <w:jc w:val="center"/>
             </w:pPr>
+            <w:r>
+              <w:rPr/>
+              <w:t xml:space="preserve"/>
+            </w:r>
           </w:p>
         </w:tc>
       </w:tr>
@@ -2718,6 +2854,10 @@
               <w:spacing w:before="20" w:after="20"/>
               <w:jc w:val="center"/>
             </w:pPr>
+            <w:r>
+              <w:rPr/>
+              <w:t xml:space="preserve">X</w:t>
+            </w:r>
           </w:p>
         </w:tc>
         <w:tc>
@@ -2729,6 +2869,25 @@
               <w:spacing w:before="20" w:after="20"/>
               <w:jc w:val="center"/>
             </w:pPr>
+            <w:r>
+              <w:rPr/>
+              <w:t xml:space="preserve">X</w:t>
+            </w:r>
+          </w:p>
+        </w:tc>
+        <w:tc>
+          <w:tcPr>
+            <w:tcW w:w="952" w:type="dxa"/>
+          </w:tcPr>
+          <w:p>
+            <w:pPr>
+              <w:spacing w:before="20" w:after="20"/>
+              <w:jc w:val="center"/>
+            </w:pPr>
+            <w:r>
+              <w:rPr/>
+              <w:t xml:space="preserve"/>
+            </w:r>
           </w:p>
         </w:tc>
         <w:tc>
@@ -2744,7 +2903,7 @@
               <w:rPr>
                 <w:sz w:val="18"/>
               </w:rPr>
-              <w:t>X</w:t>
+              <w:t xml:space="preserve"/>
             </w:r>
           </w:p>
         </w:tc>
@@ -2757,6 +2916,10 @@
               <w:spacing w:before="20" w:after="20"/>
               <w:jc w:val="center"/>
             </w:pPr>
+            <w:r>
+              <w:rPr/>
+              <w:t xml:space="preserve"/>
+            </w:r>
           </w:p>
         </w:tc>
         <w:tc>
@@ -2768,6 +2931,10 @@
               <w:spacing w:before="20" w:after="20"/>
               <w:jc w:val="center"/>
             </w:pPr>
+            <w:r>
+              <w:rPr/>
+              <w:t xml:space="preserve"/>
+            </w:r>
           </w:p>
         </w:tc>
       </w:tr>
@@ -2800,17 +2967,10 @@
               <w:spacing w:before="20" w:after="20"/>
               <w:jc w:val="center"/>
             </w:pPr>
-          </w:p>
-        </w:tc>
-        <w:tc>
-          <w:tcPr>
-            <w:tcW w:w="952" w:type="dxa"/>
-          </w:tcPr>
-          <w:p>
-            <w:pPr>
-              <w:spacing w:before="20" w:after="20"/>
-              <w:jc w:val="center"/>
-            </w:pPr>
+            <w:r>
+              <w:rPr/>
+              <w:t xml:space="preserve">X</w:t>
+            </w:r>
           </w:p>
         </w:tc>
         <w:tc>
@@ -2823,10 +2983,23 @@
               <w:jc w:val="center"/>
             </w:pPr>
             <w:r>
-              <w:rPr>
-                <w:sz w:val="18"/>
-              </w:rPr>
-              <w:t>X</w:t>
+              <w:rPr/>
+              <w:t xml:space="preserve">X</w:t>
+            </w:r>
+          </w:p>
+        </w:tc>
+        <w:tc>
+          <w:tcPr>
+            <w:tcW w:w="952" w:type="dxa"/>
+          </w:tcPr>
+          <w:p>
+            <w:pPr>
+              <w:spacing w:before="20" w:after="20"/>
+              <w:jc w:val="center"/>
+            </w:pPr>
+            <w:r>
+              <w:rPr/>
+              <w:t xml:space="preserve"/>
             </w:r>
           </w:p>
         </w:tc>
@@ -2843,7 +3016,7 @@
               <w:rPr>
                 <w:sz w:val="18"/>
               </w:rPr>
-              <w:t>X</w:t>
+              <w:t xml:space="preserve"/>
             </w:r>
           </w:p>
         </w:tc>
@@ -2856,6 +3029,27 @@
               <w:spacing w:before="20" w:after="20"/>
               <w:jc w:val="center"/>
             </w:pPr>
+            <w:r>
+              <w:rPr>
+                <w:sz w:val="18"/>
+              </w:rPr>
+              <w:t xml:space="preserve"/>
+            </w:r>
+          </w:p>
+        </w:tc>
+        <w:tc>
+          <w:tcPr>
+            <w:tcW w:w="952" w:type="dxa"/>
+          </w:tcPr>
+          <w:p>
+            <w:pPr>
+              <w:spacing w:before="20" w:after="20"/>
+              <w:jc w:val="center"/>
+            </w:pPr>
+            <w:r>
+              <w:rPr/>
+              <w:t xml:space="preserve"/>
+            </w:r>
           </w:p>
         </w:tc>
       </w:tr>
@@ -2894,28 +3088,10 @@
               <w:spacing w:before="20" w:after="20"/>
               <w:jc w:val="center"/>
             </w:pPr>
-          </w:p>
-        </w:tc>
-        <w:tc>
-          <w:tcPr>
-            <w:tcW w:w="952" w:type="dxa"/>
-          </w:tcPr>
-          <w:p>
-            <w:pPr>
-              <w:spacing w:before="20" w:after="20"/>
-              <w:jc w:val="center"/>
-            </w:pPr>
-          </w:p>
-        </w:tc>
-        <w:tc>
-          <w:tcPr>
-            <w:tcW w:w="952" w:type="dxa"/>
-          </w:tcPr>
-          <w:p>
-            <w:pPr>
-              <w:spacing w:before="20" w:after="20"/>
-              <w:jc w:val="center"/>
-            </w:pPr>
+            <w:r>
+              <w:rPr/>
+              <w:t xml:space="preserve"/>
+            </w:r>
           </w:p>
         </w:tc>
         <w:tc>
@@ -2928,10 +3104,38 @@
               <w:jc w:val="center"/>
             </w:pPr>
             <w:r>
-              <w:rPr>
-                <w:sz w:val="18"/>
-              </w:rPr>
-              <w:t>X</w:t>
+              <w:rPr/>
+              <w:t xml:space="preserve"/>
+            </w:r>
+          </w:p>
+        </w:tc>
+        <w:tc>
+          <w:tcPr>
+            <w:tcW w:w="952" w:type="dxa"/>
+          </w:tcPr>
+          <w:p>
+            <w:pPr>
+              <w:spacing w:before="20" w:after="20"/>
+              <w:jc w:val="center"/>
+            </w:pPr>
+            <w:r>
+              <w:rPr/>
+              <w:t xml:space="preserve"/>
+            </w:r>
+          </w:p>
+        </w:tc>
+        <w:tc>
+          <w:tcPr>
+            <w:tcW w:w="952" w:type="dxa"/>
+          </w:tcPr>
+          <w:p>
+            <w:pPr>
+              <w:spacing w:before="20" w:after="20"/>
+              <w:jc w:val="center"/>
+            </w:pPr>
+            <w:r>
+              <w:rPr/>
+              <w:t xml:space="preserve"/>
             </w:r>
           </w:p>
         </w:tc>
@@ -2948,7 +3152,24 @@
               <w:rPr>
                 <w:sz w:val="18"/>
               </w:rPr>
-              <w:t>X</w:t>
+              <w:t xml:space="preserve">X</w:t>
+            </w:r>
+          </w:p>
+        </w:tc>
+        <w:tc>
+          <w:tcPr>
+            <w:tcW w:w="952" w:type="dxa"/>
+          </w:tcPr>
+          <w:p>
+            <w:pPr>
+              <w:spacing w:before="20" w:after="20"/>
+              <w:jc w:val="center"/>
+            </w:pPr>
+            <w:r>
+              <w:rPr>
+                <w:sz w:val="18"/>
+              </w:rPr>
+              <w:t xml:space="preserve">X</w:t>
             </w:r>
           </w:p>
         </w:tc>
@@ -2982,6 +3203,10 @@
               <w:spacing w:before="20" w:after="20"/>
               <w:jc w:val="center"/>
             </w:pPr>
+            <w:r>
+              <w:rPr/>
+              <w:t xml:space="preserve"/>
+            </w:r>
           </w:p>
         </w:tc>
         <w:tc>
@@ -2993,6 +3218,10 @@
               <w:spacing w:before="20" w:after="20"/>
               <w:jc w:val="center"/>
             </w:pPr>
+            <w:r>
+              <w:rPr/>
+              <w:t xml:space="preserve"/>
+            </w:r>
           </w:p>
         </w:tc>
         <w:tc>
@@ -3004,6 +3233,10 @@
               <w:spacing w:before="20" w:after="20"/>
               <w:jc w:val="center"/>
             </w:pPr>
+            <w:r>
+              <w:rPr/>
+              <w:t xml:space="preserve"/>
+            </w:r>
           </w:p>
         </w:tc>
         <w:tc>
@@ -3015,6 +3248,25 @@
               <w:spacing w:before="20" w:after="20"/>
               <w:jc w:val="center"/>
             </w:pPr>
+            <w:r>
+              <w:rPr/>
+              <w:t xml:space="preserve"/>
+            </w:r>
+          </w:p>
+        </w:tc>
+        <w:tc>
+          <w:tcPr>
+            <w:tcW w:w="952" w:type="dxa"/>
+          </w:tcPr>
+          <w:p>
+            <w:pPr>
+              <w:spacing w:before="20" w:after="20"/>
+              <w:jc w:val="center"/>
+            </w:pPr>
+            <w:r>
+              <w:rPr/>
+              <w:t xml:space="preserve"/>
+            </w:r>
           </w:p>
         </w:tc>
         <w:tc>
@@ -3030,7 +3282,7 @@
               <w:rPr>
                 <w:sz w:val="18"/>
               </w:rPr>
-              <w:t>X</w:t>
+              <w:t xml:space="preserve">X</w:t>
             </w:r>
           </w:p>
         </w:tc>
@@ -3064,6 +3316,10 @@
               <w:spacing w:before="20" w:after="20"/>
               <w:jc w:val="center"/>
             </w:pPr>
+            <w:r>
+              <w:rPr/>
+              <w:t xml:space="preserve">X</w:t>
+            </w:r>
           </w:p>
         </w:tc>
         <w:tc>
@@ -3075,6 +3331,10 @@
               <w:spacing w:before="20" w:after="20"/>
               <w:jc w:val="center"/>
             </w:pPr>
+            <w:r>
+              <w:rPr/>
+              <w:t xml:space="preserve">X</w:t>
+            </w:r>
           </w:p>
         </w:tc>
         <w:tc>
@@ -3086,6 +3346,10 @@
               <w:spacing w:before="20" w:after="20"/>
               <w:jc w:val="center"/>
             </w:pPr>
+            <w:r>
+              <w:rPr/>
+              <w:t xml:space="preserve"/>
+            </w:r>
           </w:p>
         </w:tc>
         <w:tc>
@@ -3097,6 +3361,25 @@
               <w:spacing w:before="20" w:after="20"/>
               <w:jc w:val="center"/>
             </w:pPr>
+            <w:r>
+              <w:rPr/>
+              <w:t xml:space="preserve"/>
+            </w:r>
+          </w:p>
+        </w:tc>
+        <w:tc>
+          <w:tcPr>
+            <w:tcW w:w="952" w:type="dxa"/>
+          </w:tcPr>
+          <w:p>
+            <w:pPr>
+              <w:spacing w:before="20" w:after="20"/>
+              <w:jc w:val="center"/>
+            </w:pPr>
+            <w:r>
+              <w:rPr/>
+              <w:t xml:space="preserve"/>
+            </w:r>
           </w:p>
         </w:tc>
         <w:tc>
@@ -3112,7 +3395,7 @@
               <w:rPr>
                 <w:sz w:val="18"/>
               </w:rPr>
-              <w:t>X</w:t>
+              <w:t xml:space="preserve"/>
             </w:r>
           </w:p>
         </w:tc>
@@ -3146,39 +3429,10 @@
               <w:spacing w:before="20" w:after="20"/>
               <w:jc w:val="center"/>
             </w:pPr>
-          </w:p>
-        </w:tc>
-        <w:tc>
-          <w:tcPr>
-            <w:tcW w:w="952" w:type="dxa"/>
-          </w:tcPr>
-          <w:p>
-            <w:pPr>
-              <w:spacing w:before="20" w:after="20"/>
-              <w:jc w:val="center"/>
-            </w:pPr>
-          </w:p>
-        </w:tc>
-        <w:tc>
-          <w:tcPr>
-            <w:tcW w:w="952" w:type="dxa"/>
-          </w:tcPr>
-          <w:p>
-            <w:pPr>
-              <w:spacing w:before="20" w:after="20"/>
-              <w:jc w:val="center"/>
-            </w:pPr>
-          </w:p>
-        </w:tc>
-        <w:tc>
-          <w:tcPr>
-            <w:tcW w:w="952" w:type="dxa"/>
-          </w:tcPr>
-          <w:p>
-            <w:pPr>
-              <w:spacing w:before="20" w:after="20"/>
-              <w:jc w:val="center"/>
-            </w:pPr>
+            <w:r>
+              <w:rPr/>
+              <w:t xml:space="preserve"/>
+            </w:r>
           </w:p>
         </w:tc>
         <w:tc>
@@ -3194,7 +3448,73 @@
               <w:rPr>
                 <w:sz w:val="18"/>
               </w:rPr>
-              <w:t>X</w:t>
+              <w:t xml:space="preserve">X</w:t>
+            </w:r>
+            <w:r>
+              <w:rPr/>
+              <w:t xml:space="preserve"/>
+            </w:r>
+          </w:p>
+        </w:tc>
+        <w:tc>
+          <w:tcPr>
+            <w:tcW w:w="952" w:type="dxa"/>
+          </w:tcPr>
+          <w:p>
+            <w:pPr>
+              <w:spacing w:before="20" w:after="20"/>
+              <w:jc w:val="center"/>
+            </w:pPr>
+            <w:r>
+              <w:rPr/>
+              <w:t xml:space="preserve"/>
+            </w:r>
+          </w:p>
+        </w:tc>
+        <w:tc>
+          <w:tcPr>
+            <w:tcW w:w="952" w:type="dxa"/>
+          </w:tcPr>
+          <w:p>
+            <w:pPr>
+              <w:spacing w:before="20" w:after="20"/>
+              <w:jc w:val="center"/>
+            </w:pPr>
+            <w:r>
+              <w:rPr/>
+              <w:t xml:space="preserve"/>
+            </w:r>
+          </w:p>
+        </w:tc>
+        <w:tc>
+          <w:tcPr>
+            <w:tcW w:w="952" w:type="dxa"/>
+          </w:tcPr>
+          <w:p>
+            <w:pPr>
+              <w:spacing w:before="20" w:after="20"/>
+              <w:jc w:val="center"/>
+            </w:pPr>
+            <w:r>
+              <w:rPr/>
+              <w:t xml:space="preserve"/>
+            </w:r>
+          </w:p>
+        </w:tc>
+        <w:tc>
+          <w:tcPr>
+            <w:tcW w:w="952" w:type="dxa"/>
+          </w:tcPr>
+          <w:p>
+            <w:pPr>
+              <w:spacing w:before="20" w:after="20"/>
+              <w:jc w:val="center"/>
+            </w:pPr>
+            <w:r>
+              <w:rPr>
+                <w:sz w:val="18"/>
+              </w:rPr>
+              <w:t xml:space="preserve"/>
             </w:r>
           </w:p>
         </w:tc>

</xml_diff>

<commit_message>
feat(experiment): build Finn whole from one frozen specification
Each arm (OpenCode, pi) now builds the same SaaS from scratch, unit by
unit (U1-U9), in a single workspace; the primary metric is tokens per
construction next to the acceptance fraction, paired per unit, and a
cell is (arm, tier). Ticket-by-ticket runs, author-written reference
states, harness zero, oh-my-pi and DeepSWE leave the design.

Also drops every reference outside the harness theme from the project
(ABNT norms, IFMT template, Gil, Prodanov and Freitas) and records the
rule in AGENTS.md. Deck rebuilt in dist/apresentacao-pcc/.
</commit_message>
<xml_diff>
--- a/dist/projeto-pcc.docx
+++ b/dist/projeto-pcc.docx
@@ -67,12 +67,6 @@
         <w:t>FAUSTO YUUKI T.A FREIRE</w:t>
       </w:r>
     </w:p>
-    <w:p/>
-    <w:p/>
-    <w:p/>
-    <w:p/>
-    <w:p/>
-    <w:p/>
     <w:p>
       <w:pPr>
         <w:spacing w:after="0" w:line="360" w:lineRule="auto"/>
@@ -80,9 +74,11 @@
       </w:pPr>
       <w:r>
         <w:rPr>
+          <w:b w:val="0"/>
+          <w:i w:val="0"/>
           <w:sz w:val="32"/>
         </w:rPr>
-        <w:t>O HARNESS COMO DECISÃO DO DESENVOLVEDOR: CUSTO POR TAREFA CONCLUÍDA E TAXA DE SUCESSO DE AGENTES DE CODIFICAÇÃO SOB UM MESMO MODELO</w:t>
+        <w:t xml:space="preserve">O HARNESS COMO DECISÃO DO DESENVOLVEDOR: TOKENS E TAXA DE SUCESSO DO OPENCODE E DO PI NA CONSTRUÇÃO DE UM MESMO SAAS SOB UM MESMO MODELO</w:t>
       </w:r>
     </w:p>
     <w:p/>
@@ -129,13 +125,6 @@
         <w:t>FAUSTO YUUKI T.A FREIRE</w:t>
       </w:r>
     </w:p>
-    <w:p/>
-    <w:p/>
-    <w:p/>
-    <w:p/>
-    <w:p/>
-    <w:p/>
-    <w:p/>
     <w:p>
       <w:pPr>
         <w:spacing w:after="0" w:line="360" w:lineRule="auto"/>
@@ -143,9 +132,11 @@
       </w:pPr>
       <w:r>
         <w:rPr>
+          <w:b w:val="0"/>
+          <w:i w:val="0"/>
           <w:sz w:val="28"/>
         </w:rPr>
-        <w:t>O HARNESS COMO DECISÃO DO DESENVOLVEDOR: CUSTO POR TAREFA CONCLUÍDA E TAXA DE SUCESSO DE AGENTES DE CODIFICAÇÃO SOB UM MESMO MODELO</w:t>
+        <w:t xml:space="preserve">O HARNESS COMO DECISÃO DO DESENVOLVEDOR: TOKENS E TAXA DE SUCESSO DO OPENCODE E DO PI NA CONSTRUÇÃO DE UM MESMO SAAS SOB UM MESMO MODELO</w:t>
       </w:r>
     </w:p>
     <w:p/>
@@ -385,7 +376,21 @@
           <w:b w:val="0"/>
           <w:i w:val="0"/>
         </w:rPr>
-        <w:t xml:space="preserve"> sobre o mesmo modelo ficam entre 50,0% e 66,7% de aprovação, e o custo por tarefa concluída vai de US$ 1,05 a US$ 18,34, uma razão de 17,5x calculada pelo autor deste projeto.</w:t>
+        <w:t xml:space="preserve"> sobre o mesmo modelo ficam entre 50,0% e 66,7% de aprovação, e o custo por tarefa concluída vai de US$ 1,05 a US$ 18,34, uma razão de 17,5x calculada pelo autor deste projeto. Dois dos </w:t>
+      </w:r>
+      <w:r>
+        <w:rPr>
+          <w:b w:val="0"/>
+          <w:i/>
+        </w:rPr>
+        <w:t xml:space="preserve">harnesses</w:t>
+      </w:r>
+      <w:r>
+        <w:rPr>
+          <w:b w:val="0"/>
+          <w:i w:val="0"/>
+        </w:rPr>
+        <w:t xml:space="preserve"> medidos ali são de código aberto e rodam sem interface: o pi conclui 60,0% das tarefas a US$ 2,43 por tarefa concluída e o OpenCode 50,0% a US$ 3,24.</w:t>
       </w:r>
     </w:p>
     <w:p>
@@ -395,31 +400,39 @@
         <w:jc w:val="both"/>
       </w:pPr>
       <w:r>
+        <w:rPr>
+          <w:b w:val="0"/>
+          <w:i w:val="0"/>
+        </w:rPr>
         <w:t xml:space="preserve">Quem paga essa conta é o desenvolvedor, na assinatura pessoal, e a empresa que adota a ferramenta em escala; conhecer o </w:t>
       </w:r>
       <w:r>
         <w:rPr>
+          <w:b w:val="0"/>
           <w:i/>
         </w:rPr>
-        <w:t>harness</w:t>
-      </w:r>
-      <w:r>
-        <w:t xml:space="preserve"> virou parte do ofício. As comparações publicadas contrastam ferramentas de </w:t>
-      </w:r>
-      <w:r>
-        <w:t xml:space="preserve">equipes diferentes e não dizem qual decisão de projeto pesa. Este projeto medirá esse efeito com a linhagem fixa, comparando o pi com seu </w:t>
-      </w:r>
-      <w:r>
-        <w:rPr>
+        <w:t xml:space="preserve">harness</w:t>
+      </w:r>
+      <w:r>
+        <w:rPr>
+          <w:b w:val="0"/>
+          <w:i w:val="0"/>
+        </w:rPr>
+        <w:t xml:space="preserve"> virou parte do ofício. As comparações publicadas usam suítes de tarefas isoladas, e não dizem quanto custa entregar um produto inteiro com uma ferramenta em vez de outra. Este projeto medirá esse custo construindo o mesmo produto duas vezes, do zero: o Finn, um SaaS de financeiro por voz, será construído com o OpenCode e com o pi, sobre o mesmo modelo e a partir da mesma especificação, e os tokens que cada braço gastar até entregar o produto serão contados fora do </w:t>
+      </w:r>
+      <w:r>
+        <w:rPr>
+          <w:b w:val="0"/>
           <w:i/>
         </w:rPr>
-        <w:t>fork</w:t>
-      </w:r>
-      <w:r>
-        <w:t xml:space="preserve"> direto, o oh-my-pi, e dará ao desenvolvedor e à empresa um critério de escolha, e à literatura a primeira compara</w:t>
-      </w:r>
-      <w:r>
-        <w:t>ção desse tipo.</w:t>
+        <w:t xml:space="preserve">harness</w:t>
+      </w:r>
+      <w:r>
+        <w:rPr>
+          <w:b w:val="0"/>
+          <w:i w:val="0"/>
+        </w:rPr>
+        <w:t xml:space="preserve">. O resultado será um critério de escolha para o desenvolvedor e para a empresa.</w:t>
       </w:r>
     </w:p>
     <w:p>
@@ -440,16 +453,25 @@
         <w:jc w:val="both"/>
       </w:pPr>
       <w:r>
+        <w:rPr>
+          <w:b w:val="0"/>
+          <w:i w:val="0"/>
+        </w:rPr>
         <w:t xml:space="preserve">A escolha do </w:t>
       </w:r>
       <w:r>
         <w:rPr>
+          <w:b w:val="0"/>
           <w:i/>
         </w:rPr>
-        <w:t>harness</w:t>
-      </w:r>
-      <w:r>
-        <w:t xml:space="preserve"> como decisão de engenharia do desenvolvedor e da empresa: seu efeito sobre o custo por tarefa concluída e sobre a taxa de sucesso de agentes de codificação, mantido fixo o modelo de linguagem.</w:t>
+        <w:t xml:space="preserve">harness</w:t>
+      </w:r>
+      <w:r>
+        <w:rPr>
+          <w:b w:val="0"/>
+          <w:i w:val="0"/>
+        </w:rPr>
+        <w:t xml:space="preserve"> como decisão de engenharia do desenvolvedor e da empresa: seu efeito sobre os tokens consumidos e sobre a taxa de sucesso de agentes de codificação na construção de um mesmo produto de software, mantido fixo o modelo de linguagem.</w:t>
       </w:r>
     </w:p>
     <w:p>
@@ -470,28 +492,39 @@
         <w:jc w:val="both"/>
       </w:pPr>
       <w:r>
-        <w:t>Para o desen</w:t>
-      </w:r>
-      <w:r>
-        <w:t xml:space="preserve">volvedor ou a empresa que já escolheu o modelo, quanto do custo por tarefa concluída e da taxa de sucesso do agente de codificação é determinado pelo </w:t>
-      </w:r>
-      <w:r>
-        <w:rPr>
+        <w:rPr>
+          <w:b w:val="0"/>
+          <w:i w:val="0"/>
+        </w:rPr>
+        <w:t xml:space="preserve">Para o desenvolvedor ou a empresa que já escolheu o modelo, quantos tokens a mais ou a menos custa construir o mesmo software com um </w:t>
+      </w:r>
+      <w:r>
+        <w:rPr>
+          <w:b w:val="0"/>
           <w:i/>
         </w:rPr>
-        <w:t>harness</w:t>
-      </w:r>
-      <w:r>
-        <w:t xml:space="preserve"> adotado? E quais decisões de projeto do </w:t>
-      </w:r>
-      <w:r>
-        <w:rPr>
+        <w:t xml:space="preserve">harness</w:t>
+      </w:r>
+      <w:r>
+        <w:rPr>
+          <w:b w:val="0"/>
+          <w:i w:val="0"/>
+        </w:rPr>
+        <w:t xml:space="preserve"> em vez de outro? E quanto dessa diferença vem da carga fixa que cada </w:t>
+      </w:r>
+      <w:r>
+        <w:rPr>
+          <w:b w:val="0"/>
           <w:i/>
         </w:rPr>
-        <w:t>harness</w:t>
-      </w:r>
-      <w:r>
-        <w:t xml:space="preserve"> respondem por essa diferença, de modo que seja possível agir sobre elas?</w:t>
+        <w:t xml:space="preserve">harness</w:t>
+      </w:r>
+      <w:r>
+        <w:rPr>
+          <w:b w:val="0"/>
+          <w:i w:val="0"/>
+        </w:rPr>
+        <w:t xml:space="preserve"> envia em toda requisição, de modo que seja possível agir sobre ela?</w:t>
       </w:r>
     </w:p>
     <w:p>
@@ -512,37 +545,11 @@
         <w:jc w:val="both"/>
       </w:pPr>
       <w:r>
-        <w:t xml:space="preserve">Medir, com o modelo de linguagem mantido fixo, quanto o </w:t>
-      </w:r>
-      <w:r>
-        <w:rPr>
-          <w:i/>
-        </w:rPr>
-        <w:t>harness</w:t>
-      </w:r>
-      <w:r>
-        <w:t xml:space="preserve"> adotado determina o custo por tarefa concluída e a taxa de sucesso de um agente de codificação, isoland</w:t>
-      </w:r>
-      <w:r>
-        <w:t xml:space="preserve">o decisões específicas de projeto pela comparação entre um </w:t>
-      </w:r>
-      <w:r>
-        <w:rPr>
-          <w:i/>
-        </w:rPr>
-        <w:t>harness</w:t>
-      </w:r>
-      <w:r>
-        <w:t xml:space="preserve"> e um </w:t>
-      </w:r>
-      <w:r>
-        <w:rPr>
-          <w:i/>
-        </w:rPr>
-        <w:t>fork</w:t>
-      </w:r>
-      <w:r>
-        <w:t xml:space="preserve"> direto dele, e entregar o resultado como critério de escolha reproduzível pelo desenvolvedor.</w:t>
+        <w:rPr>
+          <w:b w:val="0"/>
+          <w:i w:val="0"/>
+        </w:rPr>
+        <w:t xml:space="preserve">Medir, com o modelo de linguagem mantido fixo, a diferença de tokens consumidos e de taxa de sucesso entre o OpenCode e o pi na construção do mesmo SaaS a partir da mesma especificação, separando a parte dessa diferença que vem da carga fixa por requisição, e entregar o resultado como critério de escolha reproduzível pelo desenvolvedor.</w:t>
       </w:r>
     </w:p>
     <w:p>
@@ -563,16 +570,25 @@
         <w:jc w:val="both"/>
       </w:pPr>
       <w:r>
+        <w:rPr>
+          <w:b w:val="0"/>
+          <w:i w:val="0"/>
+        </w:rPr>
         <w:t xml:space="preserve">1) construir um instrumento de medição externo aos </w:t>
       </w:r>
       <w:r>
         <w:rPr>
+          <w:b w:val="0"/>
           <w:i/>
         </w:rPr>
-        <w:t>harnesses</w:t>
-      </w:r>
-      <w:r>
-        <w:t>, capaz de contabilizar de forma idêntica, para todos eles, o número de requisições ao modelo, os tokens de entrada e de saída e a latência por requisição;</w:t>
+        <w:t xml:space="preserve">harnesses</w:t>
+      </w:r>
+      <w:r>
+        <w:rPr>
+          <w:b w:val="0"/>
+          <w:i w:val="0"/>
+        </w:rPr>
+        <w:t xml:space="preserve">, capaz de contabilizar de forma idêntica, para os dois, o número de requisições ao modelo, os tokens de entrada e de saída e a latência por requisição;</w:t>
       </w:r>
     </w:p>
     <w:p>
@@ -582,11 +598,11 @@
         <w:jc w:val="both"/>
       </w:pPr>
       <w:r>
-        <w:lastRenderedPageBreak/>
-        <w:t>2) definir uma suíte de tarefas de progr</w:t>
-      </w:r>
-      <w:r>
-        <w:t>amação com objetivos numerados e crédito parcial, acompanhada de um oráculo automatizado independente dos testes produzidos pelo próprio agente;</w:t>
+        <w:rPr>
+          <w:b w:val="0"/>
+          <w:i w:val="0"/>
+        </w:rPr>
+        <w:t xml:space="preserve">2) escrever a especificação do Finn em nove unidades, a partir das decisões já registradas no repositório do produto, com testes de aceitação escritos pelo autor antes da execução, independentes dos testes que o próprio agente produzir;</w:t>
       </w:r>
     </w:p>
     <w:p>
@@ -596,16 +612,11 @@
         <w:jc w:val="both"/>
       </w:pPr>
       <w:r>
-        <w:t xml:space="preserve">3) implementar um </w:t>
-      </w:r>
-      <w:r>
-        <w:rPr>
-          <w:i/>
-        </w:rPr>
-        <w:t>harness</w:t>
-      </w:r>
-      <w:r>
-        <w:t xml:space="preserve"> mínimo de referência, em laço ReAct, como controle científico do experimento;</w:t>
+        <w:rPr>
+          <w:b w:val="0"/>
+          <w:i w:val="0"/>
+        </w:rPr>
+        <w:t xml:space="preserve">3) preparar um espaço de trabalho inicial idêntico para os dois braços, contendo apenas a especificação e a pilha fixada, congelado por hash;</w:t>
       </w:r>
     </w:p>
     <w:p>
@@ -615,19 +626,39 @@
         <w:jc w:val="both"/>
       </w:pPr>
       <w:r>
-        <w:t>4) exec</w:t>
-      </w:r>
-      <w:r>
-        <w:t xml:space="preserve">utar a mesma suíte, com o mesmo modelo, em todos os </w:t>
-      </w:r>
-      <w:r>
-        <w:rPr>
+        <w:rPr>
+          <w:b w:val="0"/>
+          <w:i w:val="0"/>
+        </w:rPr>
+        <w:t xml:space="preserve">4) executar a construção completa do Finn nos dois </w:t>
+      </w:r>
+      <w:r>
+        <w:rPr>
+          <w:b w:val="0"/>
           <w:i/>
         </w:rPr>
-        <w:t>harnesses</w:t>
-      </w:r>
-      <w:r>
-        <w:t xml:space="preserve"> avaliados, repetindo cada condição e reportando dispersão;</w:t>
+        <w:t xml:space="preserve">harnesses</w:t>
+      </w:r>
+      <w:r>
+        <w:rPr>
+          <w:b w:val="0"/>
+          <w:i w:val="0"/>
+        </w:rPr>
+        <w:t xml:space="preserve">, unidade a unidade, com o mesmo modelo e os mesmos </w:t>
+      </w:r>
+      <w:r>
+        <w:rPr>
+          <w:b w:val="0"/>
+          <w:i/>
+        </w:rPr>
+        <w:t xml:space="preserve">prompts</w:t>
+      </w:r>
+      <w:r>
+        <w:rPr>
+          <w:b w:val="0"/>
+          <w:i w:val="0"/>
+        </w:rPr>
+        <w:t xml:space="preserve">, repetindo cada condição e reportando dispersão;</w:t>
       </w:r>
     </w:p>
     <w:p>
@@ -637,15 +668,24 @@
         <w:jc w:val="both"/>
       </w:pPr>
       <w:r>
-        <w:t xml:space="preserve">5) repetir o experimento em um segundo modelo, verificando se a ordenação entre </w:t>
-      </w:r>
-      <w:r>
-        <w:rPr>
+        <w:rPr>
+          <w:b w:val="0"/>
+          <w:i w:val="0"/>
+        </w:rPr>
+        <w:t xml:space="preserve">5) repetir o experimento em um segundo modelo, verificando se a ordenação entre os dois </w:t>
+      </w:r>
+      <w:r>
+        <w:rPr>
+          <w:b w:val="0"/>
           <w:i/>
         </w:rPr>
-        <w:t>harnesses</w:t>
-      </w:r>
-      <w:r>
+        <w:t xml:space="preserve">harnesses</w:t>
+      </w:r>
+      <w:r>
+        <w:rPr>
+          <w:b w:val="0"/>
+          <w:i w:val="0"/>
+        </w:rPr>
         <w:t xml:space="preserve"> se mantém ou se inverte;</w:t>
       </w:r>
     </w:p>
@@ -656,19 +696,25 @@
         <w:jc w:val="both"/>
       </w:pPr>
       <w:r>
-        <w:t>6) quantificar a div</w:t>
-      </w:r>
-      <w:r>
-        <w:t xml:space="preserve">ergência entre o custo relatado por cada </w:t>
-      </w:r>
-      <w:r>
-        <w:rPr>
+        <w:rPr>
+          <w:b w:val="0"/>
+          <w:i w:val="0"/>
+        </w:rPr>
+        <w:t xml:space="preserve">6) quantificar a divergência entre os tokens relatados por cada </w:t>
+      </w:r>
+      <w:r>
+        <w:rPr>
+          <w:b w:val="0"/>
           <w:i/>
         </w:rPr>
-        <w:t>harness</w:t>
-      </w:r>
-      <w:r>
-        <w:t xml:space="preserve"> e o custo efetivamente medido no instrumento externo, que é o que o desenvolvedor paga;</w:t>
+        <w:t xml:space="preserve">harness</w:t>
+      </w:r>
+      <w:r>
+        <w:rPr>
+          <w:b w:val="0"/>
+          <w:i w:val="0"/>
+        </w:rPr>
+        <w:t xml:space="preserve"> e os tokens medidos no instrumento externo, que são o que o desenvolvedor paga;</w:t>
       </w:r>
     </w:p>
     <w:p>
@@ -678,19 +724,25 @@
         <w:jc w:val="both"/>
       </w:pPr>
       <w:r>
-        <w:t xml:space="preserve">7) publicar o </w:t>
-      </w:r>
-      <w:r>
-        <w:rPr>
+        <w:rPr>
+          <w:b w:val="0"/>
+          <w:i w:val="0"/>
+        </w:rPr>
+        <w:t xml:space="preserve">7) publicar o executor, os </w:t>
+      </w:r>
+      <w:r>
+        <w:rPr>
+          <w:b w:val="0"/>
           <w:i/>
         </w:rPr>
-        <w:t>runner</w:t>
-      </w:r>
-      <w:r>
-        <w:t>, os dados brutos e os scripts de análise, com um procedimento que o desenvolvedor reexecute na pró</w:t>
-      </w:r>
-      <w:r>
-        <w:t>pria máquina a custo monetário zero.</w:t>
+        <w:t xml:space="preserve">prompts</w:t>
+      </w:r>
+      <w:r>
+        <w:rPr>
+          <w:b w:val="0"/>
+          <w:i w:val="0"/>
+        </w:rPr>
+        <w:t xml:space="preserve">, os testes de aceitação, os dados brutos e os scripts de análise, com um procedimento que o desenvolvedor reexecute na própria máquina a custo monetário zero.</w:t>
       </w:r>
     </w:p>
     <w:p>
@@ -711,31 +763,53 @@
         <w:jc w:val="both"/>
       </w:pPr>
       <w:r>
-        <w:t xml:space="preserve">A pesquisa é aplicada, quali-quantitativa, exploratória e experimental, e o método é dedutivo, com hipóteses declaradas antes da coleta. Os dados serão coletados por um instrumento próprio, um proxy reverso </w:t>
-      </w:r>
-      <w:r>
-        <w:t xml:space="preserve">interposto entre cada </w:t>
-      </w:r>
-      <w:r>
-        <w:rPr>
+        <w:rPr>
+          <w:b w:val="0"/>
+          <w:i w:val="0"/>
+        </w:rPr>
+        <w:t xml:space="preserve">A pesquisa é aplicada, quali-quantitativa, exploratória e experimental, e o método é dedutivo, com hipóteses declaradas antes da coleta. Os dados serão coletados por um instrumento próprio, um </w:t>
+      </w:r>
+      <w:r>
+        <w:rPr>
+          <w:b w:val="0"/>
           <w:i/>
         </w:rPr>
-        <w:t>harness</w:t>
-      </w:r>
-      <w:r>
-        <w:t xml:space="preserve"> e o modelo, que contará requisições, tokens e latência da mesma forma para todos os braços. Cada par de braço e tarefa será executado ao menos três vezes sobre uma suíte fixa do DeepSWE, e a comparação será feita por teste par</w:t>
-      </w:r>
-      <w:r>
-        <w:t xml:space="preserve">eado sobre o Succ/Mtok de cada tarefa. Espera-se obter a diferença de custo por tarefa concluída e de taxa de sucesso atribuível ao </w:t>
-      </w:r>
-      <w:r>
-        <w:rPr>
+        <w:t xml:space="preserve">proxy</w:t>
+      </w:r>
+      <w:r>
+        <w:rPr>
+          <w:b w:val="0"/>
+          <w:i w:val="0"/>
+        </w:rPr>
+        <w:t xml:space="preserve"> reverso interposto entre cada </w:t>
+      </w:r>
+      <w:r>
+        <w:rPr>
+          <w:b w:val="0"/>
           <w:i/>
         </w:rPr>
-        <w:t>harness</w:t>
-      </w:r>
-      <w:r>
-        <w:t>, em forma utilizável por quem escolhe a ferramenta. A seção 3 detalha material, método e tratamento estatístico.</w:t>
+        <w:t xml:space="preserve">harness</w:t>
+      </w:r>
+      <w:r>
+        <w:rPr>
+          <w:b w:val="0"/>
+          <w:i w:val="0"/>
+        </w:rPr>
+        <w:t xml:space="preserve"> e o modelo, que contará requisições, tokens e latência da mesma forma para os dois braços. Cada braço construirá o Finn do zero, a partir de uma especificação única dividida em nove unidades, ao menos três vezes; a comparação será feita sobre os tokens por construção, relatados ao lado da fração de testes de aceitação aprovados, e por teste pareado sobre os tokens de cada unidade. Espera-se obter a diferença de tokens e de taxa de sucesso atribuível ao </w:t>
+      </w:r>
+      <w:r>
+        <w:rPr>
+          <w:b w:val="0"/>
+          <w:i/>
+        </w:rPr>
+        <w:t xml:space="preserve">harness</w:t>
+      </w:r>
+      <w:r>
+        <w:rPr>
+          <w:b w:val="0"/>
+          <w:i w:val="0"/>
+        </w:rPr>
+        <w:t xml:space="preserve">, em forma utilizável por quem escolhe a ferramenta. A seção 3 detalha material, método e tratamento estatístico.</w:t>
       </w:r>
     </w:p>
     <w:p>
@@ -762,28 +836,25 @@
         <w:jc w:val="both"/>
       </w:pPr>
       <w:r>
-        <w:t xml:space="preserve">H1: entre </w:t>
-      </w:r>
-      <w:r>
-        <w:rPr>
+        <w:rPr>
+          <w:b w:val="0"/>
+          <w:i w:val="0"/>
+        </w:rPr>
+        <w:t xml:space="preserve">H1: entre o OpenCode e o pi executando o mesmo modelo, a diferença de tokens gastos para construir o Finn a partir da mesma especificação é de ordem prática relevante para quem paga a conta, comparável à diferença obtida ao se trocar de modelo sob um </w:t>
+      </w:r>
+      <w:r>
+        <w:rPr>
+          <w:b w:val="0"/>
           <w:i/>
         </w:rPr>
-        <w:t>harnesses</w:t>
-      </w:r>
-      <w:r>
-        <w:t xml:space="preserve"> distintos executando o mesmo modelo, a diferença de custo por tarefa concluída é de ordem prática relevante para quem paga a conta, comparável à diferença obtida ao se trocar de modelo sob um </w:t>
-      </w:r>
-      <w:r>
-        <w:rPr>
-          <w:i/>
-        </w:rPr>
-        <w:t>harness</w:t>
-      </w:r>
-      <w:r>
-        <w:t xml:space="preserve"> fixo. H1 será refutada se os i</w:t>
-      </w:r>
-      <w:r>
-        <w:t>ntervalos de Succ/Mtok dos braços se sobrepuserem ao longo de toda a suíte.</w:t>
+        <w:t xml:space="preserve">harness</w:t>
+      </w:r>
+      <w:r>
+        <w:rPr>
+          <w:b w:val="0"/>
+          <w:i w:val="0"/>
+        </w:rPr>
+        <w:t xml:space="preserve"> fixo. H1 será refutada se os intervalos de tokens por construção dos dois braços se sobrepuserem e o teste pareado por unidade não apontar diferença.</w:t>
       </w:r>
     </w:p>
     <w:p>
@@ -793,44 +864,53 @@
         <w:jc w:val="both"/>
       </w:pPr>
       <w:r>
-        <w:t xml:space="preserve">H2: essa diferença persiste entre um </w:t>
-      </w:r>
-      <w:r>
-        <w:rPr>
+        <w:rPr>
+          <w:b w:val="0"/>
+          <w:i w:val="0"/>
+        </w:rPr>
+        <w:t xml:space="preserve">H2: a carga fixa que cada </w:t>
+      </w:r>
+      <w:r>
+        <w:rPr>
+          <w:b w:val="0"/>
           <w:i/>
         </w:rPr>
-        <w:t>harness</w:t>
-      </w:r>
-      <w:r>
-        <w:t xml:space="preserve"> e um </w:t>
-      </w:r>
-      <w:r>
-        <w:rPr>
+        <w:t xml:space="preserve">harness</w:t>
+      </w:r>
+      <w:r>
+        <w:rPr>
+          <w:b w:val="0"/>
+          <w:i w:val="0"/>
+        </w:rPr>
+        <w:t xml:space="preserve"> envia em toda requisição (</w:t>
+      </w:r>
+      <w:r>
+        <w:rPr>
+          <w:b w:val="0"/>
           <w:i/>
         </w:rPr>
-        <w:t>fork</w:t>
-      </w:r>
-      <w:r>
-        <w:t xml:space="preserve"> direto dele, o que indicaria que ela vem de decisões de projeto isoláveis (prompt de sistema, número e tamanho dos esquemas d</w:t>
-      </w:r>
-      <w:r>
-        <w:t xml:space="preserve">e ferramenta, política de compactação de contexto), e não do acúmulo de diferenças entre bases de código independentes. H2 será refutada se pi e oh-my-pi não diferirem significativamente em Succ/Mtok, mesmo que a Camada 1 confirme que o </w:t>
-      </w:r>
-      <w:r>
-        <w:rPr>
+        <w:t xml:space="preserve">prompt</w:t>
+      </w:r>
+      <w:r>
+        <w:rPr>
+          <w:b w:val="0"/>
+          <w:i w:val="0"/>
+        </w:rPr>
+        <w:t xml:space="preserve"> de sistema e esquemas de ferramenta, medidos na Camada 1) explica a maior parte dessa diferença, e o número de passos que cada um leva para concluir cada unidade explica a parte menor. H2 será refutada se o número de passos explicar a maior parte da diferença de tokens. Esse desfecho é possível e seria um achado a reportar, já que o </w:t>
+      </w:r>
+      <w:r>
+        <w:rPr>
+          <w:b w:val="0"/>
           <w:i/>
         </w:rPr>
-        <w:t>fork</w:t>
-      </w:r>
-      <w:r>
-        <w:t xml:space="preserve"> envia uma </w:t>
-      </w:r>
-      <w:r>
-        <w:lastRenderedPageBreak/>
-        <w:t>carg</w:t>
-      </w:r>
-      <w:r>
-        <w:t>a maior por requisição. Esse desfecho é possível e seria um achado a reportar, já que o oh-my-pi pode compensar a carga extra concluindo a tarefa em menos passos.</w:t>
+        <w:t xml:space="preserve">harness</w:t>
+      </w:r>
+      <w:r>
+        <w:rPr>
+          <w:b w:val="0"/>
+          <w:i w:val="0"/>
+        </w:rPr>
+        <w:t xml:space="preserve"> com mais ferramentas pode compensar a carga extra concluindo a unidade em menos passos.</w:t>
       </w:r>
     </w:p>
     <w:p>
@@ -840,22 +920,11 @@
         <w:jc w:val="both"/>
       </w:pPr>
       <w:r>
-        <w:t>Este trabalho segue as normas do curso (IFMT, 2022) e as da ABNT (2023, 2025a, 2025b)</w:t>
-      </w:r>
-      <w:r>
-        <w:rPr>
-          <w:vertAlign w:val="superscript"/>
-        </w:rPr>
-        <w:footnoteReference w:id="1"/>
-      </w:r>
-      <w:r>
-        <w:t>, e es</w:t>
-      </w:r>
-      <w:r>
-        <w:t xml:space="preserve">tá organizado em seis seções. Esta introdução apresenta a justificativa, o tema, o problema, os objetivos, a metodologia e as hipóteses. A seção 2 posiciona o trabalho na literatura e delimita as pendências que ele se propõe a resolver. A seção 3 descreve </w:t>
-      </w:r>
-      <w:r>
-        <w:t>o material e o método: classificação da pesquisa, camadas de medição, braços, suíte de tarefas, limites, tratamento estatístico e limitações. A seção 4 apresenta o orçamento, a seção 5 o cronograma, e a seção 6 reúne as referências.</w:t>
+        <w:rPr>
+          <w:b w:val="0"/>
+          <w:i w:val="0"/>
+        </w:rPr>
+        <w:t xml:space="preserve">Este trabalho está organizado em seis seções. Esta introdução apresenta a justificativa, o tema, o problema, os objetivos, a metodologia e as hipóteses. A seção 2 posiciona o trabalho na literatura e delimita as pendências que ele se propõe a resolver. A seção 3 descreve o material e o método: classificação da pesquisa, camadas de medição, braços, suíte de tarefas, limites, tratamento estatístico e limitações. A seção 4 apresenta o orçamento, a seção 5 o cronograma, e a seção 6 reúne as referências.</w:t>
       </w:r>
     </w:p>
     <w:p>
@@ -878,58 +947,39 @@
         <w:jc w:val="both"/>
       </w:pPr>
       <w:r>
-        <w:t xml:space="preserve">Segundo Ning </w:t>
-      </w:r>
-      <w:r>
-        <w:rPr>
+        <w:rPr>
+          <w:b w:val="0"/>
+          <w:i w:val="0"/>
+        </w:rPr>
+        <w:t xml:space="preserve">Segundo Ning et al. (2026, §2, tradução nossa), um </w:t>
+      </w:r>
+      <w:r>
+        <w:rPr>
+          <w:b w:val="0"/>
           <w:i/>
         </w:rPr>
-        <w:t>et al.</w:t>
-      </w:r>
-      <w:r>
-        <w:t xml:space="preserve"> (2026, §2, tradução nossa), um </w:t>
-      </w:r>
-      <w:r>
-        <w:rPr>
+        <w:t xml:space="preserve">harness</w:t>
+      </w:r>
+      <w:r>
+        <w:rPr>
+          <w:b w:val="0"/>
+          <w:i w:val="0"/>
+        </w:rPr>
+        <w:t xml:space="preserve"> “converte um modelo de linguagem sem estado em um agente funcional ao ancorar suas saídas em execução externa, estado persistente e realimentação verificável”. Wang et al. (2026) descrevem a mesma camada pelo que ela faz: monta os </w:t>
+      </w:r>
+      <w:r>
+        <w:rPr>
+          <w:b w:val="0"/>
           <w:i/>
         </w:rPr>
-        <w:t>harness</w:t>
-      </w:r>
-      <w:r>
-        <w:t xml:space="preserve"> “converte um modelo de linguagem sem estado em um agente funcional ao ancorar suas saídas em execução externa, estado persistente e realimentação verificável”. Wang </w:t>
-      </w:r>
-      <w:r>
-        <w:rPr>
-          <w:i/>
-        </w:rPr>
-        <w:t>et al.</w:t>
-      </w:r>
-      <w:r>
-        <w:t xml:space="preserve"> (2026) descrevem a mesma </w:t>
-      </w:r>
-      <w:r>
-        <w:t xml:space="preserve">camada pelo que ela faz: monta os prompts, gerencia o estado, invoca as ferramentas e coordena o laço. É ela que muda quando o desenvolvedor troca de ferramenta e mantém o modelo, e os braços vão de um laço ReAct mínimo (Yao </w:t>
-      </w:r>
-      <w:r>
-        <w:rPr>
-          <w:i/>
-        </w:rPr>
-        <w:t>et al.</w:t>
-      </w:r>
-      <w:r>
-        <w:t xml:space="preserve">, 2022) a implementações </w:t>
-      </w:r>
-      <w:r>
-        <w:t xml:space="preserve">com planejamento, compactação e subagentes. Lin </w:t>
-      </w:r>
-      <w:r>
-        <w:rPr>
-          <w:i/>
-        </w:rPr>
-        <w:t>et al.</w:t>
-      </w:r>
-      <w:r>
-        <w:t xml:space="preserve"> (2026) delimitam o que, exatamente, essa camada contém:</w:t>
+        <w:t xml:space="preserve">prompts</w:t>
+      </w:r>
+      <w:r>
+        <w:rPr>
+          <w:b w:val="0"/>
+          <w:i w:val="0"/>
+        </w:rPr>
+        <w:t xml:space="preserve">, gerencia o estado, invoca as ferramentas e coordena o laço. É ela que muda quando o desenvolvedor troca de ferramenta e mantém o modelo, e os dois braços deste projeto ficam em pontos distantes dessa camada: o pi é um laço próximo do ReAct mínimo (Yao et al., 2022), com quatro ferramentas, e o OpenCode traz planejamento, compactação, subagentes e permissões. Lin et al. (2026) delimitam o que, exatamente, essa camada contém:</w:t>
       </w:r>
     </w:p>
     <w:p>
@@ -991,41 +1041,55 @@
           <w:b w:val="0"/>
           <w:i w:val="0"/>
         </w:rPr>
-        <w:t xml:space="preserve">A interface entre modelo e ambiente é objeto de projeto desde Yang </w:t>
+        <w:t xml:space="preserve">A interface entre modelo e ambiente é objeto de projeto desde Yang et al. (2024). Na Tabela 1 de Lin et al. (2026), </w:t>
       </w:r>
       <w:r>
         <w:rPr>
           <w:b w:val="0"/>
           <w:i/>
         </w:rPr>
-        <w:t xml:space="preserve">et al.</w:t>
+        <w:t xml:space="preserve">harnesses</w:t>
       </w:r>
       <w:r>
         <w:rPr>
           <w:b w:val="0"/>
           <w:i w:val="0"/>
         </w:rPr>
-        <w:t xml:space="preserve"> (2024). Na Tabela 1 de Lin </w:t>
+        <w:t xml:space="preserve"> escritos por humanos sobre um modelo congelado (GPT-5.4, Terminal-Bench 2, 89 tarefas) vão de 47,2% de aprovação no OpenCode a 71,9% no Codex, uma diferença de 24,7 pontos percentuais calculada pelo autor deste projeto. Zhang et al. (2026) enunciam a Binding Constraint Thesis: em tarefas de longo horizonte com modelos de fronteira comparáveis, a parcela do desempenho que vem do </w:t>
       </w:r>
       <w:r>
         <w:rPr>
           <w:b w:val="0"/>
           <w:i/>
         </w:rPr>
-        <w:t xml:space="preserve">et al.</w:t>
+        <w:t xml:space="preserve">harness</w:t>
       </w:r>
       <w:r>
         <w:rPr>
           <w:b w:val="0"/>
           <w:i w:val="0"/>
         </w:rPr>
-        <w:t xml:space="preserve"> (2026), </w:t>
+        <w:t xml:space="preserve"> é frequentemente comparável ou maior que a que vem do modelo, e pode dominá-la. Em Alier Forment et al. (2026), os dois </w:t>
       </w:r>
       <w:r>
         <w:rPr>
           <w:b w:val="0"/>
           <w:i/>
         </w:rPr>
+        <w:t xml:space="preserve">scaffoldings</w:t>
+      </w:r>
+      <w:r>
+        <w:rPr>
+          <w:b w:val="0"/>
+          <w:i w:val="0"/>
+        </w:rPr>
+        <w:t xml:space="preserve"> sem suporte a MCP saíram de 5,0x a 28x mais baratos que os cinco que o suportam, e o pi foi o mais barato da matriz. Somam-se três fontes não revisadas por pares. O HarnessRank (2026) ordena </w:t>
+      </w:r>
+      <w:r>
+        <w:rPr>
+          <w:b w:val="0"/>
+          <w:i/>
+        </w:rPr>
         <w:t xml:space="preserve">harnesses</w:t>
       </w:r>
       <w:r>
@@ -1033,105 +1097,7 @@
           <w:b w:val="0"/>
           <w:i w:val="0"/>
         </w:rPr>
-        <w:t xml:space="preserve"> escritos por humanos sobre um modelo congelado (GPT-5.4, Terminal-Bench 2, 89 tarefas) vão de 47,2% de aprovação no OpenCode a 71,9% no Codex, uma diferença de 24,7 pontos percentuais calculada pelo autor deste projeto. Zhang </w:t>
-      </w:r>
-      <w:r>
-        <w:rPr>
-          <w:b w:val="0"/>
-          <w:i/>
-        </w:rPr>
-        <w:t xml:space="preserve">et al.</w:t>
-      </w:r>
-      <w:r>
-        <w:rPr>
-          <w:b w:val="0"/>
-          <w:i w:val="0"/>
-        </w:rPr>
-        <w:t xml:space="preserve"> (2026) enunciam a </w:t>
-      </w:r>
-      <w:r>
-        <w:rPr>
-          <w:b w:val="0"/>
-          <w:i/>
-        </w:rPr>
-        <w:t xml:space="preserve">Binding Constraint Thesis</w:t>
-      </w:r>
-      <w:r>
-        <w:rPr>
-          <w:b w:val="0"/>
-          <w:i w:val="0"/>
-        </w:rPr>
-        <w:t xml:space="preserve">: em tarefas de longo horizonte com modelos de fronteira comparáveis, a parcela do desempenho que vem do </w:t>
-      </w:r>
-      <w:r>
-        <w:rPr>
-          <w:b w:val="0"/>
-          <w:i/>
-        </w:rPr>
-        <w:t xml:space="preserve">harness</w:t>
-      </w:r>
-      <w:r>
-        <w:rPr>
-          <w:b w:val="0"/>
-          <w:i w:val="0"/>
-        </w:rPr>
-        <w:t xml:space="preserve"> é frequentemente comparável ou maior que a que vem do modelo, e pode dominá-la. Em Alier Forment </w:t>
-      </w:r>
-      <w:r>
-        <w:rPr>
-          <w:b w:val="0"/>
-          <w:i/>
-        </w:rPr>
-        <w:t xml:space="preserve">et al.</w:t>
-      </w:r>
-      <w:r>
-        <w:rPr>
-          <w:b w:val="0"/>
-          <w:i w:val="0"/>
-        </w:rPr>
-        <w:t xml:space="preserve"> (2026), os dois </w:t>
-      </w:r>
-      <w:r>
-        <w:rPr>
-          <w:b w:val="0"/>
-          <w:i/>
-        </w:rPr>
-        <w:t xml:space="preserve">scaffoldings</w:t>
-      </w:r>
-      <w:r>
-        <w:rPr>
-          <w:b w:val="0"/>
-          <w:i w:val="0"/>
-        </w:rPr>
-        <w:t xml:space="preserve"> sem suporte a MCP saíram de 5,0x a 28x mais baratos que os cinco que o suportam. Somam-se três fontes não revisadas por pares. O HarnessRank (2026) ordena </w:t>
-      </w:r>
-      <w:r>
-        <w:rPr>
-          <w:b w:val="0"/>
-          <w:i/>
-        </w:rPr>
-        <w:t xml:space="preserve">harnesses</w:t>
-      </w:r>
-      <w:r>
-        <w:rPr>
-          <w:b w:val="0"/>
-          <w:i w:val="0"/>
-        </w:rPr>
-        <w:t xml:space="preserve"> por taxa de aprovação com modelo fixo e publica custo e tokens ao lado, sem que eles alterem a ordem. O FrontierHarness (Runta, 2026) compara, sobre o mesmo modelo, as ferramentas que o desenvolvedor encontra no mercado: o Codex conclui 66,7% das tarefas a US$ 3,47 por tarefa concluída e o Claude Code 63,3% a US$ 18,34, ou seja, 5,3x mais caro para uma taxa próxima (cálculo do autor deste projeto). O estudo da Databricks registra custo por tarefa variando mais de 2x em alguns casos, sem mudança de qualidade (Databricks, 2026 </w:t>
-      </w:r>
-      <w:r>
-        <w:rPr>
-          <w:b w:val="0"/>
-          <w:i/>
-        </w:rPr>
-        <w:t xml:space="preserve">apud</w:t>
-      </w:r>
-      <w:r>
-        <w:rPr>
-          <w:b w:val="0"/>
-          <w:i w:val="0"/>
-        </w:rPr>
-        <w:t xml:space="preserve"> Earendil, 2026).</w:t>
+        <w:t xml:space="preserve"> por taxa de aprovação com modelo fixo e publica custo e tokens ao lado, sem que eles alterem a ordem. O FrontierHarness (Runta, 2026) compara, sobre o mesmo modelo, as ferramentas que o desenvolvedor encontra no mercado: o Codex conclui 66,7% das tarefas a US$ 3,47 por tarefa concluída e o Claude Code 63,3% a US$ 18,34, ou seja, 5,3x mais caro para uma taxa próxima (cálculo do autor deste projeto). O estudo da Databricks registra custo por tarefa variando mais de 2x em alguns casos, sem mudança de qualidade (Databricks, 2026 apud Earendil, 2026).</w:t>
       </w:r>
     </w:p>
     <w:p>
@@ -1159,21 +1125,21 @@
           <w:b w:val="0"/>
           <w:i w:val="0"/>
         </w:rPr>
-        <w:t xml:space="preserve"> de equipes diferentes sobre fundações diferentes, e a dispersão medida agrega prompt, ferramentas, gestão de contexto e desenho do laço sem separá-los. O desenvolvedor sabe qual ferramenta ganhou, mas não o que a fez ganhar. Ning </w:t>
+        <w:t xml:space="preserve"> sobre suítes de tarefas isoladas e curtas, e a dispersão medida agrega </w:t>
       </w:r>
       <w:r>
         <w:rPr>
           <w:b w:val="0"/>
           <w:i/>
         </w:rPr>
-        <w:t xml:space="preserve">et al.</w:t>
+        <w:t xml:space="preserve">prompt</w:t>
       </w:r>
       <w:r>
         <w:rPr>
           <w:b w:val="0"/>
           <w:i w:val="0"/>
         </w:rPr>
-        <w:t xml:space="preserve"> (2026) nomeiam a lacuna em §5.2.1 e pedem, em §5.2.7, “métricas que isolem componentes do </w:t>
+        <w:t xml:space="preserve">, ferramentas, gestão de contexto e desenho do laço sem separá-los. O desenvolvedor sabe qual ferramenta ganhou, mas não o que a fez ganhar, nem quanto essa diferença custa ao longo de um produto inteiro. Ning et al. (2026) nomeiam a lacuna em §5.2.1 e pedem, em §5.2.7, “métricas que isolem componentes do </w:t>
       </w:r>
       <w:r>
         <w:rPr>
@@ -1187,35 +1153,35 @@
           <w:b w:val="0"/>
           <w:i w:val="0"/>
         </w:rPr>
-        <w:t xml:space="preserve">” (Ning </w:t>
+        <w:t xml:space="preserve">” (Ning et al., 2026, tradução nossa). Lee et al. (2026) mostram que essas decisões são isoláveis: uma busca automática que edita só o código do </w:t>
       </w:r>
       <w:r>
         <w:rPr>
           <w:b w:val="0"/>
           <w:i/>
         </w:rPr>
-        <w:t xml:space="preserve">et al.</w:t>
+        <w:t xml:space="preserve">harness</w:t>
       </w:r>
       <w:r>
         <w:rPr>
           <w:b w:val="0"/>
           <w:i w:val="0"/>
         </w:rPr>
-        <w:t xml:space="preserve">, 2026, tradução nossa). Lee </w:t>
+        <w:t xml:space="preserve">, com o modelo fixo, chegou a 76,4% de aprovação no TerminalBench-2 (89 tarefas, Claude Opus 4.6), contra 74,7% do Terminus-KIRA, o </w:t>
       </w:r>
       <w:r>
         <w:rPr>
           <w:b w:val="0"/>
           <w:i/>
         </w:rPr>
-        <w:t xml:space="preserve">et al.</w:t>
+        <w:t xml:space="preserve">harness</w:t>
       </w:r>
       <w:r>
         <w:rPr>
           <w:b w:val="0"/>
           <w:i w:val="0"/>
         </w:rPr>
-        <w:t xml:space="preserve"> (2026) mostram que essas decisões são isoláveis: uma busca automática que edita só o código do </w:t>
+        <w:t xml:space="preserve"> escrito à mão de que a busca partiu (Lee et al., 2026, Tabela 7). Este projeto responderá a §5.2.7 pelo lado da medição: separará, em cada requisição, a carga fixa do </w:t>
       </w:r>
       <w:r>
         <w:rPr>
@@ -1229,49 +1195,21 @@
           <w:b w:val="0"/>
           <w:i w:val="0"/>
         </w:rPr>
-        <w:t xml:space="preserve">, com o modelo fixo, chegou a 76,4% de aprovação no TerminalBench-2 (89 tarefas, Claude Opus 4.6), contra 74,7% do Terminus-KIRA, o </w:t>
+        <w:t xml:space="preserve"> (</w:t>
       </w:r>
       <w:r>
         <w:rPr>
           <w:b w:val="0"/>
           <w:i/>
         </w:rPr>
-        <w:t xml:space="preserve">harness</w:t>
+        <w:t xml:space="preserve">prompt</w:t>
       </w:r>
       <w:r>
         <w:rPr>
           <w:b w:val="0"/>
           <w:i w:val="0"/>
         </w:rPr>
-        <w:t xml:space="preserve"> escrito à mão de que a busca partiu (Lee </w:t>
-      </w:r>
-      <w:r>
-        <w:rPr>
-          <w:b w:val="0"/>
-          <w:i/>
-        </w:rPr>
-        <w:t xml:space="preserve">et al.</w:t>
-      </w:r>
-      <w:r>
-        <w:rPr>
-          <w:b w:val="0"/>
-          <w:i w:val="0"/>
-        </w:rPr>
-        <w:t xml:space="preserve">, 2026, Tabela 7). O par pi / oh-my-pi responderá a §5.2.7 pelo lado do controle, já que um </w:t>
-      </w:r>
-      <w:r>
-        <w:rPr>
-          <w:b w:val="0"/>
-          <w:i/>
-        </w:rPr>
-        <w:t xml:space="preserve">fork</w:t>
-      </w:r>
-      <w:r>
-        <w:rPr>
-          <w:b w:val="0"/>
-          <w:i w:val="0"/>
-        </w:rPr>
-        <w:t xml:space="preserve"> direto mantém a linhagem fixa e faz variar apenas as modificações.</w:t>
+        <w:t xml:space="preserve"> de sistema e esquemas de ferramenta) do conteúdo da conversa, e medirá quanto dessa carga chega ao resultado ao longo de um produto completo.</w:t>
       </w:r>
     </w:p>
     <w:p>
@@ -1281,52 +1219,53 @@
         <w:jc w:val="both"/>
       </w:pPr>
       <w:r>
+        <w:rPr>
+          <w:b w:val="0"/>
+          <w:i w:val="0"/>
+        </w:rPr>
         <w:t xml:space="preserve">A segunda pendência é de instrumentação, e atinge o desenvolvedor diretamente, porque ele decide pelo relatório da própria ferramenta. O que um </w:t>
       </w:r>
       <w:r>
         <w:rPr>
+          <w:b w:val="0"/>
           <w:i/>
         </w:rPr>
-        <w:t>harnes</w:t>
-      </w:r>
-      <w:r>
-        <w:rPr>
+        <w:t xml:space="preserve">harness</w:t>
+      </w:r>
+      <w:r>
+        <w:rPr>
+          <w:b w:val="0"/>
+          <w:i w:val="0"/>
+        </w:rPr>
+        <w:t xml:space="preserve"> relata sobre o próprio custo diverge do que ele gasta, e cada um omite um conjunto diferente de chamadas reais ao modelo. Kapoor et al. (2024) mostram que a avaliação de agentes ignora o custo e por isso erra sobre a origem dos ganhos, e Kapoor et al. (2025) registram que as avaliações raramente relatam custo e que comparações entre </w:t>
+      </w:r>
+      <w:r>
+        <w:rPr>
+          <w:b w:val="0"/>
           <w:i/>
         </w:rPr>
-        <w:t>s</w:t>
-      </w:r>
-      <w:r>
-        <w:t xml:space="preserve"> relata sobre o próprio custo diverge do que ele gasta, e cada um omite um conjunto diferente de chamadas reais ao modelo. Kapoor </w:t>
-      </w:r>
-      <w:r>
-        <w:rPr>
+        <w:t xml:space="preserve">harnesses</w:t>
+      </w:r>
+      <w:r>
+        <w:rPr>
+          <w:b w:val="0"/>
+          <w:i w:val="0"/>
+        </w:rPr>
+        <w:t xml:space="preserve"> são raras. Por isso a medição ocorrerá em um </w:t>
+      </w:r>
+      <w:r>
+        <w:rPr>
+          <w:b w:val="0"/>
           <w:i/>
         </w:rPr>
-        <w:t>et al.</w:t>
-      </w:r>
-      <w:r>
-        <w:t xml:space="preserve"> (2024) mostram que a avaliação de agentes ignora o custo e por isso erra sobre a origem dos ganhos, e Kapoor </w:t>
-      </w:r>
-      <w:r>
-        <w:rPr>
-          <w:i/>
-        </w:rPr>
-        <w:t>et al.</w:t>
-      </w:r>
-      <w:r>
-        <w:t xml:space="preserve"> (2</w:t>
-      </w:r>
-      <w:r>
-        <w:t xml:space="preserve">025) registram que as avaliações raramente relatam custo e que comparações entre </w:t>
-      </w:r>
-      <w:r>
-        <w:rPr>
-          <w:i/>
-        </w:rPr>
-        <w:t>harnesses</w:t>
-      </w:r>
-      <w:r>
-        <w:t xml:space="preserve"> são raras. Por isso a medição ocorrerá em um proxy externo, e o objetivo (6) quantificará essa divergência.</w:t>
+        <w:t xml:space="preserve">proxy</w:t>
+      </w:r>
+      <w:r>
+        <w:rPr>
+          <w:b w:val="0"/>
+          <w:i w:val="0"/>
+        </w:rPr>
+        <w:t xml:space="preserve"> externo, e o objetivo (6) quantificará essa divergência.</w:t>
       </w:r>
     </w:p>
     <w:p>
@@ -1340,63 +1279,49 @@
           <w:b w:val="0"/>
           <w:i w:val="0"/>
         </w:rPr>
-        <w:t xml:space="preserve">A métrica primária será o Succ/Mtok (sucesso por milhão de tokens), de Lin </w:t>
+        <w:t xml:space="preserve">As métricas serão os tokens por construção, contados no </w:t>
       </w:r>
       <w:r>
         <w:rPr>
           <w:b w:val="0"/>
           <w:i/>
         </w:rPr>
-        <w:t xml:space="preserve">et al.</w:t>
+        <w:t xml:space="preserve">proxy</w:t>
       </w:r>
       <w:r>
         <w:rPr>
           <w:b w:val="0"/>
           <w:i w:val="0"/>
         </w:rPr>
-        <w:t xml:space="preserve"> (2026), a razão que interessa a quem paga a conta. Sobre ela pesa uma ressalva permanente, a de que o efeito é específico do modelo e pode inverter de sinal. No </w:t>
+        <w:t xml:space="preserve"> e relatados ao lado da fração de testes de aceitação aprovados, e o Succ/Mtok (sucesso por milhão de tokens), de Lin et al. (2026), a razão que interessa a quem paga a conta. Sobre elas pesa uma ressalva permanente, a de que o efeito é específico do modelo e pode inverter de sinal. No Holistic Agent Leaderboard, os modelos da Anthropic vão melhor com o BrowserUse e os da OpenAI com o SeeAct sobre o mesmo </w:t>
       </w:r>
       <w:r>
         <w:rPr>
           <w:b w:val="0"/>
           <w:i/>
         </w:rPr>
-        <w:t xml:space="preserve">Holistic Agent Leaderboard</w:t>
+        <w:t xml:space="preserve">benchmark</w:t>
       </w:r>
       <w:r>
         <w:rPr>
           <w:b w:val="0"/>
           <w:i w:val="0"/>
         </w:rPr>
-        <w:t xml:space="preserve">, os modelos da Anthropic vão melhor com o BrowserUse e os da OpenAI com o SeeAct sobre o mesmo </w:t>
+        <w:t xml:space="preserve"> (Kapoor et al., 2025), e o FrontierHarness registra, para o Claude Code, aproveitamento de </w:t>
       </w:r>
       <w:r>
         <w:rPr>
           <w:b w:val="0"/>
           <w:i/>
         </w:rPr>
-        <w:t xml:space="preserve">benchmark</w:t>
+        <w:t xml:space="preserve">cache</w:t>
       </w:r>
       <w:r>
         <w:rPr>
           <w:b w:val="0"/>
           <w:i w:val="0"/>
         </w:rPr>
-        <w:t xml:space="preserve"> (Kapoor </w:t>
-      </w:r>
-      <w:r>
-        <w:rPr>
-          <w:b w:val="0"/>
-          <w:i/>
-        </w:rPr>
-        <w:t xml:space="preserve">et al.</w:t>
-      </w:r>
-      <w:r>
-        <w:rPr>
-          <w:b w:val="0"/>
-          <w:i w:val="0"/>
-        </w:rPr>
-        <w:t xml:space="preserve">, 2025), e o FrontierHarness registra, para o Claude Code, aproveitamento de cache de 25,0% ponderado por tokens contra 67,8% na célula mediana do mesmo </w:t>
+        <w:t xml:space="preserve"> de 25,0% ponderado por tokens contra 67,8% na célula mediana do mesmo </w:t>
       </w:r>
       <w:r>
         <w:rPr>
@@ -1438,13 +1363,27 @@
           <w:b w:val="0"/>
           <w:i w:val="0"/>
         </w:rPr>
-        <w:t xml:space="preserve">Quanto à natureza, esta é uma pesquisa aplicada, e seu produto será um critério de escolha que um desenvolvedor ou uma empresa poderá aplicar. Quanto à abordagem, combina o quantitativo e o qualitativo. As medidas de custo e de sucesso são quantitativas, e a atribuição de cada diferença a uma decisão de projeto do </w:t>
+        <w:t xml:space="preserve">Quanto à natureza, esta é uma pesquisa aplicada, e seu produto será um critério de escolha que um desenvolvedor ou uma empresa poderá aplicar. Quanto à abordagem, combina o quantitativo e o qualitativo. As medidas de tokens e de sucesso são quantitativas, e a atribuição da diferença à carga fixa ou ao número de passos é qualitativa. Quanto aos objetivos, é exploratória, porque a comparação de dois </w:t>
       </w:r>
       <w:r>
         <w:rPr>
           <w:b w:val="0"/>
           <w:i/>
         </w:rPr>
+        <w:t xml:space="preserve">harnesses</w:t>
+      </w:r>
+      <w:r>
+        <w:rPr>
+          <w:b w:val="0"/>
+          <w:i w:val="0"/>
+        </w:rPr>
+        <w:t xml:space="preserve"> construindo o mesmo produto completo do zero, a partir da mesma especificação, não tem precedente publicado. Quanto aos procedimentos, é experimental, com variável independente manipulada (o </w:t>
+      </w:r>
+      <w:r>
+        <w:rPr>
+          <w:b w:val="0"/>
+          <w:i/>
+        </w:rPr>
         <w:t xml:space="preserve">harness</w:t>
       </w:r>
       <w:r>
@@ -1452,35 +1391,7 @@
           <w:b w:val="0"/>
           <w:i w:val="0"/>
         </w:rPr>
-        <w:t xml:space="preserve"> é qualitativa. Quanto aos objetivos, é exploratória, porque a comparação com linhagem de </w:t>
-      </w:r>
-      <w:r>
-        <w:rPr>
-          <w:b w:val="0"/>
-          <w:i/>
-        </w:rPr>
-        <w:t xml:space="preserve">harness</w:t>
-      </w:r>
-      <w:r>
-        <w:rPr>
-          <w:b w:val="0"/>
-          <w:i w:val="0"/>
-        </w:rPr>
-        <w:t xml:space="preserve"> fixa não tem precedente publicado. Quanto aos procedimentos, é experimental, com variável independente manipulada (o </w:t>
-      </w:r>
-      <w:r>
-        <w:rPr>
-          <w:b w:val="0"/>
-          <w:i/>
-        </w:rPr>
-        <w:t xml:space="preserve">harness</w:t>
-      </w:r>
-      <w:r>
-        <w:rPr>
-          <w:b w:val="0"/>
-          <w:i w:val="0"/>
-        </w:rPr>
-        <w:t xml:space="preserve">), variáveis controladas (modelo, tarefa e limites) e um grupo de controle. Quanto ao método, é dedutivo, porque parte de hipóteses declaradas antes da coleta e as submete a teste (Gil, 2022; Prodanov; Freitas, 2013).</w:t>
+        <w:t xml:space="preserve">) e variáveis controladas (modelo, especificação, espaço de trabalho inicial e limites). Quanto ao método, é dedutivo, porque parte de hipóteses declaradas antes da coleta e as submete a teste.</w:t>
       </w:r>
     </w:p>
     <w:p>
@@ -1508,7 +1419,7 @@
           <w:b w:val="0"/>
           <w:i w:val="0"/>
         </w:rPr>
-        <w:t xml:space="preserve"> mantido no repositório do projeto (YuukiFST, 2026). Nesse arranjo, as fontes brutas ficam guardadas sem alteração, um agente de codificação escreve as páginas de síntese, cada operação entra em um registro cronológico e as dúvidas vão para uma fila de revisão. O autor curou as fontes e revisou cada síntese, e cada afirmação citada neste texto foi conferida na obra original, com o trecho copiado ao lado do veredito. A Portaria CNPq nº 2.664/2026 pede que o uso de inteligência artificial generativa seja declarado com a ferramenta e a finalidade (Brasil, 2026). A ferramenta foi o Claude Code, e a finalidade foi que o agente entendesse o tema do projeto e ajudasse a buscar mais artigos sobre o tema escolhido. O autor responde pelo texto final.</w:t>
+        <w:t xml:space="preserve">, padrão descrito por Karpathy (2026) e mantido no repositório do projeto (YuukiFST, 2026b). Nesse arranjo, as fontes brutas ficam guardadas sem alteração, um agente de codificação escreve as páginas de síntese, cada operação entra em um registro cronológico e as dúvidas vão para uma fila de revisão. O autor curou as fontes e revisou cada síntese, e cada afirmação citada neste texto foi conferida na obra original, com o trecho copiado ao lado do veredito. A Portaria CNPq nº 2.664/2026 pede que o uso de inteligência artificial generativa seja declarado com a ferramenta e a finalidade (Brasil, 2026). A ferramenta foi o Claude Code, e a finalidade foi que o agente entendesse o tema do projeto e ajudasse a buscar mais artigos sobre o tema escolhido. O autor responde pelo texto final.</w:t>
       </w:r>
     </w:p>
     <w:p>
@@ -1518,16 +1429,39 @@
         <w:jc w:val="both"/>
       </w:pPr>
       <w:r>
-        <w:t>A medição ocorrerá em</w:t>
-      </w:r>
-      <w:r>
-        <w:t xml:space="preserve"> duas camadas, relatadas em separado. A Camada 1 medirá a forma da requisição contra um endpoint simulado que não encaminha nada ao modelo: quantos esquemas de ferramenta, quantos bytes de prompt de sistema e quantos tokens cada braço envia na primeira req</w:t>
-      </w:r>
-      <w:r>
-        <w:t>uisição e a cada passo seguinte. Essa camada não consome cota e é determinística. A Camada 2 medirá o desfecho das tarefas contra o modelo real, consome cota e é estocástica. Mais bytes por requisição não significam, por si, resultado pior; a Camada 2 dirá</w:t>
-      </w:r>
-      <w:r>
-        <w:t xml:space="preserve"> quanto dessa carga chega ao resultado.</w:t>
+        <w:rPr>
+          <w:b w:val="0"/>
+          <w:i w:val="0"/>
+        </w:rPr>
+        <w:t xml:space="preserve">A medição ocorrerá em duas camadas, relatadas em separado. A Camada 1 medirá a forma da requisição contra um </w:t>
+      </w:r>
+      <w:r>
+        <w:rPr>
+          <w:b w:val="0"/>
+          <w:i/>
+        </w:rPr>
+        <w:t xml:space="preserve">endpoint</w:t>
+      </w:r>
+      <w:r>
+        <w:rPr>
+          <w:b w:val="0"/>
+          <w:i w:val="0"/>
+        </w:rPr>
+        <w:t xml:space="preserve"> simulado que não encaminha nada ao modelo: quantos esquemas de ferramenta, quantos bytes de </w:t>
+      </w:r>
+      <w:r>
+        <w:rPr>
+          <w:b w:val="0"/>
+          <w:i/>
+        </w:rPr>
+        <w:t xml:space="preserve">prompt</w:t>
+      </w:r>
+      <w:r>
+        <w:rPr>
+          <w:b w:val="0"/>
+          <w:i w:val="0"/>
+        </w:rPr>
+        <w:t xml:space="preserve"> de sistema e quantos tokens cada braço envia na primeira requisição e a cada passo seguinte. Essa camada não consome cota, é determinística e fornece a carga fixa por requisição de que H2 depende. A Camada 2 medirá a construção do produto contra o modelo real, consome cota e é estocástica. Mais bytes por requisição não significam, por si, resultado pior; a Camada 2 dirá quanto dessa carga chega ao resultado.</w:t>
       </w:r>
     </w:p>
     <w:p>
@@ -1537,61 +1471,81 @@
         <w:jc w:val="both"/>
       </w:pPr>
       <w:r>
-        <w:t xml:space="preserve">O conjunto de braços é provisório até o fechamento das verificações de confiabilidade. Serão o </w:t>
-      </w:r>
-      <w:r>
-        <w:rPr>
+        <w:rPr>
+          <w:b w:val="0"/>
+          <w:i w:val="0"/>
+        </w:rPr>
+        <w:t xml:space="preserve">Os braços serão dois: o OpenCode (Opencode, 2026a) e o pi (Earendil, 2026). Os dois são de código aberto, rodam sem interface (opencode run e pi --mode json) e apontam para uma URL base compatível com a API da OpenAI sem adaptação, o que os faz atravessar o </w:t>
+      </w:r>
+      <w:r>
+        <w:rPr>
+          <w:b w:val="0"/>
           <w:i/>
         </w:rPr>
-        <w:t>harness</w:t>
-      </w:r>
-      <w:r>
-        <w:t xml:space="preserve"> zero, o conjunto de implementações de terceiros e o par de destaque pi / oh-my-pi. O executor não traz adaptador </w:t>
-      </w:r>
-      <w:r>
-        <w:t xml:space="preserve">para pi nem para oh-my-pi (Datacurve, 2026); os dois adaptadores, e o </w:t>
-      </w:r>
-      <w:r>
-        <w:rPr>
+        <w:t xml:space="preserve">proxy</w:t>
+      </w:r>
+      <w:r>
+        <w:rPr>
+          <w:b w:val="0"/>
+          <w:i w:val="0"/>
+        </w:rPr>
+        <w:t xml:space="preserve"> de medição. Ficam em pontos distantes do espaço de projeto: o pi envia quatro ferramentas e um </w:t>
+      </w:r>
+      <w:r>
+        <w:rPr>
+          <w:b w:val="0"/>
           <w:i/>
         </w:rPr>
-        <w:t>harness</w:t>
-      </w:r>
-      <w:r>
-        <w:t xml:space="preserve"> zero, serão escritos neste projeto e publicados no repositório dele (YuukiFST, 2026). O </w:t>
-      </w:r>
-      <w:r>
-        <w:rPr>
+        <w:t xml:space="preserve">prompt</w:t>
+      </w:r>
+      <w:r>
+        <w:rPr>
+          <w:b w:val="0"/>
+          <w:i w:val="0"/>
+        </w:rPr>
+        <w:t xml:space="preserve"> de sistema curto, sem subagentes nem permissões; o OpenCode envia mais esquemas de ferramenta, um </w:t>
+      </w:r>
+      <w:r>
+        <w:rPr>
+          <w:b w:val="0"/>
           <w:i/>
         </w:rPr>
-        <w:t>harness</w:t>
-      </w:r>
-      <w:r>
-        <w:t xml:space="preserve"> zero será o controle científico e o único </w:t>
-      </w:r>
-      <w:r>
-        <w:rPr>
+        <w:t xml:space="preserve">prompt</w:t>
+      </w:r>
+      <w:r>
+        <w:rPr>
+          <w:b w:val="0"/>
+          <w:i w:val="0"/>
+        </w:rPr>
+        <w:t xml:space="preserve"> de sistema maior, e traz subagentes, permissões e compactação de contexto. As versões serão fixadas na adoção e registradas no repositório (YuukiFST, 2026b). Este projeto não escreve </w:t>
+      </w:r>
+      <w:r>
+        <w:rPr>
+          <w:b w:val="0"/>
           <w:i/>
         </w:rPr>
-        <w:t>harness</w:t>
-      </w:r>
-      <w:r>
-        <w:t xml:space="preserve"> que este projeto escreve: um laç</w:t>
-      </w:r>
-      <w:r>
-        <w:t xml:space="preserve">o observar/agir com três ferramentas (leitura de arquivo, escrita de arquivo e execução de comandos). Não terá planejamento, compactação de contexto, repetição automática de requisições nem qualquer chamada auxiliar ao modelo, e será mantido abaixo de 400 </w:t>
-      </w:r>
-      <w:r>
-        <w:t xml:space="preserve">linhas de Python por um portão de integração contínua. Ele medirá quanto qualquer </w:t>
-      </w:r>
-      <w:r>
-        <w:rPr>
+        <w:t xml:space="preserve">harness</w:t>
+      </w:r>
+      <w:r>
+        <w:rPr>
+          <w:b w:val="0"/>
+          <w:i w:val="0"/>
+        </w:rPr>
+        <w:t xml:space="preserve"> algum; escreve o instrumento, os </w:t>
+      </w:r>
+      <w:r>
+        <w:rPr>
+          <w:b w:val="0"/>
           <w:i/>
         </w:rPr>
-        <w:t>harness</w:t>
-      </w:r>
-      <w:r>
-        <w:t xml:space="preserve"> acrescenta sobre o laço mais cru capaz de concluir a tarefa.</w:t>
+        <w:t xml:space="preserve">prompts</w:t>
+      </w:r>
+      <w:r>
+        <w:rPr>
+          <w:b w:val="0"/>
+          <w:i w:val="0"/>
+        </w:rPr>
+        <w:t xml:space="preserve"> e os testes de aceitação.</w:t>
       </w:r>
     </w:p>
     <w:p>
@@ -1605,105 +1559,105 @@
           <w:b w:val="0"/>
           <w:i w:val="0"/>
         </w:rPr>
-        <w:t xml:space="preserve">A suíte será composta por 8 tarefas Python do DeepSWE (Huang </w:t>
+        <w:t xml:space="preserve">O produto será o Finn, um SaaS multiempresa em que a empresa cliente fala com o próprio financeiro por voz e recebe lançamento, relatório e aviso no celular (YuukiFST, 2026a). As decisões de produto e de pilha foram registradas antes deste experimento em 21 </w:t>
       </w:r>
       <w:r>
         <w:rPr>
           <w:b w:val="0"/>
           <w:i/>
         </w:rPr>
-        <w:t xml:space="preserve">et al.</w:t>
+        <w:t xml:space="preserve">tickets</w:t>
       </w:r>
       <w:r>
         <w:rPr>
           <w:b w:val="0"/>
           <w:i w:val="0"/>
         </w:rPr>
-        <w:t xml:space="preserve">, 2026), congeladas na adoção e fixadas por </w:t>
+        <w:t xml:space="preserve"> fechados no repositório. A partir deles o autor escreverá, antes de qualquer execução, uma especificação única, congelada por hash SHA-256: um documento com o produto, a pilha fixada pelo dono (TypeScript, TanStack Start, tRPC, Drizzle ORM, PostgreSQL, Vitest) e as restrições gerais, e nove unidades, uma por </w:t>
       </w:r>
       <w:r>
         <w:rPr>
           <w:b w:val="0"/>
           <w:i/>
         </w:rPr>
-        <w:t xml:space="preserve">commit</w:t>
+        <w:t xml:space="preserve">ticket</w:t>
       </w:r>
       <w:r>
         <w:rPr>
           <w:b w:val="0"/>
           <w:i w:val="0"/>
         </w:rPr>
-        <w:t xml:space="preserve"> e por </w:t>
+        <w:t xml:space="preserve"> técnico, em ordem de dependência: separação por empresa, governança, </w:t>
       </w:r>
       <w:r>
         <w:rPr>
           <w:b w:val="0"/>
           <w:i/>
         </w:rPr>
-        <w:t xml:space="preserve">hash</w:t>
+        <w:t xml:space="preserve">flags</w:t>
       </w:r>
       <w:r>
         <w:rPr>
           <w:b w:val="0"/>
           <w:i w:val="0"/>
         </w:rPr>
-        <w:t xml:space="preserve"> SHA-256 de cada tarefa. São tarefas de implementação de longo horizonte sobre repositórios reais. O </w:t>
+        <w:t xml:space="preserve"> por empresa, </w:t>
       </w:r>
       <w:r>
         <w:rPr>
           <w:b w:val="0"/>
           <w:i/>
         </w:rPr>
-        <w:t xml:space="preserve">benchmark</w:t>
+        <w:t xml:space="preserve">pipeline</w:t>
       </w:r>
       <w:r>
         <w:rPr>
           <w:b w:val="0"/>
           <w:i w:val="0"/>
         </w:rPr>
-        <w:t xml:space="preserve"> completo tem 113 tarefas sobre 91 repositórios, com soluções de referência que tocam cerca de 5,5x mais código que as do SWE-Bench Pro. As soluções de referência do DeepSWE acrescentam 668 linhas em média (Huang </w:t>
+        <w:t xml:space="preserve"> de voz, confirmação da transcrição, registro de auditoria, relatório, agendador e cobrança. Cada braço recebe os mesmos bytes e constrói o produto do zero em um único espaço de trabalho: o executor invoca o </w:t>
       </w:r>
       <w:r>
         <w:rPr>
           <w:b w:val="0"/>
           <w:i/>
         </w:rPr>
-        <w:t xml:space="preserve">et al.</w:t>
+        <w:t xml:space="preserve">harness</w:t>
       </w:r>
       <w:r>
         <w:rPr>
           <w:b w:val="0"/>
           <w:i w:val="0"/>
         </w:rPr>
-        <w:t xml:space="preserve">, 2026, Figura 2), contra 32,8 linhas editadas no SWE-bench (Jimenez </w:t>
+        <w:t xml:space="preserve"> uma vez por unidade, em ordem, com um </w:t>
       </w:r>
       <w:r>
         <w:rPr>
           <w:b w:val="0"/>
           <w:i/>
         </w:rPr>
-        <w:t xml:space="preserve">et al.</w:t>
+        <w:t xml:space="preserve">prompt</w:t>
       </w:r>
       <w:r>
         <w:rPr>
           <w:b w:val="0"/>
           <w:i w:val="0"/>
         </w:rPr>
-        <w:t xml:space="preserve">, 2023), cerca de 20x, razão calculada pelo autor deste projeto. A pontuação adotada será o crédito parcial, a fração de testes aprovados do verificador de cada tarefa. É uma adaptação, porque o DeepSWE grada de forma binária e declara a ausência de crédito parcial como limitação (Huang </w:t>
+        <w:t xml:space="preserve"> idêntico para os dois braços, e o que o agente construiu em uma unidade é o ponto de partida da seguinte. O autor não escreve código algum no espaço de trabalho depois do início. Os dois braços recebem a mesma entrada, e por isso a diferença de tokens fica atribuível ao </w:t>
       </w:r>
       <w:r>
         <w:rPr>
           <w:b w:val="0"/>
           <w:i/>
         </w:rPr>
-        <w:t xml:space="preserve">et al.</w:t>
+        <w:t xml:space="preserve">harness</w:t>
       </w:r>
       <w:r>
         <w:rPr>
           <w:b w:val="0"/>
           <w:i w:val="0"/>
         </w:rPr>
-        <w:t xml:space="preserve">, 2026, §8). Sem ela, um escore binário tenderia a ler zero para todos os braços neste nível de modelo, o que será confirmado nas tarefas-piloto.</w:t>
+        <w:t xml:space="preserve">. A pontuação será a fração dos testes de aceitação aprovados; esses testes são escritos pelo autor antes da execução, ficam fora do espaço de trabalho, rodam sobre uma cópia dele ao fim de cada unidade e nunca são os testes que o agente escreve, já que um modelo que alucina uma API também escreve testes que simulam a alucinação. Uma unidade conta como concluída quando todos os seus testes passam, e a construção, quando todos os testes de todas as unidades passam ao fim.</w:t>
       </w:r>
     </w:p>
     <w:p>
@@ -1713,19 +1667,39 @@
         <w:jc w:val="both"/>
       </w:pPr>
       <w:r>
-        <w:t>Serão dois níveis de modelo, um primário e um de robustez,</w:t>
-      </w:r>
-      <w:r>
-        <w:t xml:space="preserve"> ambos gratuitos e no mesmo gateway (Opencode, 2026), relatados em separado. O segundo existe porque o efeito do </w:t>
-      </w:r>
-      <w:r>
-        <w:rPr>
+        <w:rPr>
+          <w:b w:val="0"/>
+          <w:i w:val="0"/>
+        </w:rPr>
+        <w:t xml:space="preserve">Serão dois níveis de modelo, um primário e um de robustez, ambos gratuitos e no mesmo </w:t>
+      </w:r>
+      <w:r>
+        <w:rPr>
+          <w:b w:val="0"/>
           <w:i/>
         </w:rPr>
-        <w:t>harness</w:t>
-      </w:r>
-      <w:r>
-        <w:t xml:space="preserve"> é específico do modelo. Se a ordenação entre braços se inverter entre os níveis, a inversão será o resultado a reportar.</w:t>
+        <w:t xml:space="preserve">gateway</w:t>
+      </w:r>
+      <w:r>
+        <w:rPr>
+          <w:b w:val="0"/>
+          <w:i w:val="0"/>
+        </w:rPr>
+        <w:t xml:space="preserve"> (Opencode, 2026b), relatados em separado. O segundo existe porque o efeito do </w:t>
+      </w:r>
+      <w:r>
+        <w:rPr>
+          <w:b w:val="0"/>
+          <w:i/>
+        </w:rPr>
+        <w:t xml:space="preserve">harness</w:t>
+      </w:r>
+      <w:r>
+        <w:rPr>
+          <w:b w:val="0"/>
+          <w:i w:val="0"/>
+        </w:rPr>
+        <w:t xml:space="preserve"> é específico do modelo. Se a ordenação entre os braços se inverter entre os níveis, a inversão será o resultado a reportar.</w:t>
       </w:r>
     </w:p>
     <w:p>
@@ -1763,37 +1737,53 @@
         <w:jc w:val="both"/>
       </w:pPr>
       <w:r>
-        <w:t>Um único limite será</w:t>
-      </w:r>
-      <w:r>
-        <w:t xml:space="preserve"> imposto, idêntico para todos os braços. É um relógio de parede, cujo valor será três vezes a mediana que o </w:t>
-      </w:r>
-      <w:r>
-        <w:rPr>
+        <w:rPr>
+          <w:b w:val="0"/>
+          <w:i w:val="0"/>
+        </w:rPr>
+        <w:t xml:space="preserve">Um único limite será imposto, idêntico para os dois braços. É um relógio de parede por unidade, cujo valor será três vezes a maior mediana que os dois braços gastarem nas unidades-piloto. O número de passos não será limitado, porque um teto de passos é ele próprio uma decisão de projeto de </w:t>
+      </w:r>
+      <w:r>
+        <w:rPr>
+          <w:b w:val="0"/>
           <w:i/>
         </w:rPr>
-        <w:t>harness</w:t>
-      </w:r>
-      <w:r>
-        <w:t xml:space="preserve"> zero gastar nas tarefas-piloto. O número de passos não será limitado, porque um teto de passos é ele próprio uma decisão de projeto de </w:t>
-      </w:r>
-      <w:r>
-        <w:rPr>
+        <w:t xml:space="preserve">harness</w:t>
+      </w:r>
+      <w:r>
+        <w:rPr>
+          <w:b w:val="0"/>
+          <w:i w:val="0"/>
+        </w:rPr>
+        <w:t xml:space="preserve"> e apagaria a diferença sob teste. O comprimento máximo de saída será forçado idêntico pelo </w:t>
+      </w:r>
+      <w:r>
+        <w:rPr>
+          <w:b w:val="0"/>
           <w:i/>
         </w:rPr>
-        <w:t>harne</w:t>
-      </w:r>
-      <w:r>
-        <w:rPr>
+        <w:t xml:space="preserve">proxy</w:t>
+      </w:r>
+      <w:r>
+        <w:rPr>
+          <w:b w:val="0"/>
+          <w:i w:val="0"/>
+        </w:rPr>
+        <w:t xml:space="preserve">. Os parâmetros de amostragem serão registrados e relatados, mas não normalizados, já que o </w:t>
+      </w:r>
+      <w:r>
+        <w:rPr>
+          <w:b w:val="0"/>
           <w:i/>
         </w:rPr>
-        <w:t>ss</w:t>
-      </w:r>
-      <w:r>
-        <w:t xml:space="preserve"> e apagaria a diferença sob teste. O comprimento máximo de saída será forçado idêntico pelo proxy. Os parâmetros de amostragem serão registrados e relatados, mas não normalizados, já que o gateway os aceita sem os honrar, e Miller (2024) desaconselha mex</w:t>
-      </w:r>
-      <w:r>
-        <w:t>er na temperatura para reduzir variância. O isolamento de ambiente será verificado por um portão que falha fechado.</w:t>
+        <w:t xml:space="preserve">gateway</w:t>
+      </w:r>
+      <w:r>
+        <w:rPr>
+          <w:b w:val="0"/>
+          <w:i w:val="0"/>
+        </w:rPr>
+        <w:t xml:space="preserve"> os aceita sem os honrar, e Miller (2024) desaconselha mexer na temperatura para reduzir variância. O isolamento de ambiente será verificado por um portão que falha fechado.</w:t>
       </w:r>
     </w:p>
     <w:p>
@@ -1803,13 +1793,11 @@
         <w:jc w:val="both"/>
       </w:pPr>
       <w:r>
-        <w:t>Cada célula do experimento, a tripla (braço, tarefa, nível), receberá n ≥ 3 execuções completas, contadas após os descartes, na função redut</w:t>
-      </w:r>
-      <w:r>
-        <w:t>ora de variância que Miller (2024) atribui à reamostragem. Os resultados sairão como mediana com dispersão, porque requisições byte-idênticas podem variar em tokens de saída em um nível gratuito, o que as tarefas-piloto vão medir. Quando a cota não comport</w:t>
-      </w:r>
-      <w:r>
-        <w:t>ar a matriz, a cobertura será reduzida antes das repetições, já que a variância é a principal ameaça ao desenho.</w:t>
+        <w:rPr>
+          <w:b w:val="0"/>
+          <w:i w:val="0"/>
+        </w:rPr>
+        <w:t xml:space="preserve">Cada célula do experimento, o par (braço, nível), receberá n ≥ 3 construções completas, contadas após os descartes, na função redutora de variância que Miller (2024) atribui à reamostragem. Os resultados sairão como mediana com dispersão, porque requisições byte-idênticas podem variar em tokens de saída em um nível gratuito, o que as unidades-piloto vão medir. Quando a cota não comportar a matriz, a cobertura será reduzida antes das repetições, já que a variância é a principal ameaça ao desenho.</w:t>
       </w:r>
     </w:p>
     <w:p>
@@ -1819,17 +1807,39 @@
         <w:jc w:val="both"/>
       </w:pPr>
       <w:r>
-        <w:t xml:space="preserve">A comparação será pareada por tarefa e usará o teste de Wilcoxon dos postos sinalizados sobre o Succ/Mtok por tarefa, bilateral, com α = 0,05. </w:t>
-      </w:r>
-      <w:r>
-        <w:t xml:space="preserve">O teste é não paramétrico porque oito pares não sustentam suposição distribucional, e pareado porque a dificuldade da </w:t>
-      </w:r>
-      <w:r>
-        <w:lastRenderedPageBreak/>
-        <w:t xml:space="preserve">tarefa é o maior fator de perturbação do desenho, que é o que Miller (2024) recomenda ao preferir a diferença pareada por questão à média </w:t>
-      </w:r>
-      <w:r>
-        <w:t>agregada. Com n = 3 e 8 tarefas, a diferença mínima detectável é de cerca de 0,81σ. As predições serão pré-registradas por nível de modelo, e um resultado nulo para H2 será um achado reportável.</w:t>
+        <w:rPr>
+          <w:b w:val="0"/>
+          <w:i w:val="0"/>
+        </w:rPr>
+        <w:t xml:space="preserve">A medida principal será o total de tokens por construção, sempre relatado ao lado da fração final de testes aprovados, para que um braço que falhe barato não pareça o mais barato. A comparação inferencial será pareada por unidade e usará o teste de Wilcoxon dos postos sinalizados, bilateral, com α = 0,05, sobre duas medidas: os tokens de cada unidade e o Succ/Mtok de cada unidade. O teste é não paramétrico porque nove pares não sustentam suposição distribucional, e pareado porque a dificuldade da unidade é o maior fator de perturbação do desenho, que é o que Miller (2024) recomenda ao preferir a diferença pareada por questão à média agregada. As unidades não são independentes, já que a seguinte parte do que o mesmo braço construiu nas anteriores, e um erro cobra de novo mais adiante. Essa dependência é parte do custo do </w:t>
+      </w:r>
+      <w:r>
+        <w:rPr>
+          <w:b w:val="0"/>
+          <w:i/>
+        </w:rPr>
+        <w:t xml:space="preserve">harness</w:t>
+      </w:r>
+      <w:r>
+        <w:rPr>
+          <w:b w:val="0"/>
+          <w:i w:val="0"/>
+        </w:rPr>
+        <w:t xml:space="preserve"> e será reportada por unidade. Com n = 3 e 9 unidades, a diferença mínima detectável é de cerca de 0,76σ. Para H2, os tokens de cada unidade serão decompostos em carga fixa (esquemas e </w:t>
+      </w:r>
+      <w:r>
+        <w:rPr>
+          <w:b w:val="0"/>
+          <w:i/>
+        </w:rPr>
+        <w:t xml:space="preserve">prompt</w:t>
+      </w:r>
+      <w:r>
+        <w:rPr>
+          <w:b w:val="0"/>
+          <w:i w:val="0"/>
+        </w:rPr>
+        <w:t xml:space="preserve"> de sistema, medidos na Camada 1, multiplicados pelo número de passos) e conteúdo da conversa, e a parcela de cada uma na diferença entre braços será reportada por unidade e por construção. As predições serão pré-registradas por nível de modelo, e um resultado nulo para H2 será um achado reportável.</w:t>
       </w:r>
     </w:p>
     <w:p>
@@ -1839,19 +1849,39 @@
         <w:jc w:val="both"/>
       </w:pPr>
       <w:r>
-        <w:t>Cada execução receberá exatamente uma classe. Aquela cujo age</w:t>
-      </w:r>
-      <w:r>
-        <w:t xml:space="preserve">nte não cumpriu a tarefa será um resultado, entrará na estatística e receberá escore zero; nesse grupo, o estouro do relógio de parede contará como resultado, já que repetir converteria uma indisponibilidade do serviço em diferença aparente entre </w:t>
-      </w:r>
-      <w:r>
-        <w:rPr>
+        <w:rPr>
+          <w:b w:val="0"/>
+          <w:i w:val="0"/>
+        </w:rPr>
+        <w:t xml:space="preserve">Cada unidade de cada construção receberá exatamente uma classe. Aquela cujo agente não a concluiu será um resultado, entrará na estatística com a fração de testes que aprovou, e a construção segue para a unidade seguinte a partir do que ficou; nesse grupo, o estouro do relógio de parede contará como resultado, já que repetir converteria uma indisponibilidade do serviço em diferença aparente entre </w:t>
+      </w:r>
+      <w:r>
+        <w:rPr>
+          <w:b w:val="0"/>
           <w:i/>
         </w:rPr>
-        <w:t>harnesses</w:t>
-      </w:r>
-      <w:r>
-        <w:t>. Aquela cuja medição for inconfiável será descartada e registrada como tal, sem reparo nem repetição. A classificação virá do registro do proxy, já que o código de saída não discrimina o desfecho.</w:t>
+        <w:t xml:space="preserve">harnesses</w:t>
+      </w:r>
+      <w:r>
+        <w:rPr>
+          <w:b w:val="0"/>
+          <w:i w:val="0"/>
+        </w:rPr>
+        <w:t xml:space="preserve">. Aquela cuja medição for inconfiável descartará a construção inteira, registrada como tal, sem reparo nem repetição. A classificação virá do registro do </w:t>
+      </w:r>
+      <w:r>
+        <w:rPr>
+          <w:b w:val="0"/>
+          <w:i/>
+        </w:rPr>
+        <w:t xml:space="preserve">proxy</w:t>
+      </w:r>
+      <w:r>
+        <w:rPr>
+          <w:b w:val="0"/>
+          <w:i w:val="0"/>
+        </w:rPr>
+        <w:t xml:space="preserve">, já que o código de saída não discrimina o desfecho.</w:t>
       </w:r>
     </w:p>
     <w:p>
@@ -1872,37 +1902,25 @@
         <w:jc w:val="both"/>
       </w:pPr>
       <w:r>
-        <w:t>Quatro limitações são decl</w:t>
-      </w:r>
-      <w:r>
-        <w:t xml:space="preserve">aradas de partida. O efeito de um </w:t>
-      </w:r>
-      <w:r>
-        <w:rPr>
+        <w:rPr>
+          <w:b w:val="0"/>
+          <w:i w:val="0"/>
+        </w:rPr>
+        <w:t xml:space="preserve">Quatro limitações são declaradas de partida. O efeito de um </w:t>
+      </w:r>
+      <w:r>
+        <w:rPr>
+          <w:b w:val="0"/>
           <w:i/>
         </w:rPr>
-        <w:t>harness</w:t>
-      </w:r>
-      <w:r>
-        <w:t xml:space="preserve"> é específico do modelo e pode inverter de sinal, o que restringe qualquer conclusão ao nível de modelo em que for obtida; o objetivo (5) existe para testar isso. A transferência para modelos pequenos fica deliberad</w:t>
-      </w:r>
-      <w:r>
-        <w:t>amente em aberto e é registrada como trabalho futuro, porque o único modelo pequeno viável havia sido treinado dentro de um dos braços, o que invalidaria a medição de destaque. Os valores absolutos não serão comparáveis ao placar público do DeepSWE, porque</w:t>
-      </w:r>
-      <w:r>
-        <w:t xml:space="preserve"> toda linha de base publicada usa um </w:t>
-      </w:r>
-      <w:r>
-        <w:rPr>
-          <w:i/>
-        </w:rPr>
-        <w:t>harness</w:t>
-      </w:r>
-      <w:r>
-        <w:t xml:space="preserve"> de ferramenta única, e os valores em dólar citados de fontes externas vêm de outros modelos e de níveis pagos; a comparação válida aqui é entre os próprios braços. O custo em dinheiro será um contrafactual de or</w:t>
-      </w:r>
-      <w:r>
-        <w:t>dem de grandeza sobre tarifas pagas publicadas, rotulado como tal onde apareça.</w:t>
+        <w:t xml:space="preserve">harness</w:t>
+      </w:r>
+      <w:r>
+        <w:rPr>
+          <w:b w:val="0"/>
+          <w:i w:val="0"/>
+        </w:rPr>
+        <w:t xml:space="preserve"> é específico do modelo e pode inverter de sinal, o que restringe qualquer conclusão ao nível de modelo em que for obtida; o objetivo (5) existe para testar isso. O produto é um único SaaS sobre uma única pilha (TypeScript, TanStack Start, tRPC, Drizzle), então o resultado vale para tarefas dessa família, e a transferência para outras pilhas fica registrada como trabalho futuro. A especificação é escrita pelo autor, então carrega as escolhas de um humano, e cada braço carrega os próprios erros de uma unidade para a seguinte; a mitigação é que os dois braços recebem a mesma especificação e partem do mesmo espaço de trabalho vazio, e a comparação é pareada por unidade. Os valores absolutos não serão comparáveis a placares públicos, porque o produto é próprio, e os valores em dólar citados de fontes externas vêm de outros modelos e de níveis pagos; a comparação válida aqui é entre os dois braços, e o custo em dinheiro será um contrafactual de ordem de grandeza sobre tarifas pagas publicadas, rotulado como tal onde apareça.</w:t>
       </w:r>
     </w:p>
     <w:p>
@@ -2034,15 +2052,19 @@
             </w:pPr>
             <w:r>
               <w:rPr>
+                <w:b w:val="0"/>
+                <w:i/>
                 <w:sz w:val="22"/>
               </w:rPr>
-              <w:t xml:space="preserve">Executor e benchmark (Pier e DeepSWE, </w:t>
+              <w:t xml:space="preserve">Harnesses</w:t>
             </w:r>
             <w:r>
               <w:rPr>
+                <w:b w:val="0"/>
+                <w:i w:val="0"/>
                 <w:sz w:val="22"/>
               </w:rPr>
-              <w:t>licença Apache-2.0)</w:t>
+              <w:t xml:space="preserve"> e ferramentas (OpenCode e pi, código aberto; Node.js e PostgreSQL)</w:t>
             </w:r>
           </w:p>
         </w:tc>
@@ -2161,13 +2183,25 @@
         <w:jc w:val="both"/>
       </w:pPr>
       <w:r>
-        <w:t>O total em dinheiro é zero, e o limite que restringe o experimento será a cota do nível gra</w:t>
-      </w:r>
-      <w:r>
-        <w:t>tuito do gateway, a ser medida nas tarefas-piloto contra o número de requisições que uma tarefa do DeepSWE consome. Por isso a matriz será executada em lotes distribuídos ao longo de dias, e o custo monetário aparecerá apenas como contrafactual de ordem de</w:t>
-      </w:r>
-      <w:r>
-        <w:t xml:space="preserve"> grandeza sobre as tarifas pagas publicadas.</w:t>
+        <w:rPr>
+          <w:b w:val="0"/>
+          <w:i w:val="0"/>
+        </w:rPr>
+        <w:t xml:space="preserve">O total em dinheiro é zero, e o limite que restringe o experimento será a cota do nível gratuito do </w:t>
+      </w:r>
+      <w:r>
+        <w:rPr>
+          <w:b w:val="0"/>
+          <w:i/>
+        </w:rPr>
+        <w:t xml:space="preserve">gateway</w:t>
+      </w:r>
+      <w:r>
+        <w:rPr>
+          <w:b w:val="0"/>
+          <w:i w:val="0"/>
+        </w:rPr>
+        <w:t xml:space="preserve">, a ser medida nas unidades-piloto contra o número de requisições que uma unidade do Finn consome. Por isso cada construção será executada em lotes distribuídos ao longo de dias, retomada na fronteira entre unidades, e o custo monetário aparecerá apenas como contrafactual de ordem de grandeza sobre as tarifas pagas publicadas.</w:t>
       </w:r>
     </w:p>
     <w:p>
@@ -2195,7 +2229,7 @@
           <w:b w:val="0"/>
           <w:i w:val="0"/>
         </w:rPr>
-        <w:t xml:space="preserve">A cota gratuita deve ser o limite vinculante, então a cadência prevista é de um lote da matriz por dia e o calendário se estende por semanas. A folga está concentrada na execução da matriz e nos portões de confiabilidade dos braços, onde está o risco. Os meses vão de agosto de 2026 a janeiro de 2027. A escrita deste projeto foi concluída em 11 de setembro de 2026, mês de entrega, e os experimentos práticos ocorrem a partir de outubro.</w:t>
+        <w:t xml:space="preserve">A cota gratuita deve ser o limite vinculante, então a cadência prevista é de um lote da matriz por dia e o calendário se estende por semanas. A folga está concentrada na execução da matriz e na escrita da especificação e dos testes de aceitação, onde está o risco. Os meses vão de agosto de 2026 a janeiro de 2027. A escrita deste projeto foi concluída em setembro de 2026, mês de entrega, e os experimentos práticos ocorrem a partir de outubro.</w:t>
       </w:r>
     </w:p>
     <w:p>
@@ -2611,9 +2645,11 @@
             </w:pPr>
             <w:r>
               <w:rPr>
+                <w:b w:val="0"/>
+                <w:i w:val="0"/>
                 <w:sz w:val="18"/>
               </w:rPr>
-              <w:t>CONSTRUÇÃO DO INSTRUMENTO E DO HARNESS ZERO</w:t>
+              <w:t xml:space="preserve">CONSTRUÇÃO DO INSTRUMENTO, DA ESPECIFICAÇÃO E DOS TESTES DE ACEITAÇÃO</w:t>
             </w:r>
           </w:p>
         </w:tc>
@@ -3582,21 +3618,21 @@
           <w:b w:val="0"/>
           <w:i w:val="0"/>
         </w:rPr>
-        <w:t xml:space="preserve">ASSOCIAÇÃO BRASILEIRA DE NORMAS TÉCNICAS. </w:t>
+        <w:t xml:space="preserve">BRASIL. Conselho Nacional de Desenvolvimento Científico e Tecnológico. </w:t>
       </w:r>
       <w:r>
         <w:rPr>
           <w:b/>
           <w:i w:val="0"/>
         </w:rPr>
-        <w:t xml:space="preserve">ABNT NBR 10520</w:t>
+        <w:t xml:space="preserve">Portaria CNPq nº 2.664, de 6 de março de 2026</w:t>
       </w:r>
       <w:r>
         <w:rPr>
           <w:b w:val="0"/>
           <w:i w:val="0"/>
         </w:rPr>
-        <w:t xml:space="preserve">: informação e documentação: citações em documentos: apresentação. Rio de Janeiro: ABNT, 2023.</w:t>
+        <w:t xml:space="preserve">. Institui a Política de Integridade na Atividade Científica do CNPq. Diário Oficial da União: seção 1, Brasília, DF, p. 4, 11 mar. 2026. Disponível em: http://memoria2.cnpq.br/web/guest/view/-/journal_content/56_INSTANCE_0oED/10157/23142775. Acesso em: 11 set. 2026.</w:t>
       </w:r>
     </w:p>
     <w:p>
@@ -3604,25 +3640,216 @@
         <w:spacing w:after="240" w:line="240" w:lineRule="auto"/>
       </w:pPr>
       <w:r>
+        <w:t xml:space="preserve">EARENDIL. </w:t>
+      </w:r>
+      <w:r>
+        <w:rPr>
+          <w:b/>
+        </w:rPr>
+        <w:t>Pi, minimal and performant</w:t>
+      </w:r>
+      <w:r>
+        <w:t>. 2026. Publ</w:t>
+      </w:r>
+      <w:r>
+        <w:t>icação de blogue institucional. Disponível em: https://earendil.com/posts/pi-autoresearch-and-databricks/. Acesso em: 28 ago. 2026.</w:t>
+      </w:r>
+    </w:p>
+    <w:p>
+      <w:pPr>
+        <w:spacing w:after="240" w:line="240" w:lineRule="auto"/>
+      </w:pPr>
+      <w:r>
+        <w:t xml:space="preserve">HARNESSRANK. </w:t>
+      </w:r>
+      <w:r>
+        <w:rPr>
+          <w:b/>
+        </w:rPr>
+        <w:t>HarnessRank</w:t>
+      </w:r>
+      <w:r>
+        <w:t>: coding-age</w:t>
+      </w:r>
+      <w:r>
+        <w:t>nt harness rankings. 2026. Disponível em: https://harnessrank.net/. Acesso em: 28 ago. 2026.</w:t>
+      </w:r>
+    </w:p>
+    <w:p>
+      <w:pPr>
+        <w:spacing w:after="240" w:line="240" w:lineRule="auto"/>
+      </w:pPr>
+      <w:r>
+        <w:t xml:space="preserve">KAPOOR, Sayash; STROEBL, Benedikt; SIEGEL, Zachary S.; NADGIR, Nitya; NARAYANAN, Arvind. </w:t>
+      </w:r>
+      <w:r>
+        <w:rPr>
+          <w:b/>
+        </w:rPr>
+        <w:t>AI agents that matter</w:t>
+      </w:r>
+      <w:r>
+        <w:t xml:space="preserve">. arXiv:2407.01502, 2024. </w:t>
+      </w:r>
+      <w:r>
+        <w:rPr>
+          <w:i/>
+        </w:rPr>
+        <w:t>Preprint</w:t>
+      </w:r>
+      <w:r>
+        <w:t>, não revisado por pares. Disponível em: https://arxiv.org/abs/2407.01502. Acesso em: 28 ago. 2</w:t>
+      </w:r>
+      <w:r>
+        <w:t>026.</w:t>
+      </w:r>
+    </w:p>
+    <w:p>
+      <w:pPr>
+        <w:spacing w:after="240" w:line="240" w:lineRule="auto"/>
+      </w:pPr>
+      <w:r>
+        <w:t xml:space="preserve">KAPOOR, Sayash </w:t>
+      </w:r>
+      <w:r>
+        <w:rPr>
+          <w:i/>
+        </w:rPr>
+        <w:t>et al.</w:t>
+      </w:r>
+      <w:r>
+        <w:t xml:space="preserve"> </w:t>
+      </w:r>
+      <w:r>
+        <w:rPr>
+          <w:b/>
+        </w:rPr>
+        <w:t>Holistic Agent Leaderboard</w:t>
+      </w:r>
+      <w:r>
+        <w:t xml:space="preserve">: the missing infrastructure for AI agent evaluation. arXiv:2510.11977, 2025. </w:t>
+      </w:r>
+      <w:r>
+        <w:rPr>
+          <w:i/>
+        </w:rPr>
+        <w:t>Preprint</w:t>
+      </w:r>
+      <w:r>
+        <w:t>, não revisado por pares. Disponível em: https://arxiv.org/abs/2510.11977. Acesso em: 28 ago. 2026.</w:t>
+      </w:r>
+    </w:p>
+    <w:p>
+      <w:pPr>
+        <w:spacing w:after="240" w:line="240" w:lineRule="auto"/>
+      </w:pPr>
+      <w:r>
         <w:rPr>
           <w:b w:val="0"/>
           <w:i w:val="0"/>
         </w:rPr>
-        <w:t xml:space="preserve">ASSOCIAÇÃO BRASILEIRA DE NORMAS TÉCNICAS. </w:t>
+        <w:t xml:space="preserve">KARPATHY, Andrej. LLM Wiki: a pattern for building personal knowledge bases using LLMs. 2026. Gist (GitHub). Disponível em: https://gist.github.com/karpathy/442a6bf555914893e9891c11519de94f. Acesso em: 14 set. 2026.</w:t>
+      </w:r>
+    </w:p>
+    <w:p>
+      <w:pPr>
+        <w:spacing w:after="240" w:line="240" w:lineRule="auto"/>
+      </w:pPr>
+      <w:r>
+        <w:t>LEE, Yoonho; NAIR</w:t>
+      </w:r>
+      <w:r>
+        <w:t xml:space="preserve">, Roshen; ZHANG, Qizheng; LEE, Kangwook; KHATTAB, Omar; FINN, Chelsea. </w:t>
+      </w:r>
+      <w:r>
+        <w:rPr>
+          <w:b/>
+        </w:rPr>
+        <w:t>Meta-Harness</w:t>
+      </w:r>
+      <w:r>
+        <w:t xml:space="preserve">: end-to-end optimization of model harnesses. arXiv:2603.28052, 2026. </w:t>
+      </w:r>
+      <w:r>
+        <w:rPr>
+          <w:i/>
+        </w:rPr>
+        <w:t>Preprint</w:t>
+      </w:r>
+      <w:r>
+        <w:t>, não revisado por pares. Disponível em: https://arxiv.org/abs/2603.28052. Acesso em: 9 set. 20</w:t>
+      </w:r>
+      <w:r>
+        <w:t>26.</w:t>
+      </w:r>
+    </w:p>
+    <w:p>
+      <w:pPr>
+        <w:spacing w:after="240" w:line="240" w:lineRule="auto"/>
+      </w:pPr>
+      <w:r>
+        <w:t xml:space="preserve">LIN, Jiahang; LIU, Shichun; PAN, Chengjun; LIN, Lizhi; DOU, Shihan; XI, Zhiheng; HUANG, Xuanjing; YAN, Hang; HAN, Zhenhua; GUI, Tao; JIANG, Yu-Gang. </w:t>
+      </w:r>
+      <w:r>
+        <w:rPr>
+          <w:b/>
+        </w:rPr>
+        <w:t>Agentic harness engineering</w:t>
+      </w:r>
+      <w:r>
+        <w:t>: observability-driven automatic evolution of coding-agent harnesses. arXiv:</w:t>
+      </w:r>
+      <w:r>
+        <w:t xml:space="preserve">2604.25850, 2026. </w:t>
+      </w:r>
+      <w:r>
+        <w:rPr>
+          <w:i/>
+        </w:rPr>
+        <w:t>Preprint</w:t>
+      </w:r>
+      <w:r>
+        <w:t>, não revisado por pares. Disponível em: https://arxiv.org/abs/2604.25850. Acesso em: 28 ago. 2026.</w:t>
+      </w:r>
+    </w:p>
+    <w:p>
+      <w:pPr>
+        <w:spacing w:after="240" w:line="240" w:lineRule="auto"/>
+      </w:pPr>
+      <w:r>
+        <w:rPr>
+          <w:b w:val="0"/>
+          <w:i w:val="0"/>
+        </w:rPr>
+        <w:t xml:space="preserve">MILLER, Evan. </w:t>
       </w:r>
       <w:r>
         <w:rPr>
           <w:b/>
           <w:i w:val="0"/>
         </w:rPr>
-        <w:t xml:space="preserve">ABNT NBR 6023</w:t>
+        <w:t xml:space="preserve">Adding error bars to evals</w:t>
       </w:r>
       <w:r>
         <w:rPr>
           <w:b w:val="0"/>
           <w:i w:val="0"/>
         </w:rPr>
-        <w:t xml:space="preserve">: informação e documentação: referências: elaboração. Rio de Janeiro: ABNT, 2025a.</w:t>
+        <w:t xml:space="preserve">: a statistical approach to language model evaluations. arXiv:2411.00640, 2024. </w:t>
+      </w:r>
+      <w:r>
+        <w:rPr>
+          <w:b w:val="0"/>
+          <w:i/>
+        </w:rPr>
+        <w:t xml:space="preserve">Preprint</w:t>
+      </w:r>
+      <w:r>
+        <w:rPr>
+          <w:b w:val="0"/>
+          <w:i w:val="0"/>
+        </w:rPr>
+        <w:t xml:space="preserve">, não revisado por pares. Disponível em: https://arxiv.org/abs/2411.00640. Acesso em: 28 ago. 2026.</w:t>
       </w:r>
     </w:p>
     <w:p>
@@ -3630,25 +3857,37 @@
         <w:spacing w:after="240" w:line="240" w:lineRule="auto"/>
       </w:pPr>
       <w:r>
-        <w:rPr>
-          <w:b w:val="0"/>
-          <w:i w:val="0"/>
-        </w:rPr>
-        <w:t xml:space="preserve">ASSOCIAÇÃO BRASILEIRA DE NORMAS TÉCNICAS. </w:t>
+        <w:t xml:space="preserve">NING, Xuying </w:t>
+      </w:r>
+      <w:r>
+        <w:rPr>
+          <w:i/>
+        </w:rPr>
+        <w:t>et al.</w:t>
+      </w:r>
+      <w:r>
+        <w:t xml:space="preserve"> </w:t>
       </w:r>
       <w:r>
         <w:rPr>
           <w:b/>
-          <w:i w:val="0"/>
-        </w:rPr>
-        <w:t xml:space="preserve">ABNT NBR 15287</w:t>
-      </w:r>
-      <w:r>
-        <w:rPr>
-          <w:b w:val="0"/>
-          <w:i w:val="0"/>
-        </w:rPr>
-        <w:t xml:space="preserve">: informação e documentação: projeto de pesquisa: apresentação. Rio de Janeiro: ABNT, 2025b.</w:t>
+        </w:rPr>
+        <w:t>Code as agent harness</w:t>
+      </w:r>
+      <w:r>
+        <w:t>. arXiv:2605.18747, 2</w:t>
+      </w:r>
+      <w:r>
+        <w:t xml:space="preserve">026. </w:t>
+      </w:r>
+      <w:r>
+        <w:rPr>
+          <w:i/>
+        </w:rPr>
+        <w:t>Preprint</w:t>
+      </w:r>
+      <w:r>
+        <w:t>, não revisado por pares. Disponível em: https://arxiv.org/abs/2605.18747. Acesso em: 28 ago. 2026.</w:t>
       </w:r>
     </w:p>
     <w:p>
@@ -3660,21 +3899,7 @@
           <w:b w:val="0"/>
           <w:i w:val="0"/>
         </w:rPr>
-        <w:t xml:space="preserve">BRASIL. Conselho Nacional de Desenvolvimento Científico e Tecnológico. </w:t>
-      </w:r>
-      <w:r>
-        <w:rPr>
-          <w:b/>
-          <w:i w:val="0"/>
-        </w:rPr>
-        <w:t xml:space="preserve">Portaria CNPq nº 2.664, de 6 de março de 2026</w:t>
-      </w:r>
-      <w:r>
-        <w:rPr>
-          <w:b w:val="0"/>
-          <w:i w:val="0"/>
-        </w:rPr>
-        <w:t xml:space="preserve">. Institui a Política de Integridade na Atividade Científica do CNPq. Diário Oficial da União: seção 1, Brasília, DF, p. 4, 11 mar. 2026. Disponível em: http://memoria2.cnpq.br/web/guest/view/-/journal_content/56_INSTANCE_0oED/10157/23142775. Acesso em: 11 set. 2026.</w:t>
+        <w:t xml:space="preserve">OPENCODE. OpenCode: the open source coding agent. 2026a. Repositório de código. Disponível em: https://github.com/anomalyco/opencode. Acesso em: 14 set. 2026.</w:t>
       </w:r>
     </w:p>
     <w:p>
@@ -3682,16 +3907,11 @@
         <w:spacing w:after="240" w:line="240" w:lineRule="auto"/>
       </w:pPr>
       <w:r>
-        <w:t xml:space="preserve">DATACURVE. </w:t>
-      </w:r>
-      <w:r>
-        <w:rPr>
-          <w:b/>
-        </w:rPr>
-        <w:t>Pier</w:t>
-      </w:r>
-      <w:r>
-        <w:t>: a Harbor fork built for DeepSWE. 2026. Repositório de código. Disponível em: https://github.com/datacurve-ai/pier. Acesso em: 28 ago. 2026.</w:t>
+        <w:rPr>
+          <w:b w:val="0"/>
+          <w:i w:val="0"/>
+        </w:rPr>
+        <w:t xml:space="preserve">OPENCODE. Zen. 2026b. Documentação do produto. Disponível em: https://opencode.ai/docs/zen/. Acesso em: 28 ago. 2026.</w:t>
       </w:r>
     </w:p>
     <w:p>
@@ -3699,19 +3919,16 @@
         <w:spacing w:after="240" w:line="240" w:lineRule="auto"/>
       </w:pPr>
       <w:r>
-        <w:t xml:space="preserve">EARENDIL. </w:t>
+        <w:t xml:space="preserve">RUNTA. </w:t>
       </w:r>
       <w:r>
         <w:rPr>
           <w:b/>
         </w:rPr>
-        <w:t>Pi, minimal and performant</w:t>
-      </w:r>
-      <w:r>
-        <w:t>. 2026. Publ</w:t>
-      </w:r>
-      <w:r>
-        <w:t>icação de blogue institucional. Disponível em: https://earendil.com/posts/pi-autoresearch-and-databricks/. Acesso em: 28 ago. 2026.</w:t>
+        <w:t>Introducing the FrontierHarness eval</w:t>
+      </w:r>
+      <w:r>
+        <w:t>. 2026. Publicação de blogue institucional. Disponível em: https://runta.com/blog/introducing-frontierharness-eval/. Acesso em: 9 set. 2026.</w:t>
       </w:r>
     </w:p>
     <w:p>
@@ -3719,25 +3936,38 @@
         <w:spacing w:after="240" w:line="240" w:lineRule="auto"/>
       </w:pPr>
       <w:r>
-        <w:rPr>
-          <w:b w:val="0"/>
-          <w:i w:val="0"/>
-        </w:rPr>
-        <w:t xml:space="preserve">GIL, Antonio Carlos. </w:t>
+        <w:lastRenderedPageBreak/>
+        <w:t>WAN</w:t>
+      </w:r>
+      <w:r>
+        <w:t xml:space="preserve">G, Ruhan </w:t>
+      </w:r>
+      <w:r>
+        <w:rPr>
+          <w:i/>
+        </w:rPr>
+        <w:t>et al.</w:t>
+      </w:r>
+      <w:r>
+        <w:t xml:space="preserve"> </w:t>
       </w:r>
       <w:r>
         <w:rPr>
           <w:b/>
-          <w:i w:val="0"/>
-        </w:rPr>
-        <w:t xml:space="preserve">Como elaborar projetos de pesquisa</w:t>
-      </w:r>
-      <w:r>
-        <w:rPr>
-          <w:b w:val="0"/>
-          <w:i w:val="0"/>
-        </w:rPr>
-        <w:t xml:space="preserve">. 7. ed. São Paulo: Atlas, 2022.</w:t>
+        </w:rPr>
+        <w:t>Harness Handbook</w:t>
+      </w:r>
+      <w:r>
+        <w:t xml:space="preserve">: making evolving agent harnesses readable, navigable, and editable. arXiv:2607.13285, 2026. </w:t>
+      </w:r>
+      <w:r>
+        <w:rPr>
+          <w:i/>
+        </w:rPr>
+        <w:t>Preprint</w:t>
+      </w:r>
+      <w:r>
+        <w:t>, não revisado por pares. Disponível em: https://arxiv.org/abs/2607.13285. Acesso em: 9 set. 2026.</w:t>
       </w:r>
     </w:p>
     <w:p>
@@ -3745,19 +3975,22 @@
         <w:spacing w:after="240" w:line="240" w:lineRule="auto"/>
       </w:pPr>
       <w:r>
-        <w:t xml:space="preserve">HARNESSRANK. </w:t>
+        <w:t>YANG, John; JIMENEZ, Car</w:t>
+      </w:r>
+      <w:r>
+        <w:t xml:space="preserve">los E.; WETTIG, Alexander; LIERET, Kilian; YAO, Shunyu; NARASIMHAN, Karthik; PRESS, Ofir. </w:t>
       </w:r>
       <w:r>
         <w:rPr>
           <w:b/>
         </w:rPr>
-        <w:t>HarnessRank</w:t>
-      </w:r>
-      <w:r>
-        <w:t>: coding-age</w:t>
-      </w:r>
-      <w:r>
-        <w:t>nt harness rankings. 2026. Disponível em: https://harnessrank.net/. Acesso em: 28 ago. 2026.</w:t>
+        <w:t>SWE-agent</w:t>
+      </w:r>
+      <w:r>
+        <w:t>: agent-computer interfaces enable automated software engineering. arXiv:2405.15793, 2024. Trabalho apresentado na Conference on Neural Information Processin</w:t>
+      </w:r>
+      <w:r>
+        <w:t>g Systems (NeurIPS), 2024. Disponível em: https://arxiv.org/abs/2405.15793. Acesso em: 28 ago. 2026.</w:t>
       </w:r>
     </w:p>
     <w:p>
@@ -3765,29 +3998,19 @@
         <w:spacing w:after="240" w:line="240" w:lineRule="auto"/>
       </w:pPr>
       <w:r>
-        <w:lastRenderedPageBreak/>
-        <w:t xml:space="preserve">HUANG, Wenqi; LEE, Charley; TNG, Leonard; GE, Serena. </w:t>
+        <w:t xml:space="preserve">YAO, Shunyu; ZHAO, Jeffrey; YU, Dian; DU, Nan; SHAFRAN, Izhak; NARASIMHAN, Karthik; CAO, Yuan. </w:t>
       </w:r>
       <w:r>
         <w:rPr>
           <w:b/>
         </w:rPr>
-        <w:t>DeepSWE</w:t>
-      </w:r>
-      <w:r>
-        <w:t>: measuring frontier coding agents on original, long-horizon engineering tasks. arXiv:2607.07946, 2026</w:t>
-      </w:r>
-      <w:r>
-        <w:t xml:space="preserve">. </w:t>
-      </w:r>
-      <w:r>
-        <w:rPr>
-          <w:i/>
-        </w:rPr>
-        <w:t>Preprint</w:t>
-      </w:r>
-      <w:r>
-        <w:t>, não revisado por pares. Disponível em: https://arxiv.org/abs/2607.07946. Acesso em: 28 ago. 2026.</w:t>
+        <w:t>ReAct</w:t>
+      </w:r>
+      <w:r>
+        <w:t xml:space="preserve">: synergizing reasoning and acting in language models. </w:t>
+      </w:r>
+      <w:r>
+        <w:t>arXiv:2210.03629, 2022. Trabalho apresentado na International Conference on Learning Representations (ICLR), 2023. Disponível em: https://arxiv.org/abs/2210.03629. Acesso em: 28 ago. 2026.</w:t>
       </w:r>
     </w:p>
     <w:p>
@@ -3799,21 +4022,7 @@
           <w:b w:val="0"/>
           <w:i w:val="0"/>
         </w:rPr>
-        <w:t xml:space="preserve">INSTITUTO FEDERAL DE EDUCAÇÃO, CIÊNCIA E TECNOLOGIA DE MATO GROSSO. </w:t>
-      </w:r>
-      <w:r>
-        <w:rPr>
-          <w:b/>
-          <w:i w:val="0"/>
-        </w:rPr>
-        <w:t xml:space="preserve">Normas básicas e padrões para a elaboração do Projeto de Conclusão de Curso (PCC)</w:t>
-      </w:r>
-      <w:r>
-        <w:rPr>
-          <w:b w:val="0"/>
-          <w:i w:val="0"/>
-        </w:rPr>
-        <w:t xml:space="preserve">. Cuiabá: Campus Octayde Jorge da Silva, Departamento de Área de Informática, 2022.</w:t>
+        <w:t xml:space="preserve">YUUKIFST. Finn: SaaS universal de financeiro por voz. 2026a. Repositório de código. Disponível em: https://github.com/YuukiFST/Finn. Acesso em: 14 set. 2026.</w:t>
       </w:r>
     </w:p>
     <w:p>
@@ -3821,387 +4030,11 @@
         <w:spacing w:after="240" w:line="240" w:lineRule="auto"/>
       </w:pPr>
       <w:r>
-        <w:t>JIMENEZ, Carlos E.; YANG, John; WETTIG, Alexander; YAO, Shunyu; PEI, Kexin; PRESS, Ofir; NA</w:t>
-      </w:r>
-      <w:r>
-        <w:t xml:space="preserve">RASIMHAN, Karthik. </w:t>
-      </w:r>
-      <w:r>
-        <w:rPr>
-          <w:b/>
-        </w:rPr>
-        <w:t>SWE-bench</w:t>
-      </w:r>
-      <w:r>
-        <w:t>: can language models resolve real-world GitHub issues? arXiv:2310.06770, 2023. Trabalho apresentado na International Conference on Learning Representations (ICLR), 2024. Disponível em: https://arxiv.org/abs/2310.06770. Acesso e</w:t>
-      </w:r>
-      <w:r>
-        <w:t>m: 28 ago. 2026.</w:t>
-      </w:r>
-    </w:p>
-    <w:p>
-      <w:pPr>
-        <w:spacing w:after="240" w:line="240" w:lineRule="auto"/>
-      </w:pPr>
-      <w:r>
-        <w:t xml:space="preserve">KAPOOR, Sayash; STROEBL, Benedikt; SIEGEL, Zachary S.; NADGIR, Nitya; NARAYANAN, Arvind. </w:t>
-      </w:r>
-      <w:r>
-        <w:rPr>
-          <w:b/>
-        </w:rPr>
-        <w:t>AI agents that matter</w:t>
-      </w:r>
-      <w:r>
-        <w:t xml:space="preserve">. arXiv:2407.01502, 2024. </w:t>
-      </w:r>
-      <w:r>
-        <w:rPr>
-          <w:i/>
-        </w:rPr>
-        <w:t>Preprint</w:t>
-      </w:r>
-      <w:r>
-        <w:t>, não revisado por pares. Disponível em: https://arxiv.org/abs/2407.01502. Acesso em: 28 ago. 2</w:t>
-      </w:r>
-      <w:r>
-        <w:t>026.</w:t>
-      </w:r>
-    </w:p>
-    <w:p>
-      <w:pPr>
-        <w:spacing w:after="240" w:line="240" w:lineRule="auto"/>
-      </w:pPr>
-      <w:r>
-        <w:t xml:space="preserve">KAPOOR, Sayash </w:t>
-      </w:r>
-      <w:r>
-        <w:rPr>
-          <w:i/>
-        </w:rPr>
-        <w:t>et al.</w:t>
-      </w:r>
-      <w:r>
-        <w:t xml:space="preserve"> </w:t>
-      </w:r>
-      <w:r>
-        <w:rPr>
-          <w:b/>
-        </w:rPr>
-        <w:t>Holistic Agent Leaderboard</w:t>
-      </w:r>
-      <w:r>
-        <w:t xml:space="preserve">: the missing infrastructure for AI agent evaluation. arXiv:2510.11977, 2025. </w:t>
-      </w:r>
-      <w:r>
-        <w:rPr>
-          <w:i/>
-        </w:rPr>
-        <w:t>Preprint</w:t>
-      </w:r>
-      <w:r>
-        <w:t>, não revisado por pares. Disponível em: https://arxiv.org/abs/2510.11977. Acesso em: 28 ago. 2026.</w:t>
-      </w:r>
-    </w:p>
-    <w:p>
-      <w:pPr>
-        <w:spacing w:after="240" w:line="240" w:lineRule="auto"/>
-      </w:pPr>
-      <w:r>
-        <w:t>LEE, Yoonho; NAIR</w:t>
-      </w:r>
-      <w:r>
-        <w:t xml:space="preserve">, Roshen; ZHANG, Qizheng; LEE, Kangwook; KHATTAB, Omar; FINN, Chelsea. </w:t>
-      </w:r>
-      <w:r>
-        <w:rPr>
-          <w:b/>
-        </w:rPr>
-        <w:t>Meta-Harness</w:t>
-      </w:r>
-      <w:r>
-        <w:t xml:space="preserve">: end-to-end optimization of model harnesses. arXiv:2603.28052, 2026. </w:t>
-      </w:r>
-      <w:r>
-        <w:rPr>
-          <w:i/>
-        </w:rPr>
-        <w:t>Preprint</w:t>
-      </w:r>
-      <w:r>
-        <w:t>, não revisado por pares. Disponível em: https://arxiv.org/abs/2603.28052. Acesso em: 9 set. 20</w:t>
-      </w:r>
-      <w:r>
-        <w:t>26.</w:t>
-      </w:r>
-    </w:p>
-    <w:p>
-      <w:pPr>
-        <w:spacing w:after="240" w:line="240" w:lineRule="auto"/>
-      </w:pPr>
-      <w:r>
-        <w:t xml:space="preserve">LIN, Jiahang; LIU, Shichun; PAN, Chengjun; LIN, Lizhi; DOU, Shihan; XI, Zhiheng; HUANG, Xuanjing; YAN, Hang; HAN, Zhenhua; GUI, Tao; JIANG, Yu-Gang. </w:t>
-      </w:r>
-      <w:r>
-        <w:rPr>
-          <w:b/>
-        </w:rPr>
-        <w:t>Agentic harness engineering</w:t>
-      </w:r>
-      <w:r>
-        <w:t>: observability-driven automatic evolution of coding-agent harnesses. arXiv:</w:t>
-      </w:r>
-      <w:r>
-        <w:t xml:space="preserve">2604.25850, 2026. </w:t>
-      </w:r>
-      <w:r>
-        <w:rPr>
-          <w:i/>
-        </w:rPr>
-        <w:t>Preprint</w:t>
-      </w:r>
-      <w:r>
-        <w:t>, não revisado por pares. Disponível em: https://arxiv.org/abs/2604.25850. Acesso em: 28 ago. 2026.</w:t>
-      </w:r>
-    </w:p>
-    <w:p>
-      <w:pPr>
-        <w:spacing w:after="240" w:line="240" w:lineRule="auto"/>
-      </w:pPr>
-      <w:r>
         <w:rPr>
           <w:b w:val="0"/>
           <w:i w:val="0"/>
         </w:rPr>
-        <w:t xml:space="preserve">MILLER, Evan. </w:t>
-      </w:r>
-      <w:r>
-        <w:rPr>
-          <w:b/>
-          <w:i w:val="0"/>
-        </w:rPr>
-        <w:t xml:space="preserve">Adding error bars to evals</w:t>
-      </w:r>
-      <w:r>
-        <w:rPr>
-          <w:b w:val="0"/>
-          <w:i w:val="0"/>
-        </w:rPr>
-        <w:t xml:space="preserve">: a statistical approach to language model evaluations. arXiv:2411.00640, 2024. </w:t>
-      </w:r>
-      <w:r>
-        <w:rPr>
-          <w:b w:val="0"/>
-          <w:i/>
-        </w:rPr>
-        <w:t xml:space="preserve">Preprint</w:t>
-      </w:r>
-      <w:r>
-        <w:rPr>
-          <w:b w:val="0"/>
-          <w:i w:val="0"/>
-        </w:rPr>
-        <w:t xml:space="preserve">, não revisado por pares. Disponível em: https://arxiv.org/abs/2411.00640. Acesso em: 28 ago. 2026.</w:t>
-      </w:r>
-    </w:p>
-    <w:p>
-      <w:pPr>
-        <w:spacing w:after="240" w:line="240" w:lineRule="auto"/>
-      </w:pPr>
-      <w:r>
-        <w:t xml:space="preserve">NING, Xuying </w:t>
-      </w:r>
-      <w:r>
-        <w:rPr>
-          <w:i/>
-        </w:rPr>
-        <w:t>et al.</w:t>
-      </w:r>
-      <w:r>
-        <w:t xml:space="preserve"> </w:t>
-      </w:r>
-      <w:r>
-        <w:rPr>
-          <w:b/>
-        </w:rPr>
-        <w:t>Code as agent harness</w:t>
-      </w:r>
-      <w:r>
-        <w:t>. arXiv:2605.18747, 2</w:t>
-      </w:r>
-      <w:r>
-        <w:t xml:space="preserve">026. </w:t>
-      </w:r>
-      <w:r>
-        <w:rPr>
-          <w:i/>
-        </w:rPr>
-        <w:t>Preprint</w:t>
-      </w:r>
-      <w:r>
-        <w:t>, não revisado por pares. Disponível em: https://arxiv.org/abs/2605.18747. Acesso em: 28 ago. 2026.</w:t>
-      </w:r>
-    </w:p>
-    <w:p>
-      <w:pPr>
-        <w:spacing w:after="240" w:line="240" w:lineRule="auto"/>
-      </w:pPr>
-      <w:r>
-        <w:t xml:space="preserve">OPENCODE. </w:t>
-      </w:r>
-      <w:r>
-        <w:rPr>
-          <w:b/>
-        </w:rPr>
-        <w:t>Zen</w:t>
-      </w:r>
-      <w:r>
-        <w:t>. 2026. Documentação do produto. Disponível em: https://opencode.ai/docs/zen/. Acesso em: 28 ago. 2026.</w:t>
-      </w:r>
-    </w:p>
-    <w:p>
-      <w:pPr>
-        <w:spacing w:after="240" w:line="240" w:lineRule="auto"/>
-      </w:pPr>
-      <w:r>
-        <w:rPr>
-          <w:b w:val="0"/>
-          <w:i w:val="0"/>
-        </w:rPr>
-        <w:t xml:space="preserve">PRODANOV, Cleber Cristiano; FREITAS, Ernani Cesar de. </w:t>
-      </w:r>
-      <w:r>
-        <w:rPr>
-          <w:b/>
-          <w:i w:val="0"/>
-        </w:rPr>
-        <w:t xml:space="preserve">Metodologia do trabalho científico</w:t>
-      </w:r>
-      <w:r>
-        <w:rPr>
-          <w:b w:val="0"/>
-          <w:i w:val="0"/>
-        </w:rPr>
-        <w:t xml:space="preserve">: métodos e técnicas da pesquisa e do trabalho acadêmico. 2. ed. Novo Hamburgo: Feevale, 2013. Disponível em: https://www.feevale.br/Comum/midias/0163c988-1f5d-496f-b118-a6e009a7a2f9/E-book%20Metodologia%20do%20Trabalho%20Cientifico.pdf. Acesso em: 28 ago. 2026.</w:t>
-      </w:r>
-    </w:p>
-    <w:p>
-      <w:pPr>
-        <w:spacing w:after="240" w:line="240" w:lineRule="auto"/>
-      </w:pPr>
-      <w:r>
-        <w:t xml:space="preserve">RUNTA. </w:t>
-      </w:r>
-      <w:r>
-        <w:rPr>
-          <w:b/>
-        </w:rPr>
-        <w:t>Introducing the FrontierHarness eval</w:t>
-      </w:r>
-      <w:r>
-        <w:t>. 2026. Publicação de blogue institucional. Disponível em: https://runta.com/blog/introducing-frontierharness-eval/. Acesso em: 9 set. 2026.</w:t>
-      </w:r>
-    </w:p>
-    <w:p>
-      <w:pPr>
-        <w:spacing w:after="240" w:line="240" w:lineRule="auto"/>
-      </w:pPr>
-      <w:r>
-        <w:lastRenderedPageBreak/>
-        <w:t>WAN</w:t>
-      </w:r>
-      <w:r>
-        <w:t xml:space="preserve">G, Ruhan </w:t>
-      </w:r>
-      <w:r>
-        <w:rPr>
-          <w:i/>
-        </w:rPr>
-        <w:t>et al.</w:t>
-      </w:r>
-      <w:r>
-        <w:t xml:space="preserve"> </w:t>
-      </w:r>
-      <w:r>
-        <w:rPr>
-          <w:b/>
-        </w:rPr>
-        <w:t>Harness Handbook</w:t>
-      </w:r>
-      <w:r>
-        <w:t xml:space="preserve">: making evolving agent harnesses readable, navigable, and editable. arXiv:2607.13285, 2026. </w:t>
-      </w:r>
-      <w:r>
-        <w:rPr>
-          <w:i/>
-        </w:rPr>
-        <w:t>Preprint</w:t>
-      </w:r>
-      <w:r>
-        <w:t>, não revisado por pares. Disponível em: https://arxiv.org/abs/2607.13285. Acesso em: 9 set. 2026.</w:t>
-      </w:r>
-    </w:p>
-    <w:p>
-      <w:pPr>
-        <w:spacing w:after="240" w:line="240" w:lineRule="auto"/>
-      </w:pPr>
-      <w:r>
-        <w:t>YANG, John; JIMENEZ, Car</w:t>
-      </w:r>
-      <w:r>
-        <w:t xml:space="preserve">los E.; WETTIG, Alexander; LIERET, Kilian; YAO, Shunyu; NARASIMHAN, Karthik; PRESS, Ofir. </w:t>
-      </w:r>
-      <w:r>
-        <w:rPr>
-          <w:b/>
-        </w:rPr>
-        <w:t>SWE-agent</w:t>
-      </w:r>
-      <w:r>
-        <w:t>: agent-computer interfaces enable automated software engineering. arXiv:2405.15793, 2024. Trabalho apresentado na Conference on Neural Information Processin</w:t>
-      </w:r>
-      <w:r>
-        <w:t>g Systems (NeurIPS), 2024. Disponível em: https://arxiv.org/abs/2405.15793. Acesso em: 28 ago. 2026.</w:t>
-      </w:r>
-    </w:p>
-    <w:p>
-      <w:pPr>
-        <w:spacing w:after="240" w:line="240" w:lineRule="auto"/>
-      </w:pPr>
-      <w:r>
-        <w:t xml:space="preserve">YAO, Shunyu; ZHAO, Jeffrey; YU, Dian; DU, Nan; SHAFRAN, Izhak; NARASIMHAN, Karthik; CAO, Yuan. </w:t>
-      </w:r>
-      <w:r>
-        <w:rPr>
-          <w:b/>
-        </w:rPr>
-        <w:t>ReAct</w:t>
-      </w:r>
-      <w:r>
-        <w:t xml:space="preserve">: synergizing reasoning and acting in language models. </w:t>
-      </w:r>
-      <w:r>
-        <w:t>arXiv:2210.03629, 2022. Trabalho apresentado na International Conference on Learning Representations (ICLR), 2023. Disponível em: https://arxiv.org/abs/2210.03629. Acesso em: 28 ago. 2026.</w:t>
-      </w:r>
-    </w:p>
-    <w:p>
-      <w:pPr>
-        <w:spacing w:after="240" w:line="240" w:lineRule="auto"/>
-      </w:pPr>
-      <w:r>
-        <w:t xml:space="preserve">YUUKIFST. </w:t>
-      </w:r>
-      <w:r>
-        <w:rPr>
-          <w:b/>
-        </w:rPr>
-        <w:t>harness-bench</w:t>
-      </w:r>
-      <w:r>
-        <w:t xml:space="preserve">: runner, dados brutos e scripts de análise </w:t>
-      </w:r>
-      <w:r>
-        <w:t>deste projeto. 2026. Repositório de código. Disponível em: https://github.com/YuukiFST/harness-bench. Acesso em: 28 ago. 2026.</w:t>
+        <w:t xml:space="preserve">YUUKIFST. harness-bench: executor, prompts, testes de aceitação, dados brutos e scripts de análise deste projeto. 2026b. Repositório de código. Disponível em: https://github.com/YuukiFST/harness-bench. Acesso em: 28 ago. 2026.</w:t>
       </w:r>
     </w:p>
     <w:p>

</xml_diff>

<commit_message>
fix(pcc): align docx, deck and script after the coherence audit
Slide-by-slide audit of the project document, the Vite deck and the
speaking script against CONTEXT.md and the experimental protocol.
Title page states a research project for the Metodologia Cientifica
course; the structure paragraph names the product and specification.
The references slide carries the same 20 entries as the project and
the gateway is cited; Finn's 21 issues are #2-#22 under the map #1;
the declared purpose of the coding agent follows paragraph [58]; the
quota answer follows the reduction ladder (never n < 3); Wilcoxon
pairs are k = 9. The single-file legacy deck is removed. Decisions of
the author recorded in docs/research/decisoes-auditoria-2026-09-14.html.
</commit_message>
<xml_diff>
--- a/dist/projeto-pcc.docx
+++ b/dist/projeto-pcc.docx
@@ -139,10 +139,6 @@
         <w:t xml:space="preserve">O HARNESS COMO DECISÃO DO DESENVOLVEDOR: TOKENS E TAXA DE SUCESSO DO OPENCODE E DO PI NA CONSTRUÇÃO DE UM MESMO SAAS SOB UM MESMO MODELO</w:t>
       </w:r>
     </w:p>
-    <w:p/>
-    <w:p/>
-    <w:p/>
-    <w:p/>
     <w:p>
       <w:pPr>
         <w:spacing w:after="0" w:line="240" w:lineRule="auto"/>
@@ -150,10 +146,11 @@
         <w:jc w:val="both"/>
       </w:pPr>
       <w:r>
-        <w:t>Projeto de Conclusão de Curso apresentado ao Departamento de Área de Informática do Instituto Federal de Educação, Ciênc</w:t>
-      </w:r>
-      <w:r>
-        <w:t>ia e Tecnologia de Mato Grosso, Campus Octayde Jorge da Silva, como requisito parcial para a conclusão do curso de Sistemas para Internet.</w:t>
+        <w:rPr>
+          <w:b w:val="0"/>
+          <w:i w:val="0"/>
+        </w:rPr>
+        <w:t xml:space="preserve">Projeto de pesquisa apresentado ao Departamento de Área de Informática do Instituto Federal de Educação, Ciência e Tecnologia de Mato Grosso, Campus Octayde Jorge da Silva, na disciplina de Metodologia Científica do curso de Sistemas para Internet.</w:t>
       </w:r>
     </w:p>
     <w:p>
@@ -924,7 +921,7 @@
           <w:b w:val="0"/>
           <w:i w:val="0"/>
         </w:rPr>
-        <w:t xml:space="preserve">Este trabalho está organizado em seis seções. Esta introdução apresenta a justificativa, o tema, o problema, os objetivos, a metodologia e as hipóteses. A seção 2 posiciona o trabalho na literatura e delimita as pendências que ele se propõe a resolver. A seção 3 descreve o material e o método: classificação da pesquisa, camadas de medição, braços, suíte de tarefas, limites, tratamento estatístico e limitações. A seção 4 apresenta o orçamento, a seção 5 o cronograma, e a seção 6 reúne as referências.</w:t>
+        <w:t xml:space="preserve">Este trabalho está organizado em seis seções. Esta introdução apresenta a justificativa, o tema, o problema, os objetivos, a metodologia e as hipóteses. A seção 2 posiciona o trabalho na literatura e delimita as pendências que ele se propõe a resolver. A seção 3 descreve o material e o método: classificação da pesquisa, camadas de medição, braços, produto e especificação, limites, tratamento estatístico e limitações. A seção 4 apresenta o orçamento, a seção 5 o cronograma, e a seção 6 reúne as referências.</w:t>
       </w:r>
     </w:p>
     <w:p>

</xml_diff>